<commit_message>
Worked on the text revisions
</commit_message>
<xml_diff>
--- a/Manuscripts/Muscle Ketolysis Manuscript/Manuscript.docx
+++ b/Manuscripts/Muscle Ketolysis Manuscript/Manuscript.docx
@@ -895,73 +895,69 @@
         <w:t xml:space="preserve"> in mice</w:t>
       </w:r>
       <w:r>
-        <w:t xml:space="preserve">. We </w:t>
+        <w:t xml:space="preserve">. </w:t>
+      </w:r>
+      <w:r>
+        <w:rPr>
+          <w:highlight w:val="yellow"/>
+        </w:rPr>
+        <w:t>We used muscle-specific deletion of TSC1 a negative regulator of mTORC1 to activate mTORC1 in muscle tissues.</w:t>
+      </w:r>
+      <w:r>
+        <w:t xml:space="preserve">  </w:t>
+      </w:r>
+      <w:r>
+        <w:t xml:space="preserve">We </w:t>
+      </w:r>
+      <w:r>
+        <w:t xml:space="preserve">also </w:t>
       </w:r>
       <w:r>
         <w:t>tested</w:t>
       </w:r>
       <w:r>
-        <w:t xml:space="preserve"> this in</w:t>
-      </w:r>
-      <w:r>
         <w:t xml:space="preserve"> </w:t>
       </w:r>
       <w:r>
-        <w:t xml:space="preserve">muscle </w:t>
-      </w:r>
-      <w:r>
-        <w:rPr>
-          <w:i/>
-          <w:iCs/>
-        </w:rPr>
-        <w:t>Tsc1</w:t>
+        <w:t xml:space="preserve">evaluated </w:t>
+      </w:r>
+      <w:r>
+        <w:t>inbred</w:t>
+      </w:r>
+      <w:r>
+        <w:t xml:space="preserve"> A/J </w:t>
+      </w:r>
+      <w:r>
+        <w:t xml:space="preserve">mice, </w:t>
+      </w:r>
+      <w:r>
+        <w:t xml:space="preserve">and Diversity Outbred (DO) mice fed a ketogenic diet, comparing their baseline </w:t>
+      </w:r>
+      <w:r>
+        <w:t>ketone tolerance tests (</w:t>
+      </w:r>
+      <w:r>
+        <w:t>KTT</w:t>
+      </w:r>
+      <w:r>
+        <w:t>)</w:t>
+      </w:r>
+      <w:r>
+        <w:t xml:space="preserve"> to their post-diet </w:t>
+      </w:r>
+      <w:r>
+        <w:t>ketone tolerance</w:t>
+      </w:r>
+      <w:r>
+        <w:t xml:space="preserve">. We also </w:t>
+      </w:r>
+      <w:r>
+        <w:t>predicted</w:t>
       </w:r>
       <w:r>
         <w:t xml:space="preserve"> </w:t>
       </w:r>
       <w:r>
-        <w:t>KO</w:t>
-      </w:r>
-      <w:r>
-        <w:t xml:space="preserve"> mice,</w:t>
-      </w:r>
-      <w:r>
-        <w:t xml:space="preserve"> inbred</w:t>
-      </w:r>
-      <w:r>
-        <w:t xml:space="preserve"> A/J </w:t>
-      </w:r>
-      <w:r>
-        <w:t xml:space="preserve">mice, </w:t>
-      </w:r>
-      <w:r>
-        <w:t xml:space="preserve">and Diversity Outbred (DO) mice fed a ketogenic diet, comparing their baseline </w:t>
-      </w:r>
-      <w:r>
-        <w:t>ketone tolerance tests (</w:t>
-      </w:r>
-      <w:r>
-        <w:t>KTT</w:t>
-      </w:r>
-      <w:r>
-        <w:t>)</w:t>
-      </w:r>
-      <w:r>
-        <w:t xml:space="preserve"> to their post-diet </w:t>
-      </w:r>
-      <w:r>
-        <w:t>ketone tolerance</w:t>
-      </w:r>
-      <w:r>
-        <w:t xml:space="preserve">. We also </w:t>
-      </w:r>
-      <w:r>
-        <w:t>predicted</w:t>
-      </w:r>
-      <w:r>
-        <w:t xml:space="preserve"> </w:t>
-      </w:r>
-      <w:r>
         <w:t>that</w:t>
       </w:r>
       <w:r>
@@ -996,7 +992,25 @@
     </w:p>
     <w:p>
       <w:r>
-        <w:t xml:space="preserve">Mice were maintained in ventilated cages at 70F at 40-60% humidity with a 12-hour light/dark cycle (ZT0=6:00AM).  Mice were provided </w:t>
+        <w:rPr>
+          <w:highlight w:val="yellow"/>
+        </w:rPr>
+        <w:t>Mice were maintained in ventilated cages at 70F at 40-60% humidity with a 12-hour light/dark cycle (</w:t>
+      </w:r>
+      <w:r>
+        <w:rPr>
+          <w:highlight w:val="yellow"/>
+        </w:rPr>
+        <w:t xml:space="preserve">Zeitgeber Time 0 or </w:t>
+      </w:r>
+      <w:r>
+        <w:rPr>
+          <w:highlight w:val="yellow"/>
+        </w:rPr>
+        <w:t>ZT0=6:00AM).</w:t>
+      </w:r>
+      <w:r>
+        <w:t xml:space="preserve">  Mice were provided </w:t>
       </w:r>
       <w:r>
         <w:t xml:space="preserve">a normal chow </w:t>
@@ -1097,44 +1111,90 @@
         <w:t xml:space="preserve">005680). </w:t>
       </w:r>
       <w:r>
+        <w:rPr>
+          <w:highlight w:val="yellow"/>
+        </w:rPr>
         <w:t xml:space="preserve">Mice heterozygous for the </w:t>
       </w:r>
       <w:proofErr w:type="spellStart"/>
       <w:r>
+        <w:rPr>
+          <w:highlight w:val="yellow"/>
+        </w:rPr>
         <w:t>floxed</w:t>
       </w:r>
       <w:proofErr w:type="spellEnd"/>
       <w:r>
+        <w:rPr>
+          <w:highlight w:val="yellow"/>
+        </w:rPr>
         <w:t xml:space="preserve"> allele </w:t>
       </w:r>
       <w:r>
+        <w:rPr>
+          <w:highlight w:val="yellow"/>
+        </w:rPr>
         <w:t xml:space="preserve">with or without </w:t>
       </w:r>
       <w:r>
+        <w:rPr>
+          <w:highlight w:val="yellow"/>
+        </w:rPr>
         <w:t xml:space="preserve">the </w:t>
       </w:r>
       <w:proofErr w:type="spellStart"/>
       <w:r>
+        <w:rPr>
+          <w:highlight w:val="yellow"/>
+        </w:rPr>
         <w:t>cre</w:t>
       </w:r>
       <w:proofErr w:type="spellEnd"/>
       <w:r>
+        <w:rPr>
+          <w:highlight w:val="yellow"/>
+        </w:rPr>
         <w:t xml:space="preserve"> allele were </w:t>
       </w:r>
       <w:r>
-        <w:t xml:space="preserve">crossed to generate </w:t>
-      </w:r>
-      <w:r>
+        <w:rPr>
+          <w:highlight w:val="yellow"/>
+        </w:rPr>
+        <w:t>crossed to generate</w:t>
+      </w:r>
+      <w:r>
+        <w:rPr>
+          <w:highlight w:val="yellow"/>
+        </w:rPr>
+        <w:t xml:space="preserve"> male and female</w:t>
+      </w:r>
+      <w:r>
+        <w:rPr>
+          <w:highlight w:val="yellow"/>
+        </w:rPr>
+        <w:t xml:space="preserve"> </w:t>
+      </w:r>
+      <w:r>
+        <w:rPr>
+          <w:highlight w:val="yellow"/>
+        </w:rPr>
         <w:t xml:space="preserve">littermates of </w:t>
       </w:r>
       <w:r>
+        <w:rPr>
+          <w:highlight w:val="yellow"/>
+        </w:rPr>
         <w:t>KO</w:t>
       </w:r>
       <w:r>
+        <w:rPr>
+          <w:highlight w:val="yellow"/>
+        </w:rPr>
         <w:t xml:space="preserve"> mice (Tsc1</w:t>
       </w:r>
       <w:r>
         <w:rPr>
+          <w:highlight w:val="yellow"/>
           <w:vertAlign w:val="superscript"/>
         </w:rPr>
         <w:t>fl/</w:t>
@@ -1142,20 +1202,28 @@
       <w:proofErr w:type="spellStart"/>
       <w:r>
         <w:rPr>
+          <w:highlight w:val="yellow"/>
           <w:vertAlign w:val="superscript"/>
         </w:rPr>
         <w:t>fl</w:t>
       </w:r>
       <w:proofErr w:type="spellEnd"/>
       <w:r>
+        <w:rPr>
+          <w:highlight w:val="yellow"/>
+        </w:rPr>
         <w:t xml:space="preserve">, </w:t>
       </w:r>
       <w:proofErr w:type="spellStart"/>
       <w:r>
+        <w:rPr>
+          <w:highlight w:val="yellow"/>
+        </w:rPr>
         <w:t>Ckmm-Cre</w:t>
       </w:r>
       <w:r>
         <w:rPr>
+          <w:highlight w:val="yellow"/>
           <w:vertAlign w:val="superscript"/>
         </w:rPr>
         <w:t>Tg</w:t>
@@ -1163,26 +1231,40 @@
       <w:proofErr w:type="spellEnd"/>
       <w:r>
         <w:rPr>
+          <w:highlight w:val="yellow"/>
           <w:vertAlign w:val="superscript"/>
         </w:rPr>
         <w:t>/+</w:t>
       </w:r>
       <w:r>
+        <w:rPr>
+          <w:highlight w:val="yellow"/>
+        </w:rPr>
         <w:t>)</w:t>
       </w:r>
       <w:r>
+        <w:rPr>
+          <w:highlight w:val="yellow"/>
+        </w:rPr>
         <w:t xml:space="preserve"> and</w:t>
       </w:r>
       <w:r>
+        <w:rPr>
+          <w:highlight w:val="yellow"/>
+        </w:rPr>
         <w:t xml:space="preserve"> wild type mice (Tsc1</w:t>
       </w:r>
       <w:r>
         <w:rPr>
+          <w:highlight w:val="yellow"/>
           <w:vertAlign w:val="superscript"/>
         </w:rPr>
         <w:t>+/+</w:t>
       </w:r>
       <w:r>
+        <w:rPr>
+          <w:highlight w:val="yellow"/>
+        </w:rPr>
         <w:t xml:space="preserve">, </w:t>
       </w:r>
       <w:proofErr w:type="spellStart"/>
@@ -1190,20 +1272,28 @@
         <w:rPr>
           <w:i/>
           <w:iCs/>
+          <w:highlight w:val="yellow"/>
         </w:rPr>
         <w:t>Ckmm</w:t>
       </w:r>
       <w:proofErr w:type="spellEnd"/>
       <w:r>
+        <w:rPr>
+          <w:highlight w:val="yellow"/>
+        </w:rPr>
         <w:t>-Cre</w:t>
       </w:r>
       <w:r>
         <w:rPr>
+          <w:highlight w:val="yellow"/>
           <w:vertAlign w:val="superscript"/>
         </w:rPr>
         <w:t>+/+</w:t>
       </w:r>
       <w:r>
+        <w:rPr>
+          <w:highlight w:val="yellow"/>
+        </w:rPr>
         <w:t>)</w:t>
       </w:r>
       <w:r>
@@ -1234,30 +1324,66 @@
         <w:t xml:space="preserve">.  </w:t>
       </w:r>
       <w:r>
-        <w:t xml:space="preserve">Wild-type </w:t>
-      </w:r>
-      <w:r>
+        <w:rPr>
+          <w:highlight w:val="yellow"/>
+        </w:rPr>
+        <w:t xml:space="preserve">Male and female </w:t>
+      </w:r>
+      <w:r>
+        <w:rPr>
+          <w:highlight w:val="yellow"/>
+        </w:rPr>
         <w:t>A/J mice (</w:t>
       </w:r>
       <w:proofErr w:type="gramStart"/>
       <w:r>
+        <w:rPr>
+          <w:highlight w:val="yellow"/>
+        </w:rPr>
         <w:t>RRID:IMSR</w:t>
       </w:r>
       <w:proofErr w:type="gramEnd"/>
       <w:r>
+        <w:rPr>
+          <w:highlight w:val="yellow"/>
+        </w:rPr>
         <w:t>_JAX:000646)</w:t>
       </w:r>
       <w:r>
         <w:t xml:space="preserve"> were purchased at 8 weeks of age from The Jackson Laboratories</w:t>
       </w:r>
       <w:r>
-        <w:t xml:space="preserve"> and at 10 weeks of age were fed control or ketogenic diets for four weeks</w:t>
+        <w:t xml:space="preserve"> and at 10 weeks of age </w:t>
+      </w:r>
+      <w:r>
+        <w:rPr>
+          <w:highlight w:val="yellow"/>
+        </w:rPr>
+        <w:t xml:space="preserve">were </w:t>
+      </w:r>
+      <w:r>
+        <w:rPr>
+          <w:highlight w:val="yellow"/>
+        </w:rPr>
+        <w:t xml:space="preserve">randomized at the cage level into either </w:t>
+      </w:r>
+      <w:r>
+        <w:rPr>
+          <w:highlight w:val="yellow"/>
+        </w:rPr>
+        <w:t>control or ketogenic diets for four weeks</w:t>
       </w:r>
       <w:r>
         <w:t>.</w:t>
       </w:r>
       <w:r>
-        <w:t xml:space="preserve">  Diversity outbred mice (43</w:t>
+        <w:t xml:space="preserve">  </w:t>
+      </w:r>
+      <w:r>
+        <w:t>Male d</w:t>
+      </w:r>
+      <w:r>
+        <w:t>iversity outbred mice (43</w:t>
       </w:r>
       <w:r>
         <w:rPr>
@@ -1281,6 +1407,18 @@
         <w:t xml:space="preserve"> for four weeks</w:t>
       </w:r>
       <w:r>
+        <w:t xml:space="preserve"> </w:t>
+      </w:r>
+      <w:r>
+        <w:rPr>
+          <w:highlight w:val="yellow"/>
+        </w:rPr>
+        <w:t>for a pilot study of the effects of genetic variation on response to ketogenic diets</w:t>
+      </w:r>
+      <w:r>
+        <w:rPr>
+          <w:highlight w:val="yellow"/>
+        </w:rPr>
         <w:t>.</w:t>
       </w:r>
       <w:r>
@@ -1305,7 +1443,45 @@
         <w:t xml:space="preserve"> not pellet format and were provided in custom jars with holes to provide access.</w:t>
       </w:r>
       <w:r>
-        <w:t xml:space="preserve">  All procedures were approved by the University of Michigan Institutional Animal Use and Care Committee.</w:t>
+        <w:t xml:space="preserve">  </w:t>
+      </w:r>
+      <w:r>
+        <w:rPr>
+          <w:highlight w:val="yellow"/>
+        </w:rPr>
+        <w:t xml:space="preserve">Animals were euthanized </w:t>
+      </w:r>
+      <w:r>
+        <w:rPr>
+          <w:highlight w:val="yellow"/>
+        </w:rPr>
+        <w:t xml:space="preserve">at approximately ZT8 </w:t>
+      </w:r>
+      <w:r>
+        <w:rPr>
+          <w:highlight w:val="yellow"/>
+        </w:rPr>
+        <w:t xml:space="preserve">via cervical dislocation after isoflurane </w:t>
+      </w:r>
+      <w:proofErr w:type="spellStart"/>
+      <w:r>
+        <w:rPr>
+          <w:highlight w:val="yellow"/>
+        </w:rPr>
+        <w:t>anaesthesia</w:t>
+      </w:r>
+      <w:proofErr w:type="spellEnd"/>
+      <w:r>
+        <w:rPr>
+          <w:highlight w:val="yellow"/>
+        </w:rPr>
+        <w:t>.</w:t>
+      </w:r>
+      <w:r>
+        <w:t xml:space="preserve">  </w:t>
+      </w:r>
+      <w:r>
+        <w:t>All procedures were approved by the University of Michigan Institutional Animal Use and Care Committee.</w:t>
       </w:r>
     </w:p>
     <w:p>
@@ -1339,7 +1515,30 @@
         <w:t>Tsc1</w:t>
       </w:r>
       <w:r>
-        <w:t xml:space="preserve"> KO and diversity outbred studies) of beta-hydroxybutyrate dissolved in PBS at approximately ZT8.  Prior to the injection, and then every 15 afterwards, a tail blood draw was collected and analyzed using a Precision Xtra Ketone Body Assay.  To summarize these data, we calculated the area under the curve, and baseline-subtracted area under the curve.</w:t>
+        <w:t xml:space="preserve"> KO and diversity outbred studies) of beta-hydroxybutyrate dissolved in PBS at approximately ZT8.  Prior to the injection, and then every 15 afterwards, a tail blood draw was collected and analyzed using a Precision </w:t>
+      </w:r>
+      <w:proofErr w:type="spellStart"/>
+      <w:r>
+        <w:t>Xtra</w:t>
+      </w:r>
+      <w:proofErr w:type="spellEnd"/>
+      <w:r>
+        <w:t xml:space="preserve"> Ketone Body Assay</w:t>
+      </w:r>
+      <w:r>
+        <w:t xml:space="preserve"> </w:t>
+      </w:r>
+      <w:r>
+        <w:rPr>
+          <w:highlight w:val="yellow"/>
+        </w:rPr>
+        <w:t>(Abbot</w:t>
+      </w:r>
+      <w:r>
+        <w:t>)</w:t>
+      </w:r>
+      <w:r>
+        <w:t>.  To summarize these data, we calculated the area under the curve, and baseline-subtracted area under the curve.</w:t>
       </w:r>
     </w:p>
     <w:p>
@@ -1390,101 +1589,1802 @@
         <w:t>12183-018A</w:t>
       </w:r>
       <w:r>
-        <w:t xml:space="preserve">) and synthesizing cDNA using a </w:t>
+        <w:t>) and synthesizing cDNA using a high capacity first strand cDNA synthesis kit (</w:t>
+      </w:r>
+      <w:proofErr w:type="spellStart"/>
+      <w:r>
+        <w:t>Thermo</w:t>
+      </w:r>
+      <w:proofErr w:type="spellEnd"/>
+      <w:r>
+        <w:t xml:space="preserve"> Scientific cat # </w:t>
+      </w:r>
+      <w:r>
+        <w:t>4368813</w:t>
+      </w:r>
+      <w:r>
+        <w:t xml:space="preserve">).  cDNA was amplified using SYBR Green (Thermo-Fisher </w:t>
+      </w:r>
+      <w:r>
+        <w:t>4367659</w:t>
+      </w:r>
+      <w:r>
+        <w:t xml:space="preserve">) and the primers noted in Table 1 using a </w:t>
+      </w:r>
+      <w:proofErr w:type="spellStart"/>
+      <w:r>
+        <w:t>QuantStudio</w:t>
+      </w:r>
+      <w:proofErr w:type="spellEnd"/>
+      <w:r>
+        <w:t xml:space="preserve"> 5.  Relative expression was determined us</w:t>
+      </w:r>
+      <w:r>
+        <w:t>ing</w:t>
+      </w:r>
+      <w:r>
+        <w:t xml:space="preserve"> the </w:t>
+      </w:r>
+      <w:r>
+        <w:rPr>
+          <w:rFonts w:ascii="Symbol" w:hAnsi="Symbol"/>
+        </w:rPr>
+        <w:t></w:t>
+      </w:r>
+      <w:r>
+        <w:rPr>
+          <w:rFonts w:ascii="Symbol" w:hAnsi="Symbol"/>
+        </w:rPr>
+        <w:t></w:t>
+      </w:r>
+      <w:r>
+        <w:t xml:space="preserve">Ct method.  For </w:t>
+      </w:r>
+      <w:proofErr w:type="spellStart"/>
+      <w:r>
+        <w:t>RNAseq</w:t>
+      </w:r>
+      <w:proofErr w:type="spellEnd"/>
+      <w:r>
+        <w:t>, data was re-</w:t>
+      </w:r>
+      <w:r>
+        <w:t xml:space="preserve">analyzed </w:t>
+      </w:r>
+      <w:r>
+        <w:t>reanalyzed</w:t>
+      </w:r>
+      <w:r>
+        <w:t xml:space="preserve"> from </w:t>
+      </w:r>
+      <w:r>
+        <w:t>GSE84312</w:t>
+      </w:r>
+      <w:r>
+        <w:t xml:space="preserve"> </w:t>
+      </w:r>
+      <w:r>
+        <w:fldChar w:fldCharType="begin"/>
+      </w:r>
+      <w:r>
+        <w:instrText xml:space="preserve"> ADDIN ZOTERO_ITEM CSL_CITATION {"citationID":"d7lwcXVd","properties":{"formattedCitation":"[19]","plainCitation":"[19]","noteIndex":0},"citationItems":[{"id":8736,"uris":["http://zotero.org/users/7317906/items/S4YYE9R2"],"itemData":{"id":8736,"type":"article-journal","container-title":"bioRxiv","DOI":"10.1101/720540","note":"Citation Key: Stephenson2019","title":"Skeletal Muscle mTORC1 Activation Increases Energy Expenditure and Reduces Longevity in Mice","URL":"http://dx.doi.org/10.1101/720540","author":[{"family":"Stephenson","given":"Erin J."},{"family":"Redd","given":"JeAnna R."},{"family":"Snyder","given":"Detrick S."},{"family":"Tran","given":"Quynh T."},{"family":"Lu","given":"Binbin"},{"family":"Peloquin","given":"Matthew J."},{"family":"Mulcahy","given":"Molly C."},{"family":"Harvey","given":"Innocence"},{"family":"Fisher","given":"Kaleigh"},{"family":"Han","given":"Joan C."},{"family":"Qi","given":"Nathan"},{"family":"Saltiel","given":"Alan R."},{"family":"Bridges","given":"Dave"}],"issued":{"date-parts":[["2019"]]},"citation-key":"Stephenson2019"}}],"schema":"https://github.com/citation-style-language/schema/raw/master/csl-citation.json"} </w:instrText>
+      </w:r>
+      <w:r>
+        <w:fldChar w:fldCharType="separate"/>
+      </w:r>
+      <w:r>
+        <w:rPr>
+          <w:noProof/>
+        </w:rPr>
+        <w:t>[19]</w:t>
+      </w:r>
+      <w:r>
+        <w:fldChar w:fldCharType="end"/>
+      </w:r>
+      <w:r>
+        <w:t>.</w:t>
+      </w:r>
+    </w:p>
+    <w:p/>
+    <w:p>
+      <w:pPr>
+        <w:pStyle w:val="Heading2"/>
+      </w:pPr>
+      <w:r>
+        <w:t>Cholesterol Analyses</w:t>
+      </w:r>
+    </w:p>
+    <w:p>
+      <w:r>
+        <w:rPr>
+          <w:highlight w:val="yellow"/>
+        </w:rPr>
+        <w:t>Total c</w:t>
+      </w:r>
+      <w:r>
+        <w:rPr>
+          <w:highlight w:val="yellow"/>
+        </w:rPr>
+        <w:t xml:space="preserve">holesterol concentration was determined </w:t>
+      </w:r>
+      <w:proofErr w:type="spellStart"/>
+      <w:r>
+        <w:rPr>
+          <w:highlight w:val="yellow"/>
+        </w:rPr>
+        <w:t>colorimetrically</w:t>
+      </w:r>
+      <w:proofErr w:type="spellEnd"/>
+      <w:r>
+        <w:rPr>
+          <w:highlight w:val="yellow"/>
+        </w:rPr>
+        <w:t xml:space="preserve"> from serum blood samples</w:t>
+      </w:r>
+      <w:r>
+        <w:rPr>
+          <w:highlight w:val="yellow"/>
+        </w:rPr>
+        <w:t xml:space="preserve"> in the fed state at approximately ZT8</w:t>
+      </w:r>
+      <w:r>
+        <w:rPr>
+          <w:highlight w:val="yellow"/>
+        </w:rPr>
+        <w:t>,</w:t>
+      </w:r>
+      <w:r>
+        <w:t xml:space="preserve"> using the Infinity Cholesterol Reagent kit (</w:t>
+      </w:r>
+      <w:proofErr w:type="spellStart"/>
+      <w:r>
+        <w:t>Thermo</w:t>
+      </w:r>
+      <w:proofErr w:type="spellEnd"/>
+      <w:r>
+        <w:t xml:space="preserve"> </w:t>
+      </w:r>
+      <w:r>
+        <w:t>Scientific c</w:t>
+      </w:r>
+      <w:r>
+        <w:t>at</w:t>
+      </w:r>
+      <w:r>
+        <w:t xml:space="preserve"> </w:t>
+      </w:r>
+      <w:r>
+        <w:t xml:space="preserve"># TR13421). Following the manufacturer's instructions, 100 </w:t>
+      </w:r>
+      <w:proofErr w:type="spellStart"/>
+      <w:r>
+        <w:t>uL</w:t>
+      </w:r>
+      <w:proofErr w:type="spellEnd"/>
+      <w:r>
+        <w:t xml:space="preserve"> of cholesterol reagent and 2uL serum were added to a clear 96-well </w:t>
+      </w:r>
+      <w:r>
+        <w:t>plate and</w:t>
+      </w:r>
+      <w:r>
+        <w:t xml:space="preserve"> incubated for 15 minutes at room temperature. Absorbance values were calculated via a standard curve.  Each sample was measured in duplicate. The plate was then read on </w:t>
+      </w:r>
+      <w:r>
+        <w:t xml:space="preserve">a Molecular Devices </w:t>
+      </w:r>
+      <w:proofErr w:type="spellStart"/>
+      <w:r>
+        <w:t>Spectramax</w:t>
+      </w:r>
+      <w:proofErr w:type="spellEnd"/>
+      <w:r>
+        <w:t xml:space="preserve"> Plus </w:t>
+      </w:r>
+      <w:r>
+        <w:t xml:space="preserve">model plate reader using </w:t>
+      </w:r>
+      <w:proofErr w:type="spellStart"/>
+      <w:r>
+        <w:t>SoftMaxPro</w:t>
+      </w:r>
+      <w:proofErr w:type="spellEnd"/>
+      <w:r>
+        <w:t xml:space="preserve"> 5.3 at 490 nm.</w:t>
+      </w:r>
+    </w:p>
+    <w:p/>
+    <w:p>
+      <w:pPr>
+        <w:pStyle w:val="Heading2"/>
+      </w:pPr>
+      <w:r>
+        <w:t>Statistical Analys</w:t>
+      </w:r>
+      <w:r>
+        <w:t>e</w:t>
+      </w:r>
+      <w:r>
+        <w:t>s</w:t>
+      </w:r>
+    </w:p>
+    <w:p>
+      <w:r>
+        <w:t xml:space="preserve">All statistical analyses </w:t>
+      </w:r>
+      <w:r>
+        <w:t>were performed</w:t>
+      </w:r>
+      <w:r>
+        <w:t xml:space="preserve"> using R version 4.2.2</w:t>
+      </w:r>
+      <w:r>
+        <w:t xml:space="preserve"> </w:t>
+      </w:r>
+      <w:r>
+        <w:fldChar w:fldCharType="begin"/>
+      </w:r>
+      <w:r>
+        <w:instrText xml:space="preserve"> ADDIN ZOTERO_ITEM CSL_CITATION {"citationID":"VWxlBSMf","properties":{"formattedCitation":"[20]","plainCitation":"[20]","noteIndex":0},"citationItems":[{"id":8230,"uris":["http://zotero.org/users/7317906/items/3HZT7KXK"],"itemData":{"id":8230,"type":"document","note":"Citation Key: base\npublisher-place: Vienna, Austria","publisher":"R Foundation for Statistical Computing","title":"R: A Language and Environment for Statistical Computing","URL":"http://www.r-project.org/","author":[{"literal":"R Core Team"}],"accessed":{"date-parts":[["2010",10,22]]},"issued":{"date-parts":[["2019"]]},"citation-key":"base"}}],"schema":"https://github.com/citation-style-language/schema/raw/master/csl-citation.json"} </w:instrText>
+      </w:r>
+      <w:r>
+        <w:fldChar w:fldCharType="separate"/>
+      </w:r>
+      <w:r>
+        <w:rPr>
+          <w:noProof/>
+        </w:rPr>
+        <w:t>[20]</w:t>
+      </w:r>
+      <w:r>
+        <w:fldChar w:fldCharType="end"/>
+      </w:r>
+      <w:r>
+        <w:t xml:space="preserve"> (</w:t>
+      </w:r>
+      <w:r>
+        <w:t>RRID:SCR_001905</w:t>
+      </w:r>
+      <w:r>
+        <w:t>)</w:t>
+      </w:r>
+      <w:r>
+        <w:t>.</w:t>
+      </w:r>
+      <w:r>
+        <w:t xml:space="preserve"> </w:t>
+      </w:r>
+      <w:r>
+        <w:t>We set statistical significance for this study at 0.05.  For pairwise testing, we first tested for normality via Shapiro Wilk tests, and then</w:t>
+      </w:r>
+      <w:r>
+        <w:t xml:space="preserve"> equal variance using Levene’s test.  On this basis either Mann-Whitney, Welch’s or Student’s </w:t>
+      </w:r>
+      <w:r>
+        <w:rPr>
+          <w:i/>
+        </w:rPr>
+        <w:t>t</w:t>
+      </w:r>
+      <w:r>
+        <w:t xml:space="preserve"> tests were performed</w:t>
+      </w:r>
+      <w:r>
+        <w:t xml:space="preserve"> as noted in the text and figure legends</w:t>
+      </w:r>
+      <w:r>
+        <w:t xml:space="preserve">.  For longitudinal data, including </w:t>
+      </w:r>
+      <w:r>
+        <w:t>β</w:t>
+      </w:r>
+      <w:r>
+        <w:t xml:space="preserve">HB tolerance tests we constructed mixed linear models using the lme4 package (version 3.1; </w:t>
+      </w:r>
+      <w:r>
+        <w:fldChar w:fldCharType="begin"/>
+      </w:r>
+      <w:r>
+        <w:instrText xml:space="preserve"> ADDIN ZOTERO_ITEM CSL_CITATION {"citationID":"Jas1zZ8f","properties":{"formattedCitation":"[21]","plainCitation":"[21]","noteIndex":0},"citationItems":[{"id":66,"uris":["http://zotero.org/users/7317906/items/2P2DMJ4L"],"itemData":{"id":66,"type":"article-journal","abstract":"Maximum likelihood or restricted maximum likelihood (REML) estimates of the parameters in linear mixed-effects models can be determined using the lmer function in the lme4 package for R. As for most model-fitting functions in R, the model is described in an lmer call by a formula, in this case including both fixed- and random-effects terms. The formula and data together determine a numerical representation of the model from which the profiled deviance or the profiled REML criterion can be evaluated as a function of some of the model parameters. The appropriate criterion is optimized, using one of the constrained optimization functions in R, to provide the parameter estimates. We describe the structure of the model, the steps in evaluating the profiled deviance or REML criterion, and the structure of classes or types that represents such a model. Sufficient detail is included to allow specialization of these structures by users who wish to write functions to fit specialized linear mixed models, such as models incorporating pedigrees or smoothing splines, that are not easily expressible in the formula language used by lmer.","container-title":"Journal of Statistical Software","DOI":"10.18637/jss.v067.i01","ISSN":"1548-7660","language":"en","license":"Copyright (c) 2015 Douglas Bates, Martin Mächler, Ben Bolker, Steve Walker","page":"1-48","source":"www.jstatsoft.org","title":"Fitting Linear Mixed-Effects Models Using lme4","volume":"67","author":[{"family":"Bates","given":"Douglas"},{"family":"Mächler","given":"Martin"},{"family":"Bolker","given":"Ben"},{"family":"Walker","given":"Steve"}],"issued":{"date-parts":[["2015",10,7]]},"citation-key":"batesFittingLinearMixedEffects2015"}}],"schema":"https://github.com/citation-style-language/schema/raw/master/csl-citation.json"} </w:instrText>
+      </w:r>
+      <w:r>
+        <w:fldChar w:fldCharType="separate"/>
+      </w:r>
+      <w:r>
+        <w:rPr>
+          <w:noProof/>
+        </w:rPr>
+        <w:t>[21]</w:t>
+      </w:r>
+      <w:r>
+        <w:fldChar w:fldCharType="end"/>
+      </w:r>
+      <w:r>
+        <w:t xml:space="preserve">).  The repeated measure (random intercept) was the animal, and </w:t>
+      </w:r>
+      <w:r>
+        <w:t>C</w:t>
+      </w:r>
+      <w:r>
+        <w:t xml:space="preserve">hi-squared tests were performed comparing models with and without diet terms.  For experiments with both rodent sexes, we first tested for modification by sex using the interaction terms from a 2x2 ANOVA, and </w:t>
+      </w:r>
+      <w:r>
+        <w:t>if significant reported this effect</w:t>
+      </w:r>
+      <w:r>
+        <w:t xml:space="preserve"> while also stratifying by sex</w:t>
+      </w:r>
+      <w:r>
+        <w:t xml:space="preserve"> and reporting those results</w:t>
+      </w:r>
+      <w:r>
+        <w:t>.</w:t>
+      </w:r>
+      <w:r>
+        <w:t xml:space="preserve">  </w:t>
+      </w:r>
+    </w:p>
+    <w:p>
+      <w:pPr>
+        <w:pStyle w:val="Heading1"/>
+      </w:pPr>
+      <w:r>
+        <w:t>RESULTS</w:t>
+      </w:r>
+      <w:r>
+        <w:br/>
+      </w:r>
+    </w:p>
+    <w:p>
+      <w:pPr>
+        <w:pStyle w:val="Heading2"/>
+      </w:pPr>
+      <w:r>
+        <w:t xml:space="preserve">mTORC1 </w:t>
+      </w:r>
+      <w:r>
+        <w:t>Activity Increases the</w:t>
+      </w:r>
+      <w:r>
+        <w:t xml:space="preserve"> </w:t>
+      </w:r>
+      <w:r>
+        <w:t>E</w:t>
+      </w:r>
+      <w:r>
+        <w:t xml:space="preserve">xpression of </w:t>
+      </w:r>
+      <w:r>
+        <w:t>K</w:t>
+      </w:r>
+      <w:r>
+        <w:t xml:space="preserve">etolysis </w:t>
+      </w:r>
+      <w:r>
+        <w:t>G</w:t>
+      </w:r>
+      <w:r>
+        <w:t>enes</w:t>
+      </w:r>
+    </w:p>
+    <w:p>
+      <w:r>
+        <w:rPr>
+          <w:highlight w:val="yellow"/>
+        </w:rPr>
+        <w:t>Our hypothesis was that mTORC1 and ketogenic diet feeding would both enhance ketone body disposal.</w:t>
+      </w:r>
+      <w:r>
+        <w:t xml:space="preserve">  </w:t>
+      </w:r>
+      <w:r>
+        <w:t xml:space="preserve">While evaluating factors that affect skeletal muscle expression, we noted that several ketolytic genes were elevated in skeletal muscle </w:t>
+      </w:r>
+      <w:r>
+        <w:rPr>
+          <w:i/>
+          <w:iCs/>
+        </w:rPr>
+        <w:t>Tsc1</w:t>
+      </w:r>
+      <w:r>
+        <w:t xml:space="preserve"> </w:t>
+      </w:r>
+      <w:r>
+        <w:t>KO</w:t>
+      </w:r>
+      <w:r>
+        <w:t xml:space="preserve"> mice</w:t>
+      </w:r>
+      <w:r>
+        <w:t xml:space="preserve"> (Figure 1A)</w:t>
+      </w:r>
+      <w:r>
+        <w:t xml:space="preserve">.  These mice, due to the deletion of the negative regulator TSC1, have elevated mTORC1 signaling </w:t>
+      </w:r>
+      <w:r>
+        <w:fldChar w:fldCharType="begin"/>
+      </w:r>
+      <w:r>
+        <w:instrText xml:space="preserve"> ADDIN ZOTERO_ITEM CSL_CITATION {"citationID":"hpc2Z4vV","properties":{"formattedCitation":"[19,22,23]","plainCitation":"[19,22,23]","noteIndex":0},"citationItems":[{"id":8736,"uris":["http://zotero.org/users/7317906/items/S4YYE9R2"],"itemData":{"id":8736,"type":"article-journal","container-title":"bioRxiv","DOI":"10.1101/720540","note":"Citation Key: Stephenson2019","title":"Skeletal Muscle mTORC1 Activation Increases Energy Expenditure and Reduces Longevity in Mice","URL":"http://dx.doi.org/10.1101/720540","author":[{"family":"Stephenson","given":"Erin J."},{"family":"Redd","given":"JeAnna R."},{"family":"Snyder","given":"Detrick S."},{"family":"Tran","given":"Quynh T."},{"family":"Lu","given":"Binbin"},{"family":"Peloquin","given":"Matthew J."},{"family":"Mulcahy","given":"Molly C."},{"family":"Harvey","given":"Innocence"},{"family":"Fisher","given":"Kaleigh"},{"family":"Han","given":"Joan C."},{"family":"Qi","given":"Nathan"},{"family":"Saltiel","given":"Alan R."},{"family":"Bridges","given":"Dave"}],"issued":{"date-parts":[["2019"]]},"citation-key":"Stephenson2019"}},{"id":4577,"uris":["http://zotero.org/users/7317906/items/S5C7PSHS"],"itemData":{"id":4577,"type":"article-journal","abstract":"Skeletal muscle alters whole-body metabolism through the release of hormones into the bloodstream called myokines. Guridi et al. found that skeletal muscle released a hormone called FGF21 in mice with skeletal muscle–specific activation of mTORC1, a protein complex that links nutrient availability to cell growth. Compared to control mice, these mice weighed less, likely because of increased fatty acid oxidation and increased energy expenditure, and had lower plasma concentrations of glucose and insulin. Systemic administration of antibodies directed against FGF21 reversed these metabolic changes. Thus, FGF21 released from skeletal muscle can mediate changes in whole-body metabolism.Skeletal muscle is the largest organ, comprising 40% of the total body lean mass, and affects whole-body metabolism in multiple ways. We investigated the signaling pathways involved in this process using TSCmKO mice, which have a skeletal muscle–specific depletion of TSC1 (tuberous sclerosis complex 1). This deficiency results in the constitutive activation of mammalian target of rapamycin complex 1 (mTORC1), which enhances cell growth by promoting protein synthesis. TSCmKO mice were lean, with increased insulin sensitivity, as well as changes in white and brown adipose tissue and liver indicative of increased fatty acid oxidation. These differences were due to increased plasma concentrations of fibroblast growth factor 21 (FGF21), a hormone that stimulates glucose uptake and fatty acid oxidation. The skeletal muscle of TSCmKO mice released FGF21 because of mTORC1-triggered endoplasmic reticulum (ER) stress and activation of a pathway involving PERK (protein kinase RNA-like ER kinase), eIF2α (eukaryotic translation initiation factor 2α), and ATF4 (activating transcription factor 4). Treatment of TSCmKO mice with a chemical chaperone that alleviates ER stress reduced FGF21 production in muscle and increased body weight. Moreover, injection of function-blocking antibodies directed against FGF21 largely normalized the metabolic phenotype of the mice. Thus, sustained activation of mTORC1 signaling in skeletal muscle regulated whole-body metabolism through the induction of FGF21, which, over the long term, caused severe lipodystrophy.","container-title":"Science Signaling","DOI":"10.1126/scisignal.aab3715","ISSN":"1937-9145","issue":"402","note":"PMID: 26554817\nCitation Key: Guridi2015\nISBN: 1937-9145 (Electronic)","page":"ra113-ra113","title":"Activation of mTORC1 in skeletal muscle regulates whole-body metabolism through FGF21","volume":"8","author":[{"family":"Guridi","given":"Maitea"},{"family":"Tintignac","given":"Lionel A"},{"family":"Lin","given":"Shuo"},{"family":"Kupr","given":"Barbara"},{"family":"Castets","given":"Perrine"},{"family":"Rüegg","given":"Markus A."}],"issued":{"date-parts":[["2015"]]},"citation-key":"Guridi2015"}},{"id":4834,"uris":["http://zotero.org/users/7317906/items/ZT6U9UFK"],"itemData":{"id":4834,"type":"article-journal","abstract":"Autophagy is a catabolic process that ensures homeostatic cell clearance and is deregulated in a growing number of myopathological conditions. Although FoxO3 was shown to promote the expression of autophagy-related genes in skeletal muscle, the mechanisms triggering autophagy are unclear. We show that TSC1-deficient mice (TSCmKO), characterized by sustained activation of mTORC1, develop a late-onset myopathy related to impaired autophagy. In young TSCmKO mice, constitutive and starvation-induced autophagy is blocked at the induction steps via mTORC1-mediated inhibition of Ulk1, despite FoxO3 activation. Rapamycin is sufficient to restore autophagy in TSCmKO mice and improves the muscle phenotype of old mutant mice. Inversely, abrogation of mTORC1 signaling by depletion of raptor induces autophagy regardless of FoxO inhibition. Thus, mTORC1 is the dominant regulator of autophagy induction in skeletal muscle and ensures a tight coordination of metabolic pathways. These findings may open interesting avenues for therapeutic strategies directed toward autophagy-related muscle diseases.","container-title":"Cell metabolism","DOI":"10.1016/j.cmet.2013.03.015","ISSN":"15504131","issue":"5","note":"PMID: 23602450\nCitation Key: Castets2013\nISBN: 1932-7420 (Electronic)\\r1550-4131 (Linking)","page":"731-44","title":"Sustained activation of mTORC1 in skeletal muscle inhibits constitutive and starvation-induced autophagy and causes a severe, late-onset myopathy.","volume":"17","author":[{"family":"Castets","given":"Perrine"},{"family":"Lin","given":"Shuo"},{"family":"Rion","given":"Nathalie"},{"family":"Di Fulvio","given":"Sabrina"},{"family":"Romanino","given":"Klaas"},{"family":"Guridi","given":"Maitea"},{"family":"Frank","given":"Stephan"},{"family":"Tintignac","given":"Lionel A. A."},{"family":"Sinnreich","given":"Michael"},{"family":"Rüegg","given":"Markus A."},{"family":"Di Fulvio","given":"Sabrina"},{"family":"R??egg","given":"Markus A."}],"issued":{"date-parts":[["2013",4,7]]},"citation-key":"Castets2013"}}],"schema":"https://github.com/citation-style-language/schema/raw/master/csl-citation.json"} </w:instrText>
+      </w:r>
+      <w:r>
+        <w:fldChar w:fldCharType="separate"/>
+      </w:r>
+      <w:r>
+        <w:rPr>
+          <w:noProof/>
+        </w:rPr>
+        <w:t>[19,22,23]</w:t>
+      </w:r>
+      <w:r>
+        <w:fldChar w:fldCharType="end"/>
+      </w:r>
+      <w:r>
+        <w:t xml:space="preserve">.  We evaluated expression of the putative </w:t>
+      </w:r>
+      <w:r>
+        <w:t>β</w:t>
+      </w:r>
+      <w:r>
+        <w:t xml:space="preserve">HB transporter </w:t>
+      </w:r>
+      <w:r>
+        <w:rPr>
+          <w:i/>
+          <w:iCs/>
+        </w:rPr>
+        <w:t>Slc16a1</w:t>
+      </w:r>
+      <w:r>
+        <w:t>; which was upregulated (</w:t>
+      </w:r>
+      <w:proofErr w:type="gramStart"/>
+      <w:r>
+        <w:t>4.0 fold</w:t>
+      </w:r>
+      <w:proofErr w:type="gramEnd"/>
+      <w:r>
+        <w:t xml:space="preserve">, </w:t>
+      </w:r>
+      <w:proofErr w:type="spellStart"/>
+      <w:r>
+        <w:t>p</w:t>
+      </w:r>
+      <w:r>
+        <w:rPr>
+          <w:vertAlign w:val="subscript"/>
+        </w:rPr>
+        <w:t>adj</w:t>
+      </w:r>
+      <w:proofErr w:type="spellEnd"/>
+      <w:r>
+        <w:t>=1.56 x 10</w:t>
+      </w:r>
+      <w:r>
+        <w:rPr>
+          <w:vertAlign w:val="superscript"/>
+        </w:rPr>
+        <w:t>-10</w:t>
+      </w:r>
+      <w:r>
+        <w:t xml:space="preserve">).  Among the ketone body catabolic enzymes, </w:t>
+      </w:r>
+      <w:r>
+        <w:rPr>
+          <w:i/>
+          <w:iCs/>
+        </w:rPr>
+        <w:t>Bdh1</w:t>
+      </w:r>
+      <w:r>
+        <w:t xml:space="preserve"> (</w:t>
+      </w:r>
+      <w:proofErr w:type="gramStart"/>
+      <w:r>
+        <w:t>2.1 fold</w:t>
+      </w:r>
+      <w:proofErr w:type="gramEnd"/>
+      <w:r>
+        <w:t xml:space="preserve">, </w:t>
+      </w:r>
+      <w:proofErr w:type="spellStart"/>
+      <w:r>
+        <w:t>p</w:t>
+      </w:r>
+      <w:r>
+        <w:rPr>
+          <w:vertAlign w:val="subscript"/>
+        </w:rPr>
+        <w:t>adj</w:t>
+      </w:r>
+      <w:proofErr w:type="spellEnd"/>
+      <w:r>
+        <w:t xml:space="preserve">=0.011) and </w:t>
+      </w:r>
+      <w:r>
+        <w:rPr>
+          <w:i/>
+          <w:iCs/>
+        </w:rPr>
+        <w:t>Oxct1</w:t>
+      </w:r>
+      <w:r>
+        <w:t xml:space="preserve"> (1.5 fold, </w:t>
+      </w:r>
+      <w:proofErr w:type="spellStart"/>
+      <w:r>
+        <w:t>p</w:t>
+      </w:r>
+      <w:r>
+        <w:rPr>
+          <w:vertAlign w:val="subscript"/>
+        </w:rPr>
+        <w:t>adj</w:t>
+      </w:r>
+      <w:proofErr w:type="spellEnd"/>
+      <w:r>
+        <w:t>=1.5 x 10</w:t>
+      </w:r>
+      <w:r>
+        <w:rPr>
+          <w:vertAlign w:val="superscript"/>
+        </w:rPr>
+        <w:t>-5</w:t>
+      </w:r>
+      <w:r>
+        <w:t xml:space="preserve">) were elevated.  </w:t>
+      </w:r>
+      <w:r>
+        <w:rPr>
+          <w:i/>
+          <w:iCs/>
+        </w:rPr>
+        <w:t>Acat1</w:t>
+      </w:r>
+      <w:r>
+        <w:t xml:space="preserve"> was unchanged in these muscles.  These data support the hypothesis that</w:t>
+      </w:r>
+      <w:r>
+        <w:t xml:space="preserve"> there is transcriptional upregulation</w:t>
+      </w:r>
+      <w:r>
+        <w:t xml:space="preserve"> of ketolytic genes</w:t>
+      </w:r>
+      <w:r>
+        <w:t xml:space="preserve"> in muscles with elevated mTORC1 activity</w:t>
+      </w:r>
+      <w:r>
+        <w:t xml:space="preserve">.  </w:t>
+      </w:r>
+    </w:p>
+    <w:p>
+      <w:pPr>
+        <w:pStyle w:val="Heading2"/>
+      </w:pPr>
+    </w:p>
+    <w:p>
+      <w:pPr>
+        <w:pStyle w:val="Heading2"/>
+      </w:pPr>
+      <w:r>
+        <w:t xml:space="preserve">Activation of </w:t>
+      </w:r>
+      <w:r>
+        <w:t>m</w:t>
+      </w:r>
+      <w:r>
+        <w:t>TO</w:t>
+      </w:r>
+      <w:r>
+        <w:t>RC1</w:t>
+      </w:r>
+      <w:r>
+        <w:t xml:space="preserve"> promotes Ketone Disposal</w:t>
+      </w:r>
+    </w:p>
+    <w:p>
+      <w:r>
+        <w:t xml:space="preserve">To test whether activation of mTORC1 in muscle tissue alters disposal of ketone bodies, we performed a </w:t>
+      </w:r>
+      <w:r>
+        <w:t>β</w:t>
+      </w:r>
+      <w:r>
+        <w:t xml:space="preserve">HB tolerance test in </w:t>
+      </w:r>
+      <w:r>
+        <w:rPr>
+          <w:i/>
+          <w:iCs/>
+        </w:rPr>
+        <w:t>Tsc1</w:t>
+      </w:r>
+      <w:r>
+        <w:t xml:space="preserve"> </w:t>
+      </w:r>
+      <w:r>
+        <w:t>KO</w:t>
+      </w:r>
+      <w:r>
+        <w:t xml:space="preserve"> mice.  The </w:t>
+      </w:r>
+      <w:proofErr w:type="spellStart"/>
+      <w:r>
+        <w:rPr>
+          <w:i/>
+          <w:iCs/>
+        </w:rPr>
+        <w:t>Ckmm</w:t>
+      </w:r>
+      <w:proofErr w:type="spellEnd"/>
+      <w:r>
+        <w:t xml:space="preserve">-Cre induced ablation of </w:t>
+      </w:r>
+      <w:r>
+        <w:rPr>
+          <w:i/>
+          <w:iCs/>
+        </w:rPr>
+        <w:t>Tsc1</w:t>
+      </w:r>
+      <w:r>
+        <w:t xml:space="preserve"> causes activation of mTORC1 in muscle tissues.  As shown in Figure </w:t>
+      </w:r>
+      <w:r>
+        <w:t>1B</w:t>
+      </w:r>
+      <w:r>
+        <w:t xml:space="preserve">, both male and female </w:t>
+      </w:r>
+      <w:r>
+        <w:t>KO</w:t>
+      </w:r>
+      <w:r>
+        <w:t xml:space="preserve"> mice cleared the injected beta-hydroxybutyrate much more rapidly than their wild-type littermates.  Using mixed-linear models using sex as a covariate, and the animal as a random intercept, we found a significant reduction in </w:t>
+      </w:r>
+      <w:r>
+        <w:t>β</w:t>
+      </w:r>
+      <w:r>
+        <w:t xml:space="preserve">HB levels after the challenge (p=0.004).  Similarly, when calculating the area under the curve from 0 to 60 minutes, there was a 25% reduction in the </w:t>
+      </w:r>
+      <w:r>
+        <w:t>KO</w:t>
+      </w:r>
+      <w:r>
+        <w:t xml:space="preserve">s, after adjusting for sex (p=0.016). When stratifying by sex, </w:t>
+      </w:r>
+      <w:r>
+        <w:t>KO</w:t>
+      </w:r>
+      <w:r>
+        <w:t xml:space="preserve">s had 41% lower AUC in males and 11% lower in females, though this modification by sex did not reach statistical significance (p=0.20). </w:t>
+      </w:r>
+      <w:r>
+        <w:t>Because there is a lack of consensus among studies</w:t>
+      </w:r>
+      <w:r>
+        <w:t xml:space="preserve"> </w:t>
+      </w:r>
+      <w:r>
+        <w:fldChar w:fldCharType="begin"/>
+      </w:r>
+      <w:r>
+        <w:instrText xml:space="preserve"> ADDIN ZOTERO_ITEM CSL_CITATION {"citationID":"TlAgaRBq","properties":{"formattedCitation":"[18]","plainCitation":"[18]","noteIndex":0},"citationItems":[{"id":8437,"uris":["http://zotero.org/users/7317906/items/2AZF8SH2"],"itemData":{"id":8437,"type":"article-journal","abstract":"Calorie restriction, without malnutrition, has been shown to increase lifespan and is associated with a shift away from glycolysis toward beta-oxidation. The objective of this study was to mimic this metabolic shift using low-carbohydrate diets and to determine the influence of these diets on longevity and healthspan in mice. C57BL/6 mice were assigned to a ketogenic, low-carbohydrate, or control diet at 12 months of age and were either allowed to live their natural lifespan or tested for physiological function after 1 or 14 months of dietary intervention. The ketogenic diet (KD) significantly increased median lifespan and survival compared to controls. In aged mice, only those consuming a KD displayed preservation of physiological function. The KD increased protein acetylation levels and regulated mTORC1 signaling in a tissue-dependent manner. This study demonstrates that a KD extends longevity and healthspan in mice.","container-title":"Cell Metabolism","DOI":"10.1016/j.cmet.2017.08.005","ISSN":"19327420","issue":"3","note":"PMID: 28877457\npublisher: Elsevier Inc.\nCitation Key: Roberts2017","page":"539-546.e5","title":"A Ketogenic Diet Extends Longevity and Healthspan in Adult Mice","volume":"26","author":[{"family":"Roberts","given":"Megan N."},{"family":"Wallace","given":"Marita A."},{"family":"Tomilov","given":"Alexey A."},{"family":"Zhou","given":"Zeyu"},{"family":"Marcotte","given":"George R."},{"family":"Tran","given":"Dianna"},{"family":"Perez","given":"Gabriella"},{"family":"Gutierrez-Casado","given":"Elena"},{"family":"Koike","given":"Shinichiro"},{"family":"Knotts","given":"Trina A."},{"family":"Imai","given":"Denise M."},{"family":"Griffey","given":"Stephen M."},{"family":"Kim","given":"Kyoungmi"},{"family":"Hagopian","given":"Kevork"},{"family":"Haj","given":"Fawaz G."},{"family":"Baar","given":"Keith"},{"family":"Cortopassi","given":"Gino A."},{"family":"Ramsey","given":"Jon J."},{"family":"Lopez-Dominguez","given":"Jose Alberto"}],"issued":{"date-parts":[["2017"]]},"citation-key":"Roberts2017"}}],"schema":"https://github.com/citation-style-language/schema/raw/master/csl-citation.json"} </w:instrText>
+      </w:r>
+      <w:r>
+        <w:fldChar w:fldCharType="separate"/>
+      </w:r>
+      <w:r>
+        <w:rPr>
+          <w:noProof/>
+        </w:rPr>
+        <w:t>[18</w:t>
+      </w:r>
+      <w:r>
+        <w:fldChar w:fldCharType="end"/>
+      </w:r>
+      <w:r>
+        <w:t>,</w:t>
+      </w:r>
+      <w:r>
+        <w:fldChar w:fldCharType="begin"/>
+      </w:r>
+      <w:r>
+        <w:instrText xml:space="preserve"> ADDIN ZOTERO_ITEM CSL_CITATION {"citationID":"jD3Ct4q1","properties":{"formattedCitation":"[24,25]","plainCitation":"[24,25]","noteIndex":0},"citationItems":[{"id":9182,"uris":["http://zotero.org/users/7317906/items/WZ3YVH2I"],"itemData":{"id":9182,"type":"article-journal","abstract":"The causes of the decline in skeletal muscle mass and function with age, known as sarcopenia, are poorly understood. Nutrition (calorie restriction) interventions impact many cellular processes and increase lifespan and preserve muscle mass and function with age. As we previously observed an increase in life span and muscle function in aging mice on a ketogenic diet (KD), we aimed to investigate the effect of a KD on the maintenance of skeletal muscle mass with age and the potential molecular mechanisms of this action. Twelve-month-old mice were assigned to an isocaloric control or KD until 16 or 26 months of age, at which time skeletal muscle was collected for evaluating mass, morphology, and biochemical properties. Skeletal muscle mass was significantly greater at 26 months in the gastrocnemius of mice on the KD. This result in KD mice was associated with a shift in fiber type from type IIb to IIa fibers and a range of molecular parameters including increased markers of NMJ remodeling, mitochondrial biogenesis, oxidative metabolism, and antioxidant capacity, while decreasing endoplasmic reticulum (ER) stress, protein synthesis, and proteasome activity. Overall, this study shows the effectiveness of a long-term KD in mitigating sarcopenia. The diet preferentially preserved oxidative muscle fibers and improved mitochondrial and antioxidant capacity. These adaptations may result in a healthier cellular environment, decreasing oxidative and ER stress resulting in less protein turnover. These shifts allow mice to better maintain muscle mass and function with age.","container-title":"Aging cell","DOI":"10.1111/acel.13322","ISSN":"1474-9726","issue":"January","note":"PMID: 33675103\nCitation Key: Wallace2021","page":"e13322","title":"The ketogenic diet preserves skeletal muscle with aging in mice.","author":[{"family":"Wallace","given":"Marita A."},{"family":"Aguirre","given":"Nicholas W"},{"family":"Marcotte","given":"George R"},{"family":"Marshall","given":"Andrea G"},{"family":"Baehr","given":"Leslie M"},{"family":"Hughes","given":"David C"},{"family":"Hamilton","given":"Karyn L"},{"family":"Roberts","given":"Megan N"},{"family":"Lopez-Dominguez","given":"Jose Alberto"},{"family":"Miller","given":"Benjamin F"},{"family":"Ramsey","given":"Jon J"},{"family":"Baar","given":"Keith"}],"issued":{"date-parts":[["2021"]]},"citation-key":"Wallace2021"}},{"id":9151,"uris":["http://zotero.org/users/7317906/items/L8PE6TZ6"],"itemData":{"id":9151,"type":"book","abstract":"Ketogenic diets (KD) are reported to improve body weight, fat mass, and exercise performance in humans. Unfortunately, most rodent studies have used a low-protein KD, which does not recapitulate diets used by humans. Since skeletal muscle plays a critical role in responding to macronutrient perturbations induced by diet and exercise, the purpose of this study was to test if a normal-protein KD (NPKD) impacts shifts in skeletal muscle substrate oxidative capacity in response to exercise training (ExTr). A high fat, carbohydrate-deficient NPKD (16.1% protein, 83.9% fat, 0% carbohydrate) was given to C57BL/6J male mice for 6 weeks, while controls received a low fat diet with similar protein (15.9% protein, 11.9% fat, 72.2% carbohydrate). On week four of the diet, mice began treadmill training 5 days/week, 60 min/day for 3 weeks. NPKD-fed mice increased body weight and fat mass, while ExTr negated a continued rise in adiposity. ExTr increased intramuscular glycogen, while the NPKD increased intramuscular triglycerides. Neither the NPKD nor ExTr alone altered mitochondrial content; however, in combination, the NPKD-ExTr group showed increases in PGC-1α, as well as markers of mitochondrial fission and fusion. Pyruvate oxidative capacity was unchanged by either intervention, while ExTr increased leucine oxidation in NPKD-fed mice. Lipid metabolism pathways had the most notable changes as the NPKD and ExTr interventions both enhanced mitochondrial and peroxisomal lipid oxidation and many adaptations were additive or synergistic. Overall these results suggest a combination of a NPKD and ExTr induces additive and/or synergistic adaptations in skeletal muscle oxidative capacity.","ISBN":"2-257-63278-8","note":"container-title: American Journal of Physiology-Endocrinology and Metabolism\nDOI: 10.1152/ajpendo.00410.2020\nCitation Key: Huang2021\nISSN: 0193-1849","title":"Combined effects of a ketogenic diet and exercise training alter mitochondrial and peroxisomal substrate oxidative capacity in skeletal muscle","author":[{"family":"Huang","given":"Tai-Yu"},{"family":"Linden","given":"Melissa A."},{"family":"Fuller","given":"Scott E."},{"family":"Goldsmith","given":"Felicia R"},{"family":"Simon","given":"Jacob"},{"family":"Batdorf","given":"Heidi M."},{"family":"Scott","given":"Matthew C."},{"family":"Essajee","given":"Nabil M."},{"family":"Brown","given":"John M."},{"family":"Noland","given":"Robert C."}],"issued":{"date-parts":[["2021"]]},"citation-key":"Huang2021"}}],"schema":"https://github.com/citation-style-language/schema/raw/master/csl-citation.json"} </w:instrText>
+      </w:r>
+      <w:r>
+        <w:fldChar w:fldCharType="separate"/>
+      </w:r>
+      <w:r>
+        <w:rPr>
+          <w:rFonts w:ascii="Calibri" w:cs="Calibri"/>
+        </w:rPr>
+        <w:t>24,25]</w:t>
+      </w:r>
+      <w:r>
+        <w:fldChar w:fldCharType="end"/>
+      </w:r>
+      <w:r>
+        <w:t xml:space="preserve"> evaluating the effect of ketogenic diets on muscle mTORC1 function </w:t>
+      </w:r>
+      <w:r>
+        <w:t>and</w:t>
+      </w:r>
+      <w:r>
+        <w:t xml:space="preserve"> suggested activation of this signaling pathway, we evaluated how ketogenic diet feeding alters ketone disposal.</w:t>
+      </w:r>
+    </w:p>
+    <w:p/>
+    <w:p>
+      <w:pPr>
+        <w:pStyle w:val="Heading2"/>
+      </w:pPr>
+      <w:r>
+        <w:t xml:space="preserve">KD </w:t>
+      </w:r>
+      <w:r>
+        <w:t>Feeding Does not Improve</w:t>
+      </w:r>
+      <w:r>
+        <w:t xml:space="preserve"> </w:t>
+      </w:r>
+      <w:r>
+        <w:t>β</w:t>
+      </w:r>
+      <w:r>
+        <w:t>HB</w:t>
+      </w:r>
+      <w:r>
+        <w:t xml:space="preserve"> Disposal in A/J Mice</w:t>
+      </w:r>
+    </w:p>
+    <w:p>
+      <w:r>
+        <w:t xml:space="preserve">We hypothesized that prolonged exposure to elevated ketone body levels would </w:t>
+      </w:r>
+      <w:r>
+        <w:t xml:space="preserve">lead to </w:t>
+      </w:r>
+      <w:r>
+        <w:t xml:space="preserve">physiological adaptations, resulting in improved disposal of ketone bodies. </w:t>
+      </w:r>
+      <w:r>
+        <w:t xml:space="preserve">To test </w:t>
+      </w:r>
+      <w:r>
+        <w:t>this hypothesis</w:t>
+      </w:r>
+      <w:r>
+        <w:t>,</w:t>
+      </w:r>
+      <w:r>
+        <w:t xml:space="preserve"> </w:t>
+      </w:r>
+      <w:r>
+        <w:t xml:space="preserve">we fed </w:t>
+      </w:r>
+      <w:r>
+        <w:t>10-week-old</w:t>
+      </w:r>
+      <w:r>
+        <w:t xml:space="preserve"> male</w:t>
+      </w:r>
+      <w:r>
+        <w:t>,</w:t>
+      </w:r>
+      <w:r>
+        <w:t xml:space="preserve"> wild-type</w:t>
+      </w:r>
+      <w:r>
+        <w:t xml:space="preserve"> A/J mice a control or a ketogenic diet for three weeks and then performed a </w:t>
+      </w:r>
+      <w:r>
+        <w:t>KTT.</w:t>
+      </w:r>
+      <w:r>
+        <w:t xml:space="preserve">  As expected, baseline ketone body levels were elevated </w:t>
+      </w:r>
+      <w:r>
+        <w:t xml:space="preserve">from 0.43 mg/dL to 0.75 mg/dL in this assay (p=0.017).  Upon injection we were surprised to observe that ketone body levels </w:t>
+      </w:r>
+      <w:r>
+        <w:t>remain</w:t>
+      </w:r>
+      <w:r>
+        <w:t xml:space="preserve"> elevated more</w:t>
+      </w:r>
+      <w:r>
+        <w:t>-</w:t>
+      </w:r>
+      <w:r>
+        <w:t>so in the ketogenic diet-fed mice than the control mice</w:t>
+      </w:r>
+      <w:r>
+        <w:t xml:space="preserve"> (Figure </w:t>
+      </w:r>
+      <w:r>
+        <w:t>2</w:t>
+      </w:r>
+      <w:r>
+        <w:t>A), even after subtracting for baseline differences (Figure 2B</w:t>
+      </w:r>
+      <w:r>
+        <w:t>-C</w:t>
+      </w:r>
+      <w:r>
+        <w:t>)</w:t>
+      </w:r>
+      <w:r>
+        <w:t xml:space="preserve">. </w:t>
+      </w:r>
+      <w:r>
+        <w:t xml:space="preserve">These data suggest that ketone disposal is not improved after three weeks of a ketogenic relative to a control </w:t>
+      </w:r>
+      <w:r>
+        <w:t>diet and</w:t>
+      </w:r>
+      <w:r>
+        <w:t xml:space="preserve"> may </w:t>
+      </w:r>
+      <w:proofErr w:type="gramStart"/>
+      <w:r>
+        <w:t>actually be</w:t>
+      </w:r>
+      <w:proofErr w:type="gramEnd"/>
+      <w:r>
+        <w:t xml:space="preserve"> somewhat worsened in A/J mice</w:t>
+      </w:r>
+      <w:r>
+        <w:t xml:space="preserve"> (p=0.</w:t>
+      </w:r>
+      <w:r>
+        <w:t>274</w:t>
+      </w:r>
+      <w:r>
+        <w:t xml:space="preserve"> via linear </w:t>
+      </w:r>
+      <w:r>
+        <w:t xml:space="preserve">mixed </w:t>
+      </w:r>
+      <w:r>
+        <w:t>models)</w:t>
+      </w:r>
+      <w:r>
+        <w:t>.</w:t>
+      </w:r>
+    </w:p>
+    <w:p/>
+    <w:p>
+      <w:r>
+        <w:t>To understand this surprising</w:t>
+      </w:r>
+      <w:r>
+        <w:t xml:space="preserve"> lack of</w:t>
+      </w:r>
+      <w:r>
+        <w:t xml:space="preserve"> adaptation, we performed mRNA quantification of the expression of key transporters and enzymes involved in ketolysis in the quadriceps from these A/J mice.  As shown in Figure 2D, most ketolytic gene expression was reduced.  Among the MCT1 family transporters that conduct ketone bodies into cells, </w:t>
+      </w:r>
+      <w:r>
+        <w:rPr>
+          <w:i/>
+          <w:iCs/>
+        </w:rPr>
+        <w:t>Slc16a1</w:t>
+      </w:r>
+      <w:r>
+        <w:t xml:space="preserve"> transcripts were modestly reduced in muscles from A/J mice fed ketogenic diets (17% reduced, </w:t>
+      </w:r>
+      <w:proofErr w:type="spellStart"/>
+      <w:r>
+        <w:t>p</w:t>
+      </w:r>
+      <w:r>
+        <w:rPr>
+          <w:vertAlign w:val="subscript"/>
+        </w:rPr>
+        <w:t>diet</w:t>
+      </w:r>
+      <w:proofErr w:type="spellEnd"/>
+      <w:r>
+        <w:t xml:space="preserve"> from a 2x2 ANOVA =0.064). </w:t>
+      </w:r>
+      <w:r>
+        <w:rPr>
+          <w:i/>
+          <w:iCs/>
+        </w:rPr>
+        <w:t>Bdh1</w:t>
+      </w:r>
+      <w:r>
+        <w:t xml:space="preserve"> encodes beta hydroxybutyrate dehydrogenase, the interconversion step between beta-hydroxybutyrate and acetoacetate.  We found that this gene is downregulated in A/J muscles by 42% (</w:t>
+      </w:r>
+      <w:proofErr w:type="spellStart"/>
+      <w:r>
+        <w:t>p</w:t>
+      </w:r>
+      <w:r>
+        <w:rPr>
+          <w:vertAlign w:val="subscript"/>
+        </w:rPr>
+        <w:t>diet</w:t>
+      </w:r>
+      <w:proofErr w:type="spellEnd"/>
+      <w:r>
+        <w:t xml:space="preserve"> from a 2x2 ANOVA =0.009).  </w:t>
+      </w:r>
+      <w:r>
+        <w:rPr>
+          <w:i/>
+          <w:iCs/>
+        </w:rPr>
+        <w:t>Oxct1</w:t>
+      </w:r>
+      <w:r>
+        <w:t xml:space="preserve"> encodes succinyl-CoA:3-ketoacid CoA transferase (SCOT) and was down regulated in both male and female mice by 52% (</w:t>
+      </w:r>
+      <w:proofErr w:type="spellStart"/>
+      <w:r>
+        <w:t>p</w:t>
+      </w:r>
+      <w:r>
+        <w:rPr>
+          <w:vertAlign w:val="subscript"/>
+        </w:rPr>
+        <w:t>diet</w:t>
+      </w:r>
+      <w:proofErr w:type="spellEnd"/>
+      <w:r>
+        <w:t xml:space="preserve"> from a 2x2 ANOVA=8.4 x 10</w:t>
+      </w:r>
+      <w:r>
+        <w:rPr>
+          <w:vertAlign w:val="superscript"/>
+        </w:rPr>
+        <w:t>-9</w:t>
+      </w:r>
+      <w:r>
+        <w:t>).  While there was no significant sex x diet interaction in these analyses, male mice had 15-30% higher expression of each of these genes compared to female mouse muscle lysates (</w:t>
+      </w:r>
+      <w:proofErr w:type="spellStart"/>
+      <w:r>
+        <w:t>p</w:t>
+      </w:r>
+      <w:r>
+        <w:rPr>
+          <w:vertAlign w:val="subscript"/>
+        </w:rPr>
+        <w:t>sex</w:t>
+      </w:r>
+      <w:proofErr w:type="spellEnd"/>
+      <w:r>
+        <w:t xml:space="preserve"> from a 2x2 ANOVA=4.7 x 10</w:t>
+      </w:r>
+      <w:r>
+        <w:rPr>
+          <w:vertAlign w:val="superscript"/>
+        </w:rPr>
+        <w:t>-3</w:t>
+      </w:r>
+      <w:r>
+        <w:t xml:space="preserve"> for </w:t>
+      </w:r>
+      <w:r>
+        <w:rPr>
+          <w:i/>
+          <w:iCs/>
+        </w:rPr>
+        <w:t>Slc16a1</w:t>
+      </w:r>
+      <w:r>
+        <w:t>, 8.9 x 10</w:t>
+      </w:r>
+      <w:r>
+        <w:rPr>
+          <w:vertAlign w:val="superscript"/>
+        </w:rPr>
+        <w:t>-3</w:t>
+      </w:r>
+      <w:r>
+        <w:t xml:space="preserve"> for </w:t>
+      </w:r>
+      <w:r>
+        <w:rPr>
+          <w:i/>
+          <w:iCs/>
+        </w:rPr>
+        <w:t>Bdh1</w:t>
+      </w:r>
+      <w:r>
+        <w:t xml:space="preserve"> and 0.055 for </w:t>
+      </w:r>
+      <w:r>
+        <w:rPr>
+          <w:i/>
+          <w:iCs/>
+        </w:rPr>
+        <w:t>Oxct1</w:t>
+      </w:r>
+      <w:r>
+        <w:t>)</w:t>
+      </w:r>
+      <w:r>
+        <w:t>.</w:t>
+      </w:r>
+      <w:r>
+        <w:t xml:space="preserve"> </w:t>
+      </w:r>
+      <w:r>
+        <w:t xml:space="preserve">This may suggest enhanced ketone body catabolism in male versus female mice, but this was not explored further. </w:t>
+      </w:r>
+      <w:r>
+        <w:t>The</w:t>
+      </w:r>
+      <w:r>
+        <w:t xml:space="preserve"> key finding here is that the transcriptional downregulation of genes involved in ketone body disposal in muscle is consistent with reduced disposal of injected </w:t>
+      </w:r>
+      <w:r>
+        <w:t>β</w:t>
+      </w:r>
+      <w:r>
+        <w:t xml:space="preserve">HB.  This </w:t>
+      </w:r>
+      <w:r>
+        <w:t xml:space="preserve">begs the </w:t>
+      </w:r>
+      <w:r>
+        <w:t xml:space="preserve">question, if ketone bodies are at steady state in serum, </w:t>
       </w:r>
       <w:r>
         <w:lastRenderedPageBreak/>
-        <w:t>high capacity first strand cDNA synthesis kit (</w:t>
+        <w:t xml:space="preserve">but disposal is reduced, does that imply that production may also be reduced?  To test this, we looked at three ketogenic enzymes in the livers of these mice. We found downregulation of hepatic </w:t>
       </w:r>
       <w:proofErr w:type="spellStart"/>
       <w:r>
-        <w:t>Thermo</w:t>
+        <w:rPr>
+          <w:i/>
+          <w:iCs/>
+        </w:rPr>
+        <w:t>Hmgcl</w:t>
       </w:r>
       <w:proofErr w:type="spellEnd"/>
       <w:r>
-        <w:t xml:space="preserve"> Scientific cat # </w:t>
-      </w:r>
-      <w:r>
-        <w:t>4368813</w:t>
-      </w:r>
-      <w:r>
-        <w:t xml:space="preserve">).  cDNA was amplified using SYBR Green (Thermo-Fisher </w:t>
-      </w:r>
-      <w:r>
-        <w:t>4367659</w:t>
-      </w:r>
-      <w:r>
-        <w:t xml:space="preserve">) and the primers noted in Table 1 using a </w:t>
+        <w:rPr>
+          <w:i/>
+          <w:iCs/>
+        </w:rPr>
+        <w:t xml:space="preserve"> </w:t>
+      </w:r>
+      <w:r>
+        <w:t>and</w:t>
+      </w:r>
+      <w:r>
+        <w:rPr>
+          <w:i/>
+          <w:iCs/>
+        </w:rPr>
+        <w:t xml:space="preserve"> Hmgcs2</w:t>
+      </w:r>
+      <w:r>
+        <w:rPr>
+          <w:i/>
+          <w:iCs/>
+        </w:rPr>
+        <w:t xml:space="preserve"> </w:t>
+      </w:r>
+      <w:r>
+        <w:t xml:space="preserve">in the livers of male mice, </w:t>
+      </w:r>
+      <w:r>
+        <w:t>and</w:t>
+      </w:r>
+      <w:r>
+        <w:t xml:space="preserve"> </w:t>
+      </w:r>
+      <w:r>
+        <w:rPr>
+          <w:i/>
+          <w:iCs/>
+        </w:rPr>
+        <w:t>Bdh1</w:t>
+      </w:r>
+      <w:r>
+        <w:t xml:space="preserve"> was downregulated in</w:t>
+      </w:r>
+      <w:r>
+        <w:t xml:space="preserve"> both male and</w:t>
+      </w:r>
+      <w:r>
+        <w:t xml:space="preserve"> female mouse livers (Supplementary Figure 1, </w:t>
       </w:r>
       <w:proofErr w:type="spellStart"/>
       <w:r>
-        <w:t>QuantStudio</w:t>
+        <w:t>p</w:t>
+      </w:r>
+      <w:r>
+        <w:rPr>
+          <w:vertAlign w:val="subscript"/>
+        </w:rPr>
+        <w:t>sex</w:t>
       </w:r>
       <w:proofErr w:type="spellEnd"/>
       <w:r>
-        <w:t xml:space="preserve"> 5.  Relative expression was determined us</w:t>
-      </w:r>
-      <w:r>
-        <w:t>ing</w:t>
-      </w:r>
-      <w:r>
-        <w:t xml:space="preserve"> the </w:t>
+        <w:rPr>
+          <w:vertAlign w:val="subscript"/>
+        </w:rPr>
+        <w:t xml:space="preserve"> x diet</w:t>
+      </w:r>
+      <w:r>
+        <w:t xml:space="preserve"> &lt;0.01 for both </w:t>
+      </w:r>
+      <w:proofErr w:type="spellStart"/>
+      <w:r>
+        <w:rPr>
+          <w:i/>
+          <w:iCs/>
+        </w:rPr>
+        <w:t>Hmgcl</w:t>
+      </w:r>
+      <w:proofErr w:type="spellEnd"/>
+      <w:r>
+        <w:t xml:space="preserve"> and </w:t>
+      </w:r>
+      <w:r>
+        <w:rPr>
+          <w:i/>
+          <w:iCs/>
+        </w:rPr>
+        <w:t>Hmgcs1</w:t>
+      </w:r>
+      <w:r>
+        <w:t>).</w:t>
+      </w:r>
+    </w:p>
+    <w:p/>
+    <w:p>
+      <w:pPr>
+        <w:pStyle w:val="Heading2"/>
+      </w:pPr>
+      <w:r>
+        <w:t xml:space="preserve">Evaluation of Diversity Outbred Mice Demonstrates Substantial Variation in </w:t>
+      </w:r>
+      <w:r>
+        <w:t>β</w:t>
+      </w:r>
+      <w:r>
+        <w:t xml:space="preserve">HB Disposal </w:t>
+      </w:r>
+    </w:p>
+    <w:p>
+      <w:r>
+        <w:t xml:space="preserve">To evaluate if A/J mice were atypical in their lack of adaptation to improved ketolysis, we performed </w:t>
+      </w:r>
+      <w:r>
+        <w:t>β</w:t>
+      </w:r>
+      <w:r>
+        <w:t xml:space="preserve">HB tolerance tests on diversity outbred mice before or after four weeks of a ketogenic diet.  Diversity outbred (DO) mice are genetically unique, so they represent the integrated genetic variability of the intercrossed eight founder strains </w:t>
+      </w:r>
+      <w:r>
+        <w:fldChar w:fldCharType="begin"/>
+      </w:r>
+      <w:r>
+        <w:instrText xml:space="preserve"> ADDIN ZOTERO_ITEM CSL_CITATION {"citationID":"DtMZezGZ","properties":{"formattedCitation":"[26]","plainCitation":"[26]","noteIndex":0},"citationItems":[{"id":8432,"uris":["http://zotero.org/users/7317906/items/6RYMCB6K"],"itemData":{"id":8432,"type":"article-journal","abstract":"The Diversity Outbred (DO) population is a heterogeneous stock derived from the same eight founder strains as the Collaborative Cross (CC) inbred strains. Genetically heterogeneous DO mice display a broad range of phenotypes. Natural levels of heterozygosity provide genetic buffering and, as a result, DO mice are robust and breed well. Genetic mapping analysis in the DO presents new challenges and opportunities. Specialized algorithms are required to reconstruct haplotypes from high-density SNP array data. The eight founder haplotypes can be combined into 36 possible diplotypes, which must be accommodated in QTL mapping analysis. Population structure of the DO must be taken into account here. Estimated allele effects of eight founder haplotypes provide information that is not available in two-parent crosses and can dramatically reduce the number of candidate loci. Allele effects can also distinguish chance colocation of QTL from pleiotropy, which provides a basis for establishing causality in expression QTL studies. We recommended sample sizes of 200-800 mice for QTL mapping studies, larger than for traditional crosses. The CC inbred strains provide a resource for independent validation of DO mapping results. Genetic heterogeneity of the DO can provide a powerful advantage in our ability to generalize conclusions to other genetically diverse populations. Genetic diversity can also help to avoid the pitfall of identifying an idiosyncratic reaction that occurs only in a limited genetic context. Informatics tools and data resources associated with the CC, the DO, and their founder strains are developing rapidly. We anticipate a flood of new results to follow as our community begins to adopt and utilize these new genetic resource populations. © Springer Science+Business Media, LLC 2012.","container-title":"Mammalian Genome","DOI":"10.1007/s00335-012-9414-2","ISSN":"09388990","issue":"9-10","note":"Citation Key: Churchill2012\nISBN: 0033501294142","page":"713-718","title":"The Diversity Outbred mouse population","volume":"23","author":[{"family":"Churchill","given":"Gary A."},{"family":"Gatti","given":"Daniel M."},{"family":"Munger","given":"Steven C."},{"family":"Svenson","given":"Karen L."}],"issued":{"date-parts":[["2012"]]},"citation-key":"Churchill2012"}}],"schema":"https://github.com/citation-style-language/schema/raw/master/csl-citation.json"} </w:instrText>
+      </w:r>
+      <w:r>
+        <w:fldChar w:fldCharType="separate"/>
+      </w:r>
+      <w:r>
+        <w:rPr>
+          <w:noProof/>
+        </w:rPr>
+        <w:t>[26]</w:t>
+      </w:r>
+      <w:r>
+        <w:fldChar w:fldCharType="end"/>
+      </w:r>
+      <w:r>
+        <w:t xml:space="preserve">.  As hypothesized by this level of genetic variability, DO mice had variable responses to </w:t>
+      </w:r>
+      <w:r>
+        <w:t>β</w:t>
+      </w:r>
+      <w:r>
+        <w:t>HB Tolerance Tests at both baseline and after four weeks of ketogenic diet (Figure 3A).  In Figure 3B we describe the within-mouse effects of the diet, again showing substantial between-strain variability, likely due to genetic differences.  There was more variability in the area under the curve post-diet than pre-diet (</w:t>
+      </w:r>
+      <w:proofErr w:type="spellStart"/>
+      <w:r>
+        <w:t>SD</w:t>
+      </w:r>
+      <w:r>
+        <w:rPr>
+          <w:vertAlign w:val="subscript"/>
+        </w:rPr>
+        <w:t>follow</w:t>
+      </w:r>
+      <w:proofErr w:type="spellEnd"/>
+      <w:r>
+        <w:rPr>
+          <w:vertAlign w:val="subscript"/>
+        </w:rPr>
+        <w:t>-up</w:t>
+      </w:r>
+      <w:r>
+        <w:t>/</w:t>
+      </w:r>
+      <w:proofErr w:type="spellStart"/>
+      <w:r>
+        <w:t>SD</w:t>
+      </w:r>
+      <w:r>
+        <w:rPr>
+          <w:vertAlign w:val="subscript"/>
+        </w:rPr>
+        <w:t>baseline</w:t>
+      </w:r>
+      <w:proofErr w:type="spellEnd"/>
+      <w:r>
+        <w:t>= 1.93; p&lt;1 x 10</w:t>
+      </w:r>
+      <w:r>
+        <w:rPr>
+          <w:vertAlign w:val="superscript"/>
+        </w:rPr>
+        <w:t>-15</w:t>
+      </w:r>
+      <w:r>
+        <w:t xml:space="preserve"> via Levene’s test), suggesting diet-induced variability.  Consistent with our findings using inbred A/J mice, the majority of DO mice had worsened ketone disposal after diet (35 mice), with a smaller number of mice having improved ketone disposal by our assay (10 mice), more than would be expected by chance (p=1.9 x 10</w:t>
+      </w:r>
+      <w:r>
+        <w:rPr>
+          <w:vertAlign w:val="superscript"/>
+        </w:rPr>
+        <w:t>-4</w:t>
+      </w:r>
+      <w:r>
+        <w:t xml:space="preserve"> from a </w:t>
+      </w:r>
+      <w:r>
+        <w:rPr>
+          <w:rFonts w:ascii="Symbol" w:eastAsia="Symbol" w:hAnsi="Symbol" w:cs="Symbol"/>
+        </w:rPr>
+        <w:t>c</w:t>
+      </w:r>
+      <w:r>
+        <w:rPr>
+          <w:vertAlign w:val="superscript"/>
+        </w:rPr>
+        <w:t>2</w:t>
+      </w:r>
+      <w:r>
+        <w:t xml:space="preserve"> test). </w:t>
+      </w:r>
+      <w:r>
+        <w:t xml:space="preserve">Across this cohort </w:t>
+      </w:r>
+      <w:r>
+        <w:t>there was a significant decrease in ketone disposal (increase in baseline adjusted KTT) in these mice after four weeks of ketogenic diet (p=4.8 x 10</w:t>
+      </w:r>
+      <w:r>
+        <w:rPr>
+          <w:vertAlign w:val="superscript"/>
+        </w:rPr>
+        <w:t>-5</w:t>
+      </w:r>
+      <w:r>
+        <w:t xml:space="preserve"> from a paired Wilcoxon test).</w:t>
+      </w:r>
+    </w:p>
+    <w:p/>
+    <w:p>
+      <w:r>
+        <w:t>To better understand the physiological basis and repercussions of this variation, we performed an exploratory analysis to identify potential correlations between baseline and follow-up</w:t>
+      </w:r>
+      <w:r>
+        <w:t xml:space="preserve"> </w:t>
+      </w:r>
+      <w:r>
+        <w:t xml:space="preserve">changes in ketone disposal, and a variety of other outcomes (Figure 3C).  While none of these associations met our threshold for statistical significance, we saw three interesting potential relationships between </w:t>
+      </w:r>
+      <w:proofErr w:type="spellStart"/>
+      <w:r>
+        <w:t>i</w:t>
+      </w:r>
+      <w:proofErr w:type="spellEnd"/>
+      <w:r>
+        <w:t>) changes in cholesterol and ketone tolerance at baseline (r=-0.18, p=0.26), ii) weight gain on a ketogenic diet and ketone tolerance after the diet (r=0.25, p=0.114), and iii) weight gain and change in ketone tolerance (r=0.</w:t>
+      </w:r>
+      <w:r>
+        <w:t>23, p</w:t>
+      </w:r>
+      <w:r>
+        <w:t>=0.158).  While this study was underpowered to detect relationships of this size, the findings warrant further investigation into the relationships between ketone disposal and cholesterol and energy homeostasis.</w:t>
+      </w:r>
+    </w:p>
+    <w:p>
+      <w:pPr>
+        <w:pStyle w:val="Heading1"/>
+      </w:pPr>
+      <w:r>
+        <w:t>DISCUSSION</w:t>
+      </w:r>
+    </w:p>
+    <w:p/>
+    <w:p>
+      <w:r>
+        <w:t xml:space="preserve">Activation of mTORC1 in skeletal muscle appears to play a positive role in promoting the disposal of ketone bodies and regulating the expression of genes associated with ketolysis. It was tempting to speculate, based on prior reports of mTORC1 activation in muscles after a ketogenic diet, that this was a common adaptation to the low-carbohydrate high-fat (LCHF) state.  Surprisingly, our findings revealed that a 4-week feeding period of a ketogenic diet did not result in an enhancement of ketone body disposal in both inbred A/J mice and Diversity Outbred mice, but rather an impairment in disposal of a bolus of βHB.   Our results are </w:t>
+      </w:r>
+      <w:r>
+        <w:lastRenderedPageBreak/>
+        <w:t xml:space="preserve">somewhat at odds with those of </w:t>
+      </w:r>
+      <w:r>
+        <w:rPr>
+          <w:rFonts w:ascii="Calibri" w:cs="Calibri"/>
+        </w:rPr>
+        <w:t>Schnyder, et al</w:t>
+      </w:r>
+      <w:r>
+        <w:t xml:space="preserve"> </w:t>
+      </w:r>
+      <w:r>
+        <w:fldChar w:fldCharType="begin"/>
+      </w:r>
+      <w:r>
+        <w:instrText xml:space="preserve"> ADDIN ZOTERO_ITEM CSL_CITATION {"citationID":"LpbssgSc","properties":{"formattedCitation":"[16]","plainCitation":"[16]","noteIndex":0},"citationItems":[{"id":189,"uris":["http://zotero.org/users/7317906/items/THMX4FYC"],"itemData":{"id":189,"type":"article-journal","abstract":"© 2017 the American Physiological Society.Low-carbohydrate/high-fat (LCHF) diets are increasingly popular dietary interventions for body weight control and as treatment for different pathological conditions. However, the mechanisms of action are still poorly understood, in particular, in long-term administration. Besides liver, brain, and heart, skeletal muscle is one of the major organs involved in the regulation of physiological and pathophysiological ketosis. We assessed the role of the peroxisome proliferator-activated receptor γ coactivator 1α (PGC-1α) in skeletal muscle of male wild-type control and PGC-1α muscle-specific knockout mice upon 12 wk of LCHF diet feeding. Interestingly, LCHF diet administration increased oxygen consumption in a muscle PGC-1α-dependent manner, concomitant with a blunted transcriptional induction of genes involved in fatty acid oxidation and impairment in exercise performance. These data reveal a new role for muscle PGC-1α in regulating the physiological adaptation to long-term LCHF diet administration.","container-title":"American Journal of Physiology-Endocrinology and Metabolism","DOI":"10.1152/ajpendo.00361.2016","ISSN":"0193-1849","issue":"5","note":"Citation Key: Schnyder2017a","page":"E437-E446","title":"Muscle PGC-1α is required for long-term systemic and local adaptations to a ketogenic diet in mice","volume":"312","author":[{"family":"Schnyder","given":"Svenia"},{"family":"Svensson","given":"Kristoffer"},{"family":"Cardel","given":"Bettina"},{"family":"Handschin","given":"Christoph"}],"issued":{"date-parts":[["2017"]]},"citation-key":"Schnyder2017a"}}],"schema":"https://github.com/citation-style-language/schema/raw/master/csl-citation.json"} </w:instrText>
+      </w:r>
+      <w:r>
+        <w:fldChar w:fldCharType="separate"/>
+      </w:r>
+      <w:r>
+        <w:rPr>
+          <w:noProof/>
+        </w:rPr>
+        <w:t>[16]</w:t>
+      </w:r>
+      <w:r>
+        <w:fldChar w:fldCharType="end"/>
+      </w:r>
+      <w:r>
+        <w:t>, which showed upregulation of OXCT1 protein in LCHF fed C57BL/6J muscles (BDH1 and SLC16A1 were not tested).  In our case we demonstrated downregulation of mRNA, so this could implicate translational regulation</w:t>
+      </w:r>
+      <w:r>
+        <w:t>, diet,</w:t>
+      </w:r>
+      <w:r>
+        <w:t xml:space="preserve"> or strain differences with respect to</w:t>
+      </w:r>
+      <w:r>
+        <w:t xml:space="preserve"> effects on</w:t>
+      </w:r>
+      <w:r>
+        <w:t xml:space="preserve"> OXCT1, but would not explain our observation of reduced ketone disposal (this was not reported in </w:t>
+      </w:r>
+      <w:r>
+        <w:fldChar w:fldCharType="begin"/>
+      </w:r>
+      <w:r>
+        <w:instrText xml:space="preserve"> ADDIN ZOTERO_ITEM CSL_CITATION {"citationID":"hOe74ue7","properties":{"formattedCitation":"[16]","plainCitation":"[16]","noteIndex":0},"citationItems":[{"id":189,"uris":["http://zotero.org/users/7317906/items/THMX4FYC"],"itemData":{"id":189,"type":"article-journal","abstract":"© 2017 the American Physiological Society.Low-carbohydrate/high-fat (LCHF) diets are increasingly popular dietary interventions for body weight control and as treatment for different pathological conditions. However, the mechanisms of action are still poorly understood, in particular, in long-term administration. Besides liver, brain, and heart, skeletal muscle is one of the major organs involved in the regulation of physiological and pathophysiological ketosis. We assessed the role of the peroxisome proliferator-activated receptor γ coactivator 1α (PGC-1α) in skeletal muscle of male wild-type control and PGC-1α muscle-specific knockout mice upon 12 wk of LCHF diet feeding. Interestingly, LCHF diet administration increased oxygen consumption in a muscle PGC-1α-dependent manner, concomitant with a blunted transcriptional induction of genes involved in fatty acid oxidation and impairment in exercise performance. These data reveal a new role for muscle PGC-1α in regulating the physiological adaptation to long-term LCHF diet administration.","container-title":"American Journal of Physiology-Endocrinology and Metabolism","DOI":"10.1152/ajpendo.00361.2016","ISSN":"0193-1849","issue":"5","note":"Citation Key: Schnyder2017a","page":"E437-E446","title":"Muscle PGC-1α is required for long-term systemic and local adaptations to a ketogenic diet in mice","volume":"312","author":[{"family":"Schnyder","given":"Svenia"},{"family":"Svensson","given":"Kristoffer"},{"family":"Cardel","given":"Bettina"},{"family":"Handschin","given":"Christoph"}],"issued":{"date-parts":[["2017"]]},"citation-key":"Schnyder2017a"}}],"schema":"https://github.com/citation-style-language/schema/raw/master/csl-citation.json"} </w:instrText>
+      </w:r>
+      <w:r>
+        <w:fldChar w:fldCharType="separate"/>
+      </w:r>
+      <w:r>
+        <w:rPr>
+          <w:noProof/>
+        </w:rPr>
+        <w:t>[16]</w:t>
+      </w:r>
+      <w:r>
+        <w:fldChar w:fldCharType="end"/>
+      </w:r>
+      <w:r>
+        <w:t xml:space="preserve">).  In terms of strain differences, we observed that the majority of DO mice experienced a decline in βHB disposal following the dietary intervention (n=35), but there was a subset of mice that exhibited an improvement in βHB disposal as assessed by KTT (n=10). </w:t>
+      </w:r>
+    </w:p>
+    <w:p/>
+    <w:p>
+      <w:r>
+        <w:t xml:space="preserve">Given the biochemical relationship between ketone body production, hepatic fatty acid oxidation, and cholesterol biogenesis, it was not surprising to find a potential relationship between these adaptations and cholesterol levels in these mice.  The reduction of ketone body disposal may be due to saturation kinetics in skeletal muscle. Prior research has demonstrated that the KB concentration-oxidation relationship may reach a saturating point between 1 and 2 mmol, as evidenced by studies involving fasting of various durations </w:t>
+      </w:r>
+      <w:r>
+        <w:fldChar w:fldCharType="begin"/>
+      </w:r>
+      <w:r>
+        <w:instrText xml:space="preserve"> ADDIN ZOTERO_ITEM CSL_CITATION {"citationID":"fNYo8xBO","properties":{"formattedCitation":"[6]","plainCitation":"[6]","noteIndex":0},"citationItems":[{"id":11458,"uris":["http://zotero.org/users/7317906/items/4L4ZNI6K"],"itemData":{"id":11458,"type":"article-journal","abstract":"Turnover studies performed during progressive fasting in normal subjects indicate that the production rate and the concentration of KB rise markedly during the early phase of fasting and start reaching a plateau after about 5 days. In addition to increased production, a reduction in the metabolic clearance rate of KB contributes to the hyperketonemia. This reduced metabolic clearance rate reflects essentially the progressive saturation of muscular ketone uptake that occurs with increasing ketonemia. The hormonal and metabolic environment of fasting plays only a minor role in this process, since a fall in KB metabolic clearance similar to that observed during fasting is observed if hyperketonemia is artificially induced in the postabsorptive state by the infusion of exogenous ketones. As extraction of KB by muscle becomes limited during ongoing fasting, KB are preferentially taken up by the brain to serve as a substrate replacing glucose. The remarkable stability of ketonemia during prolonged fasting is maintained through the operation of a negative feedback mechanism whereby KB tend to restrain their own production rate. The antilipolytic and insulinotropic effects of KB are instrumental in this process. This homeostatic mechanism maintains ketogenesis only slightly above the maximal metabolic disposal rate, the difference corresponding to urinary excretion, which is always below 10% of total turnover under physiologic conditions. When type I insulin-deprived diabetic patients are compared at the same KB concentration with control subjects with fasting ketosis, the characteristics of KB kinetics are comparable in the two groups. The maximal KB removal capacity is identical in the two situations, and it is not possible to identify a ketone removal defect specific to diabetes. Thus, these data favor the concept that excessive production of KB represent the main factor leading to uncontrolled hyperketonemia. It should be realized that a production exceeding only slightly that prevailing during prolonged fasting is sufficient to cause a progressive build-up in concentration, leading to uncontrolled diabetic ketosis. In the overnight-fasted state, a prolonged exercise (2 h) performed at moderate intensity (50% VO2 max) stimulates the capacity of muscle to extract ketones from blood as evidenced by a stimulation of the metabolic clearance rate.(ABSTRACT TRUNCATED AT 400 WORDS)","container-title":"Diabetes/Metabolism Reviews","DOI":"10.1002/dmr.5610050304","ISSN":"0742-4221","issue":"3","journalAbbreviation":"Diabetes Metab Rev","language":"eng","note":"PMID: 2656155","page":"247-270","source":"PubMed","title":"Ketone body production and disposal: effects of fasting, diabetes, and exercise","title-short":"Ketone body production and disposal","volume":"5","author":[{"family":"Balasse","given":"E. O."},{"family":"Féry","given":"F."}],"issued":{"date-parts":[["1989",5]]},"citation-key":"balasseKetoneBodyProduction1989"}}],"schema":"https://github.com/citation-style-language/schema/raw/master/csl-citation.json"} </w:instrText>
+      </w:r>
+      <w:r>
+        <w:fldChar w:fldCharType="separate"/>
+      </w:r>
+      <w:r>
+        <w:rPr>
+          <w:noProof/>
+        </w:rPr>
+        <w:t>[6]</w:t>
+      </w:r>
+      <w:r>
+        <w:fldChar w:fldCharType="end"/>
+      </w:r>
+      <w:r>
+        <w:t xml:space="preserve"> or step-wise βHB infusion </w:t>
+      </w:r>
+      <w:r>
+        <w:fldChar w:fldCharType="begin"/>
+      </w:r>
+      <w:r>
+        <w:instrText xml:space="preserve"> ADDIN ZOTERO_ITEM CSL_CITATION {"citationID":"9An3jUqU","properties":{"formattedCitation":"[14]","plainCitation":"[14]","noteIndex":0},"citationItems":[{"id":1376,"uris":["http://zotero.org/users/7317906/items/93QAPJUH"],"itemData":{"id":1376,"type":"article-journal","container-title":"The Journal of Clinical Endocrinology &amp; Metabolism","DOI":"10.1210/jc.2014-2608","ISSN":"0021-972X","issue":"2","page":"636-643","title":"Systemic, Cerebral and Skeletal Muscle Ketone Body and Energy Metabolism During Acute Hyper-D-β-Hydroxybutyratemia in Post-Absorptive Healthy Males","volume":"100","author":[{"family":"Mikkelsen","given":"Kristian H."},{"family":"Seifert","given":"Thomas"},{"family":"Secher","given":"Niels H."},{"family":"Grøndal","given":"Thomas"},{"family":"Hall","given":"Gerrit","non-dropping-particle":"van"}],"issued":{"date-parts":[["2015",2]]},"citation-key":"mikkelsenSystemicCerebralSkeletal2015"}}],"schema":"https://github.com/citation-style-language/schema/raw/master/csl-citation.json"} </w:instrText>
+      </w:r>
+      <w:r>
+        <w:fldChar w:fldCharType="separate"/>
+      </w:r>
+      <w:r>
+        <w:rPr>
+          <w:noProof/>
+        </w:rPr>
+        <w:t>[14]</w:t>
+      </w:r>
+      <w:r>
+        <w:fldChar w:fldCharType="end"/>
+      </w:r>
+      <w:r>
+        <w:t>.</w:t>
+      </w:r>
+    </w:p>
+    <w:p/>
+    <w:p>
+      <w:r>
+        <w:t xml:space="preserve">Prior research has shown that </w:t>
+      </w:r>
+      <w:r>
+        <w:t>knockout</w:t>
+      </w:r>
+      <w:r>
+        <w:t xml:space="preserve"> of </w:t>
+      </w:r>
+      <w:r>
+        <w:rPr>
+          <w:i/>
+          <w:iCs/>
+        </w:rPr>
+        <w:t>Ppargc1a</w:t>
+      </w:r>
+      <w:r>
+        <w:t xml:space="preserve"> results in modestly lowered expression of BDH1, OXCT1 and ACAT1 in skeletal muscle, brain</w:t>
+      </w:r>
+      <w:r>
+        <w:t>,</w:t>
+      </w:r>
+      <w:r>
+        <w:t xml:space="preserve"> and kidneys</w:t>
+      </w:r>
+      <w:r>
+        <w:t>, along with decreased expression of MCT1 SLC16A1</w:t>
+      </w:r>
+      <w:r>
+        <w:t xml:space="preserve"> </w:t>
+      </w:r>
+      <w:r>
+        <w:fldChar w:fldCharType="begin"/>
+      </w:r>
+      <w:r>
+        <w:instrText xml:space="preserve"> ADDIN ZOTERO_ITEM CSL_CITATION {"citationID":"3fvXl43m","properties":{"formattedCitation":"[12]","plainCitation":"[12]","noteIndex":0},"citationItems":[{"id":1369,"uris":["http://zotero.org/users/7317906/items/WP3436XD"],"itemData":{"id":1369,"type":"article-journal","abstract":"Ketone bodies (KBs) are crucial energy substrates during states of low carbohydrate availability. However, an aberrant regulation of KB homeostasis can lead to complications such as diabetic ketoacidosis. Exercise and diabetes affect systemic KB homeostasis, but the regulation of KB metabolism is still enigmatic. In our study in mice with either knockout or overexpression of the peroxisome proliferator-activated receptor-γ coactivator (PGC)-1α in skeletal muscle, PGC-1α regulated ketolytic gene transcription in muscle. Furthermore, KB homeostasis of these mice was investigated during withholding of food, exercise, and ketogenic diet feeding, and after streptozotocin injection. In response to these ketogenic stimuli, modulation of PGC-1α levels in muscle affected systemic KB homeostasis. Moreover, the data demonstrate that skeletal muscle PGC-1α is necessary for the enhanced ketolytic capacity in response to exercise training and overexpression of PGC-1α in muscle enhances systemic ketolytic capacity and is sufficient to ameliorate diabetic hyperketonemia in mice. In cultured myotubes, the transcription factor estrogen-related receptor-α was a partner of PGC-1α in the regulation of ketolytic gene transcription. These results demonstrate a central role of skeletal muscle PGC-1α in the transcriptional regulation of systemic ketolytic capacity.-Svensson, K., Albert, V., Cardel, B., Salatino, S., Handschin, C. Skeletal muscle PGC-1α modulates systemic ketone body homeostasis and ameliorates diabetic hyperketonemia in mice.","container-title":"FASEB Journal","DOI":"10.1096/fj.201500128","ISSN":"15306860","issue":"5","note":"PMID: 26849960\nCitation Key: Svensson2016","page":"1976-1986","title":"Skeletal muscle PGC-1a modulates systemic ketone body homeostasis and ameliorates diabetic hyperketonemia in mice","volume":"30","author":[{"family":"Svensson","given":"Kristoffer"},{"family":"Albert","given":"Verena"},{"family":"Cardel","given":"Bettina"},{"family":"Salatino","given":"Silvia"},{"family":"Handschin","given":"Christoph"}],"issued":{"date-parts":[["2016"]]},"citation-key":"Svensson2016"}}],"schema":"https://github.com/citation-style-language/schema/raw/master/csl-citation.json"} </w:instrText>
+      </w:r>
+      <w:r>
+        <w:fldChar w:fldCharType="separate"/>
+      </w:r>
+      <w:r>
+        <w:rPr>
+          <w:noProof/>
+        </w:rPr>
+        <w:t>[12]</w:t>
+      </w:r>
+      <w:r>
+        <w:fldChar w:fldCharType="end"/>
+      </w:r>
+      <w:r>
+        <w:t xml:space="preserve">.  This was concordant with impaired ketone body disposal by a similar assay </w:t>
+      </w:r>
+      <w:r>
+        <w:fldChar w:fldCharType="begin"/>
+      </w:r>
+      <w:r>
+        <w:instrText xml:space="preserve"> ADDIN ZOTERO_ITEM CSL_CITATION {"citationID":"3fvXl43m","properties":{"formattedCitation":"[12]","plainCitation":"[12]","noteIndex":0},"citationItems":[{"id":1369,"uris":["http://zotero.org/users/7317906/items/WP3436XD"],"itemData":{"id":1369,"type":"article-journal","abstract":"Ketone bodies (KBs) are crucial energy substrates during states of low carbohydrate availability. However, an aberrant regulation of KB homeostasis can lead to complications such as diabetic ketoacidosis. Exercise and diabetes affect systemic KB homeostasis, but the regulation of KB metabolism is still enigmatic. In our study in mice with either knockout or overexpression of the peroxisome proliferator-activated receptor-γ coactivator (PGC)-1α in skeletal muscle, PGC-1α regulated ketolytic gene transcription in muscle. Furthermore, KB homeostasis of these mice was investigated during withholding of food, exercise, and ketogenic diet feeding, and after streptozotocin injection. In response to these ketogenic stimuli, modulation of PGC-1α levels in muscle affected systemic KB homeostasis. Moreover, the data demonstrate that skeletal muscle PGC-1α is necessary for the enhanced ketolytic capacity in response to exercise training and overexpression of PGC-1α in muscle enhances systemic ketolytic capacity and is sufficient to ameliorate diabetic hyperketonemia in mice. In cultured myotubes, the transcription factor estrogen-related receptor-α was a partner of PGC-1α in the regulation of ketolytic gene transcription. These results demonstrate a central role of skeletal muscle PGC-1α in the transcriptional regulation of systemic ketolytic capacity.-Svensson, K., Albert, V., Cardel, B., Salatino, S., Handschin, C. Skeletal muscle PGC-1α modulates systemic ketone body homeostasis and ameliorates diabetic hyperketonemia in mice.","container-title":"FASEB Journal","DOI":"10.1096/fj.201500128","ISSN":"15306860","issue":"5","note":"PMID: 26849960\nCitation Key: Svensson2016","page":"1976-1986","title":"Skeletal muscle PGC-1a modulates systemic ketone body homeostasis and ameliorates diabetic hyperketonemia in mice","volume":"30","author":[{"family":"Svensson","given":"Kristoffer"},{"family":"Albert","given":"Verena"},{"family":"Cardel","given":"Bettina"},{"family":"Salatino","given":"Silvia"},{"family":"Handschin","given":"Christoph"}],"issued":{"date-parts":[["2016"]]},"citation-key":"Svensson2016"}}],"schema":"https://github.com/citation-style-language/schema/raw/master/csl-citation.json"} </w:instrText>
+      </w:r>
+      <w:r>
+        <w:fldChar w:fldCharType="separate"/>
+      </w:r>
+      <w:r>
+        <w:rPr>
+          <w:noProof/>
+        </w:rPr>
+        <w:t>[12]</w:t>
+      </w:r>
+      <w:r>
+        <w:fldChar w:fldCharType="end"/>
+      </w:r>
+      <w:r>
+        <w:t xml:space="preserve">.  The converse was also true with muscle transgenic overexpression of PGC1A resulting in </w:t>
+      </w:r>
+      <w:r>
+        <w:t>induction</w:t>
+      </w:r>
+      <w:r>
+        <w:t xml:space="preserve"> of Bdh1, Oxct1, Slc16a1</w:t>
+      </w:r>
+      <w:r>
+        <w:t>,</w:t>
+      </w:r>
+      <w:r>
+        <w:t xml:space="preserve"> and Acat1 and improved ketone body disposal </w:t>
+      </w:r>
+      <w:r>
+        <w:fldChar w:fldCharType="begin"/>
+      </w:r>
+      <w:r>
+        <w:instrText xml:space="preserve"> ADDIN ZOTERO_ITEM CSL_CITATION {"citationID":"hHk7XMf0","properties":{"formattedCitation":"[12]","plainCitation":"[12]","noteIndex":0},"citationItems":[{"id":1369,"uris":["http://zotero.org/users/7317906/items/WP3436XD"],"itemData":{"id":1369,"type":"article-journal","abstract":"Ketone bodies (KBs) are crucial energy substrates during states of low carbohydrate availability. However, an aberrant regulation of KB homeostasis can lead to complications such as diabetic ketoacidosis. Exercise and diabetes affect systemic KB homeostasis, but the regulation of KB metabolism is still enigmatic. In our study in mice with either knockout or overexpression of the peroxisome proliferator-activated receptor-γ coactivator (PGC)-1α in skeletal muscle, PGC-1α regulated ketolytic gene transcription in muscle. Furthermore, KB homeostasis of these mice was investigated during withholding of food, exercise, and ketogenic diet feeding, and after streptozotocin injection. In response to these ketogenic stimuli, modulation of PGC-1α levels in muscle affected systemic KB homeostasis. Moreover, the data demonstrate that skeletal muscle PGC-1α is necessary for the enhanced ketolytic capacity in response to exercise training and overexpression of PGC-1α in muscle enhances systemic ketolytic capacity and is sufficient to ameliorate diabetic hyperketonemia in mice. In cultured myotubes, the transcription factor estrogen-related receptor-α was a partner of PGC-1α in the regulation of ketolytic gene transcription. These results demonstrate a central role of skeletal muscle PGC-1α in the transcriptional regulation of systemic ketolytic capacity.-Svensson, K., Albert, V., Cardel, B., Salatino, S., Handschin, C. Skeletal muscle PGC-1α modulates systemic ketone body homeostasis and ameliorates diabetic hyperketonemia in mice.","container-title":"FASEB Journal","DOI":"10.1096/fj.201500128","ISSN":"15306860","issue":"5","note":"PMID: 26849960\nCitation Key: Svensson2016","page":"1976-1986","title":"Skeletal muscle PGC-1a modulates systemic ketone body homeostasis and ameliorates diabetic hyperketonemia in mice","volume":"30","author":[{"family":"Svensson","given":"Kristoffer"},{"family":"Albert","given":"Verena"},{"family":"Cardel","given":"Bettina"},{"family":"Salatino","given":"Silvia"},{"family":"Handschin","given":"Christoph"}],"issued":{"date-parts":[["2016"]]},"citation-key":"Svensson2016"}}],"schema":"https://github.com/citation-style-language/schema/raw/master/csl-citation.json"} </w:instrText>
+      </w:r>
+      <w:r>
+        <w:fldChar w:fldCharType="separate"/>
+      </w:r>
+      <w:r>
+        <w:rPr>
+          <w:noProof/>
+        </w:rPr>
+        <w:t>[12]</w:t>
+      </w:r>
+      <w:r>
+        <w:fldChar w:fldCharType="end"/>
+      </w:r>
+      <w:r>
+        <w:t>. It is possible that PGC1</w:t>
       </w:r>
       <w:r>
         <w:rPr>
           <w:rFonts w:ascii="Symbol" w:hAnsi="Symbol"/>
         </w:rPr>
-        <w:t></w:t>
-      </w:r>
-      <w:r>
-        <w:rPr>
-          <w:rFonts w:ascii="Symbol" w:hAnsi="Symbol"/>
-        </w:rPr>
-        <w:t></w:t>
-      </w:r>
-      <w:r>
-        <w:t xml:space="preserve">Ct method.  For </w:t>
+        <w:t xml:space="preserve">a/b </w:t>
+      </w:r>
+      <w:r>
+        <w:t xml:space="preserve">is downstream of mTORC1 in muscle.  In the muscle </w:t>
+      </w:r>
+      <w:r>
+        <w:rPr>
+          <w:i/>
+          <w:iCs/>
+        </w:rPr>
+        <w:t>Tsc1</w:t>
+      </w:r>
+      <w:r>
+        <w:t xml:space="preserve"> </w:t>
+      </w:r>
+      <w:r>
+        <w:t>KO</w:t>
+      </w:r>
+      <w:r>
+        <w:t xml:space="preserve"> data we describe a 34% reduction in </w:t>
+      </w:r>
+      <w:r>
+        <w:rPr>
+          <w:i/>
+          <w:iCs/>
+        </w:rPr>
+        <w:t>Ppargc1a</w:t>
+      </w:r>
+      <w:r>
+        <w:t xml:space="preserve"> mRNA, but a 1.5x increase in </w:t>
+      </w:r>
+      <w:r>
+        <w:rPr>
+          <w:i/>
+          <w:iCs/>
+        </w:rPr>
+        <w:t>Ppargc1b</w:t>
+      </w:r>
+      <w:r>
+        <w:t xml:space="preserve"> mRNA.</w:t>
+      </w:r>
+      <w:r>
+        <w:t xml:space="preserve">  </w:t>
+      </w:r>
+      <w:r>
+        <w:t>Because</w:t>
+      </w:r>
+      <w:r>
+        <w:t xml:space="preserve"> the downstream PGC1a targets are more relevant, we used </w:t>
       </w:r>
       <w:proofErr w:type="spellStart"/>
       <w:r>
-        <w:t>RNAseq</w:t>
+        <w:t>Harmonizome</w:t>
       </w:r>
       <w:proofErr w:type="spellEnd"/>
       <w:r>
-        <w:t>, data was re-</w:t>
-      </w:r>
-      <w:r>
-        <w:t xml:space="preserve">analyzed </w:t>
-      </w:r>
-      <w:r>
-        <w:t>reanalyzed</w:t>
-      </w:r>
-      <w:r>
-        <w:t xml:space="preserve"> from </w:t>
-      </w:r>
-      <w:r>
-        <w:t>GSE84312</w:t>
+        <w:t xml:space="preserve"> to identify canonical Ppargc1a targets from </w:t>
+      </w:r>
+      <w:r>
+        <w:t xml:space="preserve">ENCODE </w:t>
+      </w:r>
+      <w:proofErr w:type="spellStart"/>
+      <w:r>
+        <w:t>ChIPseq</w:t>
+      </w:r>
+      <w:proofErr w:type="spellEnd"/>
+      <w:r>
+        <w:t xml:space="preserve"> datasets and contrasted those with differentially expressed genes from muscle </w:t>
+      </w:r>
+      <w:r>
+        <w:rPr>
+          <w:i/>
+          <w:iCs/>
+        </w:rPr>
+        <w:t>Tsc1</w:t>
       </w:r>
       <w:r>
         <w:t xml:space="preserve"> </w:t>
       </w:r>
       <w:r>
-        <w:fldChar w:fldCharType="begin"/>
-      </w:r>
-      <w:r>
-        <w:instrText xml:space="preserve"> ADDIN ZOTERO_ITEM CSL_CITATION {"citationID":"d7lwcXVd","properties":{"formattedCitation":"[19]","plainCitation":"[19]","noteIndex":0},"citationItems":[{"id":8736,"uris":["http://zotero.org/users/7317906/items/S4YYE9R2"],"itemData":{"id":8736,"type":"article-journal","container-title":"bioRxiv","DOI":"10.1101/720540","note":"Citation Key: Stephenson2019","title":"Skeletal Muscle mTORC1 Activation Increases Energy Expenditure and Reduces Longevity in Mice","URL":"http://dx.doi.org/10.1101/720540","author":[{"family":"Stephenson","given":"Erin J."},{"family":"Redd","given":"JeAnna R."},{"family":"Snyder","given":"Detrick S."},{"family":"Tran","given":"Quynh T."},{"family":"Lu","given":"Binbin"},{"family":"Peloquin","given":"Matthew J."},{"family":"Mulcahy","given":"Molly C."},{"family":"Harvey","given":"Innocence"},{"family":"Fisher","given":"Kaleigh"},{"family":"Han","given":"Joan C."},{"family":"Qi","given":"Nathan"},{"family":"Saltiel","given":"Alan R."},{"family":"Bridges","given":"Dave"}],"issued":{"date-parts":[["2019"]]},"citation-key":"Stephenson2019"}}],"schema":"https://github.com/citation-style-language/schema/raw/master/csl-citation.json"} </w:instrText>
-      </w:r>
-      <w:r>
-        <w:fldChar w:fldCharType="separate"/>
-      </w:r>
-      <w:r>
-        <w:rPr>
-          <w:noProof/>
-        </w:rPr>
-        <w:t>[19]</w:t>
-      </w:r>
-      <w:r>
-        <w:fldChar w:fldCharType="end"/>
+        <w:t>KO</w:t>
+      </w:r>
+      <w:r>
+        <w:t xml:space="preserve"> mice.  Only 4</w:t>
+      </w:r>
+      <w:r>
+        <w:t xml:space="preserve"> of</w:t>
+      </w:r>
+      <w:r>
+        <w:t>28 of these genes were differentially expressed in muscles, lower than what would be predicted by chance.</w:t>
+      </w:r>
+    </w:p>
+    <w:p/>
+    <w:p>
+      <w:r>
+        <w:t xml:space="preserve">As it relates to other aspects of physiology in the carbohydrate reduced state, this was to our knowledge the first report of diversity outbred mice and ketone disposal analysis, and we evaluated if this was associated with other relevant traits.  Our results of lowered ketone body disposal suggested a reduction in ketogenesis over this </w:t>
+      </w:r>
+      <w:proofErr w:type="gramStart"/>
+      <w:r>
+        <w:t>period, and</w:t>
+      </w:r>
+      <w:proofErr w:type="gramEnd"/>
+      <w:r>
+        <w:t xml:space="preserve"> given the biochemical overlap between cholesterol synthesis and ketone body synthesis pathways it is not surprising that impaired ketone disposal might be associated with elevated cholesterol, but more data is needed to be confident of this hypothesis. </w:t>
+      </w:r>
+    </w:p>
+    <w:p/>
+    <w:p>
+      <w:r>
+        <w:t xml:space="preserve">There are several limitations to the present study.  While this study was done in a diverse set of mice, it is plausible that ketone disposal may differ in humans, as may their relationships with cholesterol and energy metabolism.  Our approach was to investigate the short-term disposal of a supraphysiological bolus of </w:t>
+      </w:r>
+      <w:r>
+        <w:t>β</w:t>
+      </w:r>
+      <w:r>
+        <w:t xml:space="preserve">HB which again may have different kinetics than elevated steady state levels of ketone bodies.  Based on our pilot study of 43 mice we estimate this study is only powered to be able to detect correlations of r&gt;0.55 between two correlated but independent variables.  Finally, we do not yet know the mechanism by which skeletal muscle </w:t>
+      </w:r>
+      <w:r>
+        <w:rPr>
+          <w:i/>
+          <w:iCs/>
+        </w:rPr>
+        <w:lastRenderedPageBreak/>
+        <w:t>Tsc1</w:t>
+      </w:r>
+      <w:r>
+        <w:t xml:space="preserve"> ablation or mTORC1 activation causes transcriptional changes in ketone body disposal.  In our case our assay measured total body ketone disposal, so we do not know that ketone disposal is primarily or exclusively modified in skeletal muscle or also in other tissues.</w:t>
+      </w:r>
+    </w:p>
+    <w:p/>
+    <w:p>
+      <w:pPr>
+        <w:spacing w:line="259" w:lineRule="auto"/>
+      </w:pPr>
+      <w:r>
+        <w:t xml:space="preserve">These findings underscore the necessity for continued in-depth and comprehensive exploration into the factors influencing KB catabolism, including its potential associations with elevated cholesterol.  Ketolysis may be influenced by a range of variables, including genetic predispositions, metabolic states, and environmental factors.  Based on this research, further investigations are warranted to dissect the molecular pathways, signaling cascades, and genetic factors that contribute to the observed variations in ketone disposal, with the </w:t>
+      </w:r>
+      <w:proofErr w:type="gramStart"/>
+      <w:r>
+        <w:t>ultimate goal</w:t>
+      </w:r>
+      <w:proofErr w:type="gramEnd"/>
+      <w:r>
+        <w:t xml:space="preserve"> of refining our understanding of the interplay between mTORC1 activation and ketogenic dietary interventions. Such insights may pave the way for personalized therapeutic strategies that consider individual differences in responding to interventions aimed at modulating ketone metabolism.</w:t>
+      </w:r>
+    </w:p>
+    <w:p>
+      <w:pPr>
+        <w:pStyle w:val="Heading1"/>
+      </w:pPr>
+      <w:r>
+        <w:t>ACKNOWLEGEMENTS</w:t>
+      </w:r>
+    </w:p>
+    <w:p>
+      <w:r>
+        <w:t>This work was funded by R01 DK107535 from the NIH (DB), and Pilot and Feasibility Grants from The Jackson Laboratories and the Michigan Diabetes Research Center (</w:t>
+      </w:r>
+      <w:r>
+        <w:t>RRID:SCR_015112</w:t>
+      </w:r>
+      <w:r>
+        <w:t xml:space="preserve">, supported by </w:t>
+      </w:r>
+      <w:r>
+        <w:t>P30</w:t>
+      </w:r>
+      <w:r>
+        <w:t xml:space="preserve"> </w:t>
+      </w:r>
+      <w:r>
+        <w:t>DK020572</w:t>
+      </w:r>
+      <w:r>
+        <w:t>, awarded</w:t>
+      </w:r>
+      <w:r>
+        <w:t xml:space="preserve"> to DB)</w:t>
+      </w:r>
+      <w:r>
+        <w:t xml:space="preserve"> and core services provided by the Michigan Nutrition and Obesity Research Center (</w:t>
+      </w:r>
+      <w:r>
+        <w:t>RRID:SCR_015457</w:t>
+      </w:r>
+      <w:r>
+        <w:t>, supported by P30</w:t>
+      </w:r>
+      <w:r>
+        <w:t xml:space="preserve"> </w:t>
+      </w:r>
+      <w:r>
+        <w:t>DK89503)</w:t>
+      </w:r>
+      <w:r>
+        <w:t xml:space="preserve"> and Mouse Metabolic Phenotyping Center in Live Animals (supported by </w:t>
+      </w:r>
+      <w:r>
+        <w:t>U2C</w:t>
+      </w:r>
+      <w:r>
+        <w:t xml:space="preserve"> </w:t>
+      </w:r>
+      <w:r>
+        <w:t>DK135066</w:t>
+      </w:r>
+      <w:r>
+        <w:t>)</w:t>
+      </w:r>
+      <w:r>
+        <w:t xml:space="preserve">. TC was supported by the University of Michigan Undergraduate Research Program (UROP). </w:t>
+      </w:r>
+      <w:r>
+        <w:t xml:space="preserve">  We would also like to thank Dr. Charles </w:t>
+      </w:r>
+      <w:proofErr w:type="spellStart"/>
+      <w:r>
+        <w:t>Burant</w:t>
+      </w:r>
+      <w:proofErr w:type="spellEnd"/>
+      <w:r>
+        <w:t xml:space="preserve"> and </w:t>
+      </w:r>
+      <w:r>
+        <w:t xml:space="preserve">the other </w:t>
+      </w:r>
+      <w:r>
+        <w:t>members of the Bridges Laboratory for helpful discussions over the course of this project.</w:t>
+      </w:r>
+    </w:p>
+    <w:p/>
+    <w:p>
+      <w:pPr>
+        <w:pStyle w:val="Heading1"/>
+      </w:pPr>
+      <w:r>
+        <w:t>COMPETING INTERESTS</w:t>
+      </w:r>
+    </w:p>
+    <w:p>
+      <w:r>
+        <w:t>The authors have no conflicts of interest to declare</w:t>
       </w:r>
       <w:r>
         <w:t>.</w:t>
@@ -1493,213 +3393,15 @@
     <w:p/>
     <w:p>
       <w:pPr>
-        <w:pStyle w:val="Heading2"/>
-      </w:pPr>
-      <w:r>
-        <w:t>Cholesterol Analyses</w:t>
-      </w:r>
-    </w:p>
-    <w:p>
-      <w:r>
-        <w:t>Total c</w:t>
-      </w:r>
-      <w:r>
-        <w:t xml:space="preserve">holesterol concentration was determined </w:t>
-      </w:r>
-      <w:proofErr w:type="spellStart"/>
-      <w:r>
-        <w:t>colorimetrically</w:t>
-      </w:r>
-      <w:proofErr w:type="spellEnd"/>
-      <w:r>
-        <w:t xml:space="preserve"> from serum blood samples, using the Infinity Cholesterol Reagent kit (</w:t>
-      </w:r>
-      <w:proofErr w:type="spellStart"/>
-      <w:r>
-        <w:t>Thermo</w:t>
-      </w:r>
-      <w:proofErr w:type="spellEnd"/>
-      <w:r>
-        <w:t xml:space="preserve"> </w:t>
-      </w:r>
-      <w:r>
-        <w:t>Scientific c</w:t>
-      </w:r>
-      <w:r>
-        <w:t>at</w:t>
-      </w:r>
-      <w:r>
-        <w:t xml:space="preserve"> </w:t>
-      </w:r>
-      <w:r>
-        <w:t xml:space="preserve"># TR13421). Following the manufacturer's instructions, 100 </w:t>
-      </w:r>
-      <w:proofErr w:type="spellStart"/>
-      <w:r>
-        <w:t>uL</w:t>
-      </w:r>
-      <w:proofErr w:type="spellEnd"/>
-      <w:r>
-        <w:t xml:space="preserve"> of cholesterol reagent and 2uL serum were added to a clear 96-well </w:t>
-      </w:r>
-      <w:r>
-        <w:t>plate and</w:t>
-      </w:r>
-      <w:r>
-        <w:t xml:space="preserve"> incubated for 15 minutes at room temperature. Absorbance values were calculated via a standard curve.  Each sample was measured in duplicate. The plate was then read on </w:t>
-      </w:r>
-      <w:r>
-        <w:t xml:space="preserve">a Molecular Devices </w:t>
-      </w:r>
-      <w:proofErr w:type="spellStart"/>
-      <w:r>
-        <w:t>Spectramax</w:t>
-      </w:r>
-      <w:proofErr w:type="spellEnd"/>
-      <w:r>
-        <w:t xml:space="preserve"> Plus </w:t>
-      </w:r>
-      <w:r>
-        <w:t xml:space="preserve">model plate reader using </w:t>
-      </w:r>
-      <w:proofErr w:type="spellStart"/>
-      <w:r>
-        <w:t>SoftMaxPro</w:t>
-      </w:r>
-      <w:proofErr w:type="spellEnd"/>
-      <w:r>
-        <w:t xml:space="preserve"> 5.3 at 490 nm.</w:t>
-      </w:r>
-    </w:p>
-    <w:p/>
-    <w:p>
-      <w:pPr>
-        <w:pStyle w:val="Heading2"/>
-      </w:pPr>
-      <w:r>
-        <w:t>Statistical Analys</w:t>
-      </w:r>
-      <w:r>
-        <w:t>e</w:t>
-      </w:r>
-      <w:r>
-        <w:t>s</w:t>
-      </w:r>
-    </w:p>
-    <w:p>
-      <w:r>
-        <w:t xml:space="preserve">All statistical analyses </w:t>
-      </w:r>
-      <w:r>
-        <w:t>were performed</w:t>
-      </w:r>
-      <w:r>
-        <w:t xml:space="preserve"> using R version 4.2.2</w:t>
-      </w:r>
-      <w:r>
-        <w:t xml:space="preserve"> </w:t>
-      </w:r>
-      <w:r>
-        <w:fldChar w:fldCharType="begin"/>
-      </w:r>
-      <w:r>
-        <w:instrText xml:space="preserve"> ADDIN ZOTERO_ITEM CSL_CITATION {"citationID":"VWxlBSMf","properties":{"formattedCitation":"[20]","plainCitation":"[20]","noteIndex":0},"citationItems":[{"id":8230,"uris":["http://zotero.org/users/7317906/items/3HZT7KXK"],"itemData":{"id":8230,"type":"document","note":"Citation Key: base\npublisher-place: Vienna, Austria","publisher":"R Foundation for Statistical Computing","title":"R: A Language and Environment for Statistical Computing","URL":"http://www.r-project.org/","author":[{"literal":"R Core Team"}],"accessed":{"date-parts":[["2010",10,22]]},"issued":{"date-parts":[["2019"]]},"citation-key":"base"}}],"schema":"https://github.com/citation-style-language/schema/raw/master/csl-citation.json"} </w:instrText>
-      </w:r>
-      <w:r>
-        <w:fldChar w:fldCharType="separate"/>
-      </w:r>
-      <w:r>
-        <w:rPr>
-          <w:noProof/>
-        </w:rPr>
-        <w:t>[20]</w:t>
-      </w:r>
-      <w:r>
-        <w:fldChar w:fldCharType="end"/>
-      </w:r>
-      <w:r>
-        <w:t xml:space="preserve"> (</w:t>
-      </w:r>
-      <w:r>
-        <w:t>RRID:SCR_001905</w:t>
-      </w:r>
-      <w:r>
-        <w:t>)</w:t>
-      </w:r>
-      <w:r>
-        <w:t>.</w:t>
-      </w:r>
-      <w:r>
-        <w:t xml:space="preserve"> </w:t>
-      </w:r>
-      <w:r>
-        <w:t>We set statistical significance for this study at 0.05.  For pairwise testing, we first tested for normality via Shapiro Wilk tests, and then</w:t>
-      </w:r>
-      <w:r>
-        <w:t xml:space="preserve"> equal variance using Levene’s test.  On this basis either Mann-Whitney, Welch’s or Student’s </w:t>
-      </w:r>
-      <w:r>
-        <w:rPr>
-          <w:i/>
-        </w:rPr>
-        <w:t>t</w:t>
-      </w:r>
-      <w:r>
-        <w:t xml:space="preserve"> tests were performed</w:t>
-      </w:r>
-      <w:r>
-        <w:t xml:space="preserve"> as noted in the text and figure legends</w:t>
-      </w:r>
-      <w:r>
-        <w:t xml:space="preserve">.  For longitudinal data, including </w:t>
-      </w:r>
-      <w:r>
-        <w:t>β</w:t>
-      </w:r>
-      <w:r>
-        <w:t xml:space="preserve">HB tolerance tests we constructed mixed linear models using the lme4 package (version 3.1; </w:t>
-      </w:r>
-      <w:r>
-        <w:fldChar w:fldCharType="begin"/>
-      </w:r>
-      <w:r>
-        <w:instrText xml:space="preserve"> ADDIN ZOTERO_ITEM CSL_CITATION {"citationID":"Jas1zZ8f","properties":{"formattedCitation":"[21]","plainCitation":"[21]","noteIndex":0},"citationItems":[{"id":66,"uris":["http://zotero.org/users/7317906/items/2P2DMJ4L"],"itemData":{"id":66,"type":"article-journal","abstract":"Maximum likelihood or restricted maximum likelihood (REML) estimates of the parameters in linear mixed-effects models can be determined using the lmer function in the lme4 package for R. As for most model-fitting functions in R, the model is described in an lmer call by a formula, in this case including both fixed- and random-effects terms. The formula and data together determine a numerical representation of the model from which the profiled deviance or the profiled REML criterion can be evaluated as a function of some of the model parameters. The appropriate criterion is optimized, using one of the constrained optimization functions in R, to provide the parameter estimates. We describe the structure of the model, the steps in evaluating the profiled deviance or REML criterion, and the structure of classes or types that represents such a model. Sufficient detail is included to allow specialization of these structures by users who wish to write functions to fit specialized linear mixed models, such as models incorporating pedigrees or smoothing splines, that are not easily expressible in the formula language used by lmer.","container-title":"Journal of Statistical Software","DOI":"10.18637/jss.v067.i01","ISSN":"1548-7660","language":"en","license":"Copyright (c) 2015 Douglas Bates, Martin Mächler, Ben Bolker, Steve Walker","page":"1-48","source":"www.jstatsoft.org","title":"Fitting Linear Mixed-Effects Models Using lme4","volume":"67","author":[{"family":"Bates","given":"Douglas"},{"family":"Mächler","given":"Martin"},{"family":"Bolker","given":"Ben"},{"family":"Walker","given":"Steve"}],"issued":{"date-parts":[["2015",10,7]]},"citation-key":"batesFittingLinearMixedEffects2015"}}],"schema":"https://github.com/citation-style-language/schema/raw/master/csl-citation.json"} </w:instrText>
-      </w:r>
-      <w:r>
-        <w:fldChar w:fldCharType="separate"/>
-      </w:r>
-      <w:r>
-        <w:rPr>
-          <w:noProof/>
-        </w:rPr>
-        <w:t>[21]</w:t>
-      </w:r>
-      <w:r>
-        <w:fldChar w:fldCharType="end"/>
-      </w:r>
-      <w:r>
-        <w:t xml:space="preserve">).  The repeated measure (random intercept) was the animal, and </w:t>
-      </w:r>
-      <w:r>
-        <w:t>C</w:t>
-      </w:r>
-      <w:r>
-        <w:t xml:space="preserve">hi-squared tests were performed comparing models with and without diet terms.  For experiments with both rodent sexes, we first tested for modification by sex using the interaction terms from a 2x2 ANOVA, and </w:t>
-      </w:r>
-      <w:r>
-        <w:t>if significant reported this effect</w:t>
-      </w:r>
-      <w:r>
-        <w:t xml:space="preserve"> while also stratifying by sex</w:t>
-      </w:r>
-      <w:r>
-        <w:t xml:space="preserve"> and reporting those results</w:t>
-      </w:r>
-      <w:r>
-        <w:t>.</w:t>
-      </w:r>
-      <w:r>
-        <w:t xml:space="preserve">  All raw data and code for this study are available at </w:t>
+        <w:pStyle w:val="Heading1"/>
+      </w:pPr>
+      <w:r>
+        <w:t>DATA AVAILABILITY STATEMENT</w:t>
+      </w:r>
+    </w:p>
+    <w:p>
+      <w:r>
+        <w:t xml:space="preserve">All raw data and code for this study are available at </w:t>
       </w:r>
       <w:hyperlink r:id="rId6" w:history="1">
         <w:r>
@@ -1714,1459 +3416,6 @@
       </w:r>
     </w:p>
     <w:p>
-      <w:pPr>
-        <w:pStyle w:val="Heading1"/>
-      </w:pPr>
-      <w:r>
-        <w:t>RESULTS</w:t>
-      </w:r>
-      <w:r>
-        <w:br/>
-      </w:r>
-    </w:p>
-    <w:p>
-      <w:pPr>
-        <w:pStyle w:val="Heading2"/>
-      </w:pPr>
-      <w:r>
-        <w:t xml:space="preserve">mTORC1 </w:t>
-      </w:r>
-      <w:r>
-        <w:t>Activity Increases the</w:t>
-      </w:r>
-      <w:r>
-        <w:t xml:space="preserve"> </w:t>
-      </w:r>
-      <w:r>
-        <w:t>E</w:t>
-      </w:r>
-      <w:r>
-        <w:t xml:space="preserve">xpression of </w:t>
-      </w:r>
-      <w:r>
-        <w:t>K</w:t>
-      </w:r>
-      <w:r>
-        <w:t xml:space="preserve">etolysis </w:t>
-      </w:r>
-      <w:r>
-        <w:t>G</w:t>
-      </w:r>
-      <w:r>
-        <w:t>enes</w:t>
-      </w:r>
-    </w:p>
-    <w:p>
-      <w:r>
-        <w:t xml:space="preserve">While evaluating factors that affect skeletal muscle expression, we noted that several ketolytic genes were elevated in skeletal muscle </w:t>
-      </w:r>
-      <w:r>
-        <w:rPr>
-          <w:i/>
-          <w:iCs/>
-        </w:rPr>
-        <w:t>Tsc1</w:t>
-      </w:r>
-      <w:r>
-        <w:t xml:space="preserve"> </w:t>
-      </w:r>
-      <w:r>
-        <w:t>KO</w:t>
-      </w:r>
-      <w:r>
-        <w:t xml:space="preserve"> mice</w:t>
-      </w:r>
-      <w:r>
-        <w:t xml:space="preserve"> (Figure 1A)</w:t>
-      </w:r>
-      <w:r>
-        <w:t xml:space="preserve">.  These mice, due to the deletion of the negative regulator TSC1, have elevated mTORC1 signaling </w:t>
-      </w:r>
-      <w:r>
-        <w:fldChar w:fldCharType="begin"/>
-      </w:r>
-      <w:r>
-        <w:instrText xml:space="preserve"> ADDIN ZOTERO_ITEM CSL_CITATION {"citationID":"hpc2Z4vV","properties":{"formattedCitation":"[19,22,23]","plainCitation":"[19,22,23]","noteIndex":0},"citationItems":[{"id":8736,"uris":["http://zotero.org/users/7317906/items/S4YYE9R2"],"itemData":{"id":8736,"type":"article-journal","container-title":"bioRxiv","DOI":"10.1101/720540","note":"Citation Key: Stephenson2019","title":"Skeletal Muscle mTORC1 Activation Increases Energy Expenditure and Reduces Longevity in Mice","URL":"http://dx.doi.org/10.1101/720540","author":[{"family":"Stephenson","given":"Erin J."},{"family":"Redd","given":"JeAnna R."},{"family":"Snyder","given":"Detrick S."},{"family":"Tran","given":"Quynh T."},{"family":"Lu","given":"Binbin"},{"family":"Peloquin","given":"Matthew J."},{"family":"Mulcahy","given":"Molly C."},{"family":"Harvey","given":"Innocence"},{"family":"Fisher","given":"Kaleigh"},{"family":"Han","given":"Joan C."},{"family":"Qi","given":"Nathan"},{"family":"Saltiel","given":"Alan R."},{"family":"Bridges","given":"Dave"}],"issued":{"date-parts":[["2019"]]},"citation-key":"Stephenson2019"}},{"id":4577,"uris":["http://zotero.org/users/7317906/items/S5C7PSHS"],"itemData":{"id":4577,"type":"article-journal","abstract":"Skeletal muscle alters whole-body metabolism through the release of hormones into the bloodstream called myokines. Guridi et al. found that skeletal muscle released a hormone called FGF21 in mice with skeletal muscle–specific activation of mTORC1, a protein complex that links nutrient availability to cell growth. Compared to control mice, these mice weighed less, likely because of increased fatty acid oxidation and increased energy expenditure, and had lower plasma concentrations of glucose and insulin. Systemic administration of antibodies directed against FGF21 reversed these metabolic changes. Thus, FGF21 released from skeletal muscle can mediate changes in whole-body metabolism.Skeletal muscle is the largest organ, comprising 40% of the total body lean mass, and affects whole-body metabolism in multiple ways. We investigated the signaling pathways involved in this process using TSCmKO mice, which have a skeletal muscle–specific depletion of TSC1 (tuberous sclerosis complex 1). This deficiency results in the constitutive activation of mammalian target of rapamycin complex 1 (mTORC1), which enhances cell growth by promoting protein synthesis. TSCmKO mice were lean, with increased insulin sensitivity, as well as changes in white and brown adipose tissue and liver indicative of increased fatty acid oxidation. These differences were due to increased plasma concentrations of fibroblast growth factor 21 (FGF21), a hormone that stimulates glucose uptake and fatty acid oxidation. The skeletal muscle of TSCmKO mice released FGF21 because of mTORC1-triggered endoplasmic reticulum (ER) stress and activation of a pathway involving PERK (protein kinase RNA-like ER kinase), eIF2α (eukaryotic translation initiation factor 2α), and ATF4 (activating transcription factor 4). Treatment of TSCmKO mice with a chemical chaperone that alleviates ER stress reduced FGF21 production in muscle and increased body weight. Moreover, injection of function-blocking antibodies directed against FGF21 largely normalized the metabolic phenotype of the mice. Thus, sustained activation of mTORC1 signaling in skeletal muscle regulated whole-body metabolism through the induction of FGF21, which, over the long term, caused severe lipodystrophy.","container-title":"Science Signaling","DOI":"10.1126/scisignal.aab3715","ISSN":"1937-9145","issue":"402","note":"PMID: 26554817\nCitation Key: Guridi2015\nISBN: 1937-9145 (Electronic)","page":"ra113-ra113","title":"Activation of mTORC1 in skeletal muscle regulates whole-body metabolism through FGF21","volume":"8","author":[{"family":"Guridi","given":"Maitea"},{"family":"Tintignac","given":"Lionel A"},{"family":"Lin","given":"Shuo"},{"family":"Kupr","given":"Barbara"},{"family":"Castets","given":"Perrine"},{"family":"Rüegg","given":"Markus A."}],"issued":{"date-parts":[["2015"]]},"citation-key":"Guridi2015"}},{"id":4834,"uris":["http://zotero.org/users/7317906/items/ZT6U9UFK"],"itemData":{"id":4834,"type":"article-journal","abstract":"Autophagy is a catabolic process that ensures homeostatic cell clearance and is deregulated in a growing number of myopathological conditions. Although FoxO3 was shown to promote the expression of autophagy-related genes in skeletal muscle, the mechanisms triggering autophagy are unclear. We show that TSC1-deficient mice (TSCmKO), characterized by sustained activation of mTORC1, develop a late-onset myopathy related to impaired autophagy. In young TSCmKO mice, constitutive and starvation-induced autophagy is blocked at the induction steps via mTORC1-mediated inhibition of Ulk1, despite FoxO3 activation. Rapamycin is sufficient to restore autophagy in TSCmKO mice and improves the muscle phenotype of old mutant mice. Inversely, abrogation of mTORC1 signaling by depletion of raptor induces autophagy regardless of FoxO inhibition. Thus, mTORC1 is the dominant regulator of autophagy induction in skeletal muscle and ensures a tight coordination of metabolic pathways. These findings may open interesting avenues for therapeutic strategies directed toward autophagy-related muscle diseases.","container-title":"Cell metabolism","DOI":"10.1016/j.cmet.2013.03.015","ISSN":"15504131","issue":"5","note":"PMID: 23602450\nCitation Key: Castets2013\nISBN: 1932-7420 (Electronic)\\r1550-4131 (Linking)","page":"731-44","title":"Sustained activation of mTORC1 in skeletal muscle inhibits constitutive and starvation-induced autophagy and causes a severe, late-onset myopathy.","volume":"17","author":[{"family":"Castets","given":"Perrine"},{"family":"Lin","given":"Shuo"},{"family":"Rion","given":"Nathalie"},{"family":"Di Fulvio","given":"Sabrina"},{"family":"Romanino","given":"Klaas"},{"family":"Guridi","given":"Maitea"},{"family":"Frank","given":"Stephan"},{"family":"Tintignac","given":"Lionel A. A."},{"family":"Sinnreich","given":"Michael"},{"family":"Rüegg","given":"Markus A."},{"family":"Di Fulvio","given":"Sabrina"},{"family":"R??egg","given":"Markus A."}],"issued":{"date-parts":[["2013",4,7]]},"citation-key":"Castets2013"}}],"schema":"https://github.com/citation-style-language/schema/raw/master/csl-citation.json"} </w:instrText>
-      </w:r>
-      <w:r>
-        <w:fldChar w:fldCharType="separate"/>
-      </w:r>
-      <w:r>
-        <w:rPr>
-          <w:noProof/>
-        </w:rPr>
-        <w:t>[19,22,23]</w:t>
-      </w:r>
-      <w:r>
-        <w:fldChar w:fldCharType="end"/>
-      </w:r>
-      <w:r>
-        <w:t xml:space="preserve">.  We evaluated expression of the putative </w:t>
-      </w:r>
-      <w:r>
-        <w:t>β</w:t>
-      </w:r>
-      <w:r>
-        <w:t xml:space="preserve">HB transporter </w:t>
-      </w:r>
-      <w:r>
-        <w:rPr>
-          <w:i/>
-          <w:iCs/>
-        </w:rPr>
-        <w:t>Slc16a1</w:t>
-      </w:r>
-      <w:r>
-        <w:t>; which was upregulated (</w:t>
-      </w:r>
-      <w:proofErr w:type="gramStart"/>
-      <w:r>
-        <w:t>4.0 fold</w:t>
-      </w:r>
-      <w:proofErr w:type="gramEnd"/>
-      <w:r>
-        <w:t xml:space="preserve">, </w:t>
-      </w:r>
-      <w:proofErr w:type="spellStart"/>
-      <w:r>
-        <w:t>p</w:t>
-      </w:r>
-      <w:r>
-        <w:rPr>
-          <w:vertAlign w:val="subscript"/>
-        </w:rPr>
-        <w:t>adj</w:t>
-      </w:r>
-      <w:proofErr w:type="spellEnd"/>
-      <w:r>
-        <w:t>=1.56 x 10</w:t>
-      </w:r>
-      <w:r>
-        <w:rPr>
-          <w:vertAlign w:val="superscript"/>
-        </w:rPr>
-        <w:t>-10</w:t>
-      </w:r>
-      <w:r>
-        <w:t xml:space="preserve">).  Among the ketone body catabolic enzymes, </w:t>
-      </w:r>
-      <w:r>
-        <w:rPr>
-          <w:i/>
-          <w:iCs/>
-        </w:rPr>
-        <w:t>Bdh1</w:t>
-      </w:r>
-      <w:r>
-        <w:t xml:space="preserve"> (</w:t>
-      </w:r>
-      <w:proofErr w:type="gramStart"/>
-      <w:r>
-        <w:t>2.1 fold</w:t>
-      </w:r>
-      <w:proofErr w:type="gramEnd"/>
-      <w:r>
-        <w:t xml:space="preserve">, </w:t>
-      </w:r>
-      <w:proofErr w:type="spellStart"/>
-      <w:r>
-        <w:t>p</w:t>
-      </w:r>
-      <w:r>
-        <w:rPr>
-          <w:vertAlign w:val="subscript"/>
-        </w:rPr>
-        <w:t>adj</w:t>
-      </w:r>
-      <w:proofErr w:type="spellEnd"/>
-      <w:r>
-        <w:t xml:space="preserve">=0.011) and </w:t>
-      </w:r>
-      <w:r>
-        <w:rPr>
-          <w:i/>
-          <w:iCs/>
-        </w:rPr>
-        <w:t>Oxct1</w:t>
-      </w:r>
-      <w:r>
-        <w:t xml:space="preserve"> (1.5 fold, </w:t>
-      </w:r>
-      <w:proofErr w:type="spellStart"/>
-      <w:r>
-        <w:t>p</w:t>
-      </w:r>
-      <w:r>
-        <w:rPr>
-          <w:vertAlign w:val="subscript"/>
-        </w:rPr>
-        <w:t>adj</w:t>
-      </w:r>
-      <w:proofErr w:type="spellEnd"/>
-      <w:r>
-        <w:t>=1.5 x 10</w:t>
-      </w:r>
-      <w:r>
-        <w:rPr>
-          <w:vertAlign w:val="superscript"/>
-        </w:rPr>
-        <w:t>-5</w:t>
-      </w:r>
-      <w:r>
-        <w:t xml:space="preserve">) were elevated.  </w:t>
-      </w:r>
-      <w:r>
-        <w:rPr>
-          <w:i/>
-          <w:iCs/>
-        </w:rPr>
-        <w:t>Acat1</w:t>
-      </w:r>
-      <w:r>
-        <w:t xml:space="preserve"> was unchanged in these muscles.  These data support the hypothesis that</w:t>
-      </w:r>
-      <w:r>
-        <w:t xml:space="preserve"> there is transcriptional upregulation</w:t>
-      </w:r>
-      <w:r>
-        <w:t xml:space="preserve"> of ketolytic genes</w:t>
-      </w:r>
-      <w:r>
-        <w:t xml:space="preserve"> in muscles with elevated mTORC1 activity</w:t>
-      </w:r>
-      <w:r>
-        <w:t xml:space="preserve">.  </w:t>
-      </w:r>
-    </w:p>
-    <w:p>
-      <w:pPr>
-        <w:pStyle w:val="Heading2"/>
-      </w:pPr>
-    </w:p>
-    <w:p>
-      <w:pPr>
-        <w:pStyle w:val="Heading2"/>
-      </w:pPr>
-      <w:r>
-        <w:t xml:space="preserve">Activation of </w:t>
-      </w:r>
-      <w:r>
-        <w:t>m</w:t>
-      </w:r>
-      <w:r>
-        <w:t>TO</w:t>
-      </w:r>
-      <w:r>
-        <w:t>RC1</w:t>
-      </w:r>
-      <w:r>
-        <w:t xml:space="preserve"> promotes Ketone Disposal</w:t>
-      </w:r>
-    </w:p>
-    <w:p>
-      <w:r>
-        <w:t xml:space="preserve">To test whether activation of mTORC1 in muscle tissue alters disposal of ketone bodies, we performed a </w:t>
-      </w:r>
-      <w:r>
-        <w:t>β</w:t>
-      </w:r>
-      <w:r>
-        <w:t xml:space="preserve">HB tolerance test in </w:t>
-      </w:r>
-      <w:r>
-        <w:rPr>
-          <w:i/>
-          <w:iCs/>
-        </w:rPr>
-        <w:t>Tsc1</w:t>
-      </w:r>
-      <w:r>
-        <w:t xml:space="preserve"> </w:t>
-      </w:r>
-      <w:r>
-        <w:t>KO</w:t>
-      </w:r>
-      <w:r>
-        <w:t xml:space="preserve"> mice.  The </w:t>
-      </w:r>
-      <w:proofErr w:type="spellStart"/>
-      <w:r>
-        <w:rPr>
-          <w:i/>
-          <w:iCs/>
-        </w:rPr>
-        <w:t>Ckmm</w:t>
-      </w:r>
-      <w:proofErr w:type="spellEnd"/>
-      <w:r>
-        <w:t xml:space="preserve">-Cre induced ablation of </w:t>
-      </w:r>
-      <w:r>
-        <w:rPr>
-          <w:i/>
-          <w:iCs/>
-        </w:rPr>
-        <w:t>Tsc1</w:t>
-      </w:r>
-      <w:r>
-        <w:t xml:space="preserve"> </w:t>
-      </w:r>
-      <w:r>
-        <w:lastRenderedPageBreak/>
-        <w:t xml:space="preserve">causes activation of mTORC1 in muscle tissues.  As shown in Figure </w:t>
-      </w:r>
-      <w:r>
-        <w:t>1B</w:t>
-      </w:r>
-      <w:r>
-        <w:t xml:space="preserve">, both male and female </w:t>
-      </w:r>
-      <w:r>
-        <w:t>KO</w:t>
-      </w:r>
-      <w:r>
-        <w:t xml:space="preserve"> mice cleared the injected beta-hydroxybutyrate much more rapidly than their wild-type littermates.  Using mixed-linear models using sex as a covariate, and the animal as a random intercept, we found a significant reduction in </w:t>
-      </w:r>
-      <w:r>
-        <w:t>β</w:t>
-      </w:r>
-      <w:r>
-        <w:t xml:space="preserve">HB levels after the challenge (p=0.004).  Similarly, when calculating the area under the curve from 0 to 60 minutes, there was a 25% reduction in the </w:t>
-      </w:r>
-      <w:r>
-        <w:t>KO</w:t>
-      </w:r>
-      <w:r>
-        <w:t xml:space="preserve">s, after adjusting for sex (p=0.016). When stratifying by sex, </w:t>
-      </w:r>
-      <w:r>
-        <w:t>KO</w:t>
-      </w:r>
-      <w:r>
-        <w:t xml:space="preserve">s had 41% lower AUC in males and 11% lower in females, though this modification by sex did not reach statistical significance (p=0.20). </w:t>
-      </w:r>
-      <w:r>
-        <w:t>Because there is a lack of consensus among studies</w:t>
-      </w:r>
-      <w:r>
-        <w:t xml:space="preserve"> </w:t>
-      </w:r>
-      <w:r>
-        <w:fldChar w:fldCharType="begin"/>
-      </w:r>
-      <w:r>
-        <w:instrText xml:space="preserve"> ADDIN ZOTERO_ITEM CSL_CITATION {"citationID":"TlAgaRBq","properties":{"formattedCitation":"[18]","plainCitation":"[18]","noteIndex":0},"citationItems":[{"id":8437,"uris":["http://zotero.org/users/7317906/items/2AZF8SH2"],"itemData":{"id":8437,"type":"article-journal","abstract":"Calorie restriction, without malnutrition, has been shown to increase lifespan and is associated with a shift away from glycolysis toward beta-oxidation. The objective of this study was to mimic this metabolic shift using low-carbohydrate diets and to determine the influence of these diets on longevity and healthspan in mice. C57BL/6 mice were assigned to a ketogenic, low-carbohydrate, or control diet at 12 months of age and were either allowed to live their natural lifespan or tested for physiological function after 1 or 14 months of dietary intervention. The ketogenic diet (KD) significantly increased median lifespan and survival compared to controls. In aged mice, only those consuming a KD displayed preservation of physiological function. The KD increased protein acetylation levels and regulated mTORC1 signaling in a tissue-dependent manner. This study demonstrates that a KD extends longevity and healthspan in mice.","container-title":"Cell Metabolism","DOI":"10.1016/j.cmet.2017.08.005","ISSN":"19327420","issue":"3","note":"PMID: 28877457\npublisher: Elsevier Inc.\nCitation Key: Roberts2017","page":"539-546.e5","title":"A Ketogenic Diet Extends Longevity and Healthspan in Adult Mice","volume":"26","author":[{"family":"Roberts","given":"Megan N."},{"family":"Wallace","given":"Marita A."},{"family":"Tomilov","given":"Alexey A."},{"family":"Zhou","given":"Zeyu"},{"family":"Marcotte","given":"George R."},{"family":"Tran","given":"Dianna"},{"family":"Perez","given":"Gabriella"},{"family":"Gutierrez-Casado","given":"Elena"},{"family":"Koike","given":"Shinichiro"},{"family":"Knotts","given":"Trina A."},{"family":"Imai","given":"Denise M."},{"family":"Griffey","given":"Stephen M."},{"family":"Kim","given":"Kyoungmi"},{"family":"Hagopian","given":"Kevork"},{"family":"Haj","given":"Fawaz G."},{"family":"Baar","given":"Keith"},{"family":"Cortopassi","given":"Gino A."},{"family":"Ramsey","given":"Jon J."},{"family":"Lopez-Dominguez","given":"Jose Alberto"}],"issued":{"date-parts":[["2017"]]},"citation-key":"Roberts2017"}}],"schema":"https://github.com/citation-style-language/schema/raw/master/csl-citation.json"} </w:instrText>
-      </w:r>
-      <w:r>
-        <w:fldChar w:fldCharType="separate"/>
-      </w:r>
-      <w:r>
-        <w:rPr>
-          <w:noProof/>
-        </w:rPr>
-        <w:t>[18</w:t>
-      </w:r>
-      <w:r>
-        <w:fldChar w:fldCharType="end"/>
-      </w:r>
-      <w:r>
-        <w:t>,</w:t>
-      </w:r>
-      <w:r>
-        <w:fldChar w:fldCharType="begin"/>
-      </w:r>
-      <w:r>
-        <w:instrText xml:space="preserve"> ADDIN ZOTERO_ITEM CSL_CITATION {"citationID":"jD3Ct4q1","properties":{"formattedCitation":"[24,25]","plainCitation":"[24,25]","noteIndex":0},"citationItems":[{"id":9182,"uris":["http://zotero.org/users/7317906/items/WZ3YVH2I"],"itemData":{"id":9182,"type":"article-journal","abstract":"The causes of the decline in skeletal muscle mass and function with age, known as sarcopenia, are poorly understood. Nutrition (calorie restriction) interventions impact many cellular processes and increase lifespan and preserve muscle mass and function with age. As we previously observed an increase in life span and muscle function in aging mice on a ketogenic diet (KD), we aimed to investigate the effect of a KD on the maintenance of skeletal muscle mass with age and the potential molecular mechanisms of this action. Twelve-month-old mice were assigned to an isocaloric control or KD until 16 or 26 months of age, at which time skeletal muscle was collected for evaluating mass, morphology, and biochemical properties. Skeletal muscle mass was significantly greater at 26 months in the gastrocnemius of mice on the KD. This result in KD mice was associated with a shift in fiber type from type IIb to IIa fibers and a range of molecular parameters including increased markers of NMJ remodeling, mitochondrial biogenesis, oxidative metabolism, and antioxidant capacity, while decreasing endoplasmic reticulum (ER) stress, protein synthesis, and proteasome activity. Overall, this study shows the effectiveness of a long-term KD in mitigating sarcopenia. The diet preferentially preserved oxidative muscle fibers and improved mitochondrial and antioxidant capacity. These adaptations may result in a healthier cellular environment, decreasing oxidative and ER stress resulting in less protein turnover. These shifts allow mice to better maintain muscle mass and function with age.","container-title":"Aging cell","DOI":"10.1111/acel.13322","ISSN":"1474-9726","issue":"January","note":"PMID: 33675103\nCitation Key: Wallace2021","page":"e13322","title":"The ketogenic diet preserves skeletal muscle with aging in mice.","author":[{"family":"Wallace","given":"Marita A."},{"family":"Aguirre","given":"Nicholas W"},{"family":"Marcotte","given":"George R"},{"family":"Marshall","given":"Andrea G"},{"family":"Baehr","given":"Leslie M"},{"family":"Hughes","given":"David C"},{"family":"Hamilton","given":"Karyn L"},{"family":"Roberts","given":"Megan N"},{"family":"Lopez-Dominguez","given":"Jose Alberto"},{"family":"Miller","given":"Benjamin F"},{"family":"Ramsey","given":"Jon J"},{"family":"Baar","given":"Keith"}],"issued":{"date-parts":[["2021"]]},"citation-key":"Wallace2021"}},{"id":9151,"uris":["http://zotero.org/users/7317906/items/L8PE6TZ6"],"itemData":{"id":9151,"type":"book","abstract":"Ketogenic diets (KD) are reported to improve body weight, fat mass, and exercise performance in humans. Unfortunately, most rodent studies have used a low-protein KD, which does not recapitulate diets used by humans. Since skeletal muscle plays a critical role in responding to macronutrient perturbations induced by diet and exercise, the purpose of this study was to test if a normal-protein KD (NPKD) impacts shifts in skeletal muscle substrate oxidative capacity in response to exercise training (ExTr). A high fat, carbohydrate-deficient NPKD (16.1% protein, 83.9% fat, 0% carbohydrate) was given to C57BL/6J male mice for 6 weeks, while controls received a low fat diet with similar protein (15.9% protein, 11.9% fat, 72.2% carbohydrate). On week four of the diet, mice began treadmill training 5 days/week, 60 min/day for 3 weeks. NPKD-fed mice increased body weight and fat mass, while ExTr negated a continued rise in adiposity. ExTr increased intramuscular glycogen, while the NPKD increased intramuscular triglycerides. Neither the NPKD nor ExTr alone altered mitochondrial content; however, in combination, the NPKD-ExTr group showed increases in PGC-1α, as well as markers of mitochondrial fission and fusion. Pyruvate oxidative capacity was unchanged by either intervention, while ExTr increased leucine oxidation in NPKD-fed mice. Lipid metabolism pathways had the most notable changes as the NPKD and ExTr interventions both enhanced mitochondrial and peroxisomal lipid oxidation and many adaptations were additive or synergistic. Overall these results suggest a combination of a NPKD and ExTr induces additive and/or synergistic adaptations in skeletal muscle oxidative capacity.","ISBN":"2-257-63278-8","note":"container-title: American Journal of Physiology-Endocrinology and Metabolism\nDOI: 10.1152/ajpendo.00410.2020\nCitation Key: Huang2021\nISSN: 0193-1849","title":"Combined effects of a ketogenic diet and exercise training alter mitochondrial and peroxisomal substrate oxidative capacity in skeletal muscle","author":[{"family":"Huang","given":"Tai-Yu"},{"family":"Linden","given":"Melissa A."},{"family":"Fuller","given":"Scott E."},{"family":"Goldsmith","given":"Felicia R"},{"family":"Simon","given":"Jacob"},{"family":"Batdorf","given":"Heidi M."},{"family":"Scott","given":"Matthew C."},{"family":"Essajee","given":"Nabil M."},{"family":"Brown","given":"John M."},{"family":"Noland","given":"Robert C."}],"issued":{"date-parts":[["2021"]]},"citation-key":"Huang2021"}}],"schema":"https://github.com/citation-style-language/schema/raw/master/csl-citation.json"} </w:instrText>
-      </w:r>
-      <w:r>
-        <w:fldChar w:fldCharType="separate"/>
-      </w:r>
-      <w:r>
-        <w:rPr>
-          <w:rFonts w:ascii="Calibri" w:cs="Calibri"/>
-        </w:rPr>
-        <w:t>24,25]</w:t>
-      </w:r>
-      <w:r>
-        <w:fldChar w:fldCharType="end"/>
-      </w:r>
-      <w:r>
-        <w:t xml:space="preserve"> evaluating the effect of ketogenic diets on muscle mTORC1 function </w:t>
-      </w:r>
-      <w:r>
-        <w:t>and</w:t>
-      </w:r>
-      <w:r>
-        <w:t xml:space="preserve"> suggested activation of this signaling pathway, we evaluated how ketogenic diet feeding alters ketone disposal.</w:t>
-      </w:r>
-    </w:p>
-    <w:p/>
-    <w:p>
-      <w:pPr>
-        <w:pStyle w:val="Heading2"/>
-      </w:pPr>
-      <w:r>
-        <w:t xml:space="preserve">KD </w:t>
-      </w:r>
-      <w:r>
-        <w:t>Feeding Does not Improve</w:t>
-      </w:r>
-      <w:r>
-        <w:t xml:space="preserve"> </w:t>
-      </w:r>
-      <w:r>
-        <w:t>β</w:t>
-      </w:r>
-      <w:r>
-        <w:t>HB</w:t>
-      </w:r>
-      <w:r>
-        <w:t xml:space="preserve"> Disposal in A/J Mice</w:t>
-      </w:r>
-    </w:p>
-    <w:p>
-      <w:r>
-        <w:t xml:space="preserve">We hypothesized that prolonged exposure to elevated ketone body levels would </w:t>
-      </w:r>
-      <w:r>
-        <w:t xml:space="preserve">lead to </w:t>
-      </w:r>
-      <w:r>
-        <w:t xml:space="preserve">physiological adaptations, resulting in improved disposal of ketone bodies. </w:t>
-      </w:r>
-      <w:r>
-        <w:t xml:space="preserve">To test </w:t>
-      </w:r>
-      <w:r>
-        <w:t>this hypothesis</w:t>
-      </w:r>
-      <w:r>
-        <w:t>,</w:t>
-      </w:r>
-      <w:r>
-        <w:t xml:space="preserve"> </w:t>
-      </w:r>
-      <w:r>
-        <w:t xml:space="preserve">we fed </w:t>
-      </w:r>
-      <w:r>
-        <w:t>10-week-old</w:t>
-      </w:r>
-      <w:r>
-        <w:t xml:space="preserve"> male</w:t>
-      </w:r>
-      <w:r>
-        <w:t>,</w:t>
-      </w:r>
-      <w:r>
-        <w:t xml:space="preserve"> wild-type</w:t>
-      </w:r>
-      <w:r>
-        <w:t xml:space="preserve"> A/J mice a control or a ketogenic diet for three weeks and then performed a </w:t>
-      </w:r>
-      <w:r>
-        <w:t>KTT.</w:t>
-      </w:r>
-      <w:r>
-        <w:t xml:space="preserve">  As expected, baseline ketone body levels were elevated </w:t>
-      </w:r>
-      <w:r>
-        <w:t xml:space="preserve">from 0.43 mg/dL to 0.75 mg/dL in this assay (p=0.017).  Upon injection we were surprised to observe that ketone body levels </w:t>
-      </w:r>
-      <w:r>
-        <w:t>remain</w:t>
-      </w:r>
-      <w:r>
-        <w:t xml:space="preserve"> elevated more</w:t>
-      </w:r>
-      <w:r>
-        <w:t>-</w:t>
-      </w:r>
-      <w:r>
-        <w:t>so in the ketogenic diet-fed mice than the control mice</w:t>
-      </w:r>
-      <w:r>
-        <w:t xml:space="preserve"> (Figure </w:t>
-      </w:r>
-      <w:r>
-        <w:t>2</w:t>
-      </w:r>
-      <w:r>
-        <w:t>A), even after subtracting for baseline differences (Figure 2B</w:t>
-      </w:r>
-      <w:r>
-        <w:t>-C</w:t>
-      </w:r>
-      <w:r>
-        <w:t>)</w:t>
-      </w:r>
-      <w:r>
-        <w:t xml:space="preserve">. </w:t>
-      </w:r>
-      <w:r>
-        <w:t xml:space="preserve">These data suggest that ketone disposal is not improved after three weeks of a ketogenic relative to a control </w:t>
-      </w:r>
-      <w:r>
-        <w:t>diet and</w:t>
-      </w:r>
-      <w:r>
-        <w:t xml:space="preserve"> may </w:t>
-      </w:r>
-      <w:proofErr w:type="gramStart"/>
-      <w:r>
-        <w:t>actually be</w:t>
-      </w:r>
-      <w:proofErr w:type="gramEnd"/>
-      <w:r>
-        <w:t xml:space="preserve"> somewhat worsened in A/J mice</w:t>
-      </w:r>
-      <w:r>
-        <w:t xml:space="preserve"> (p=0.</w:t>
-      </w:r>
-      <w:r>
-        <w:t>274</w:t>
-      </w:r>
-      <w:r>
-        <w:t xml:space="preserve"> via linear </w:t>
-      </w:r>
-      <w:r>
-        <w:t xml:space="preserve">mixed </w:t>
-      </w:r>
-      <w:r>
-        <w:t>models)</w:t>
-      </w:r>
-      <w:r>
-        <w:t>.</w:t>
-      </w:r>
-    </w:p>
-    <w:p/>
-    <w:p>
-      <w:r>
-        <w:t>To understand this surprising</w:t>
-      </w:r>
-      <w:r>
-        <w:t xml:space="preserve"> lack of</w:t>
-      </w:r>
-      <w:r>
-        <w:t xml:space="preserve"> adaptation, we performed mRNA quantification of the expression of key transporters and enzymes involved in ketolysis in the quadriceps from these A/J mice.  As shown in Figure 2D, most ketolytic gene expression was reduced.  Among the MCT1 family transporters that conduct ketone bodies into cells, </w:t>
-      </w:r>
-      <w:r>
-        <w:rPr>
-          <w:i/>
-          <w:iCs/>
-        </w:rPr>
-        <w:t>Slc16a1</w:t>
-      </w:r>
-      <w:r>
-        <w:t xml:space="preserve"> transcripts were modestly reduced in muscles from A/J mice fed ketogenic diets (17% reduced, </w:t>
-      </w:r>
-      <w:proofErr w:type="spellStart"/>
-      <w:r>
-        <w:t>p</w:t>
-      </w:r>
-      <w:r>
-        <w:rPr>
-          <w:vertAlign w:val="subscript"/>
-        </w:rPr>
-        <w:t>diet</w:t>
-      </w:r>
-      <w:proofErr w:type="spellEnd"/>
-      <w:r>
-        <w:t xml:space="preserve"> from a 2x2 ANOVA =0.064). </w:t>
-      </w:r>
-      <w:r>
-        <w:rPr>
-          <w:i/>
-          <w:iCs/>
-        </w:rPr>
-        <w:t>Bdh1</w:t>
-      </w:r>
-      <w:r>
-        <w:t xml:space="preserve"> encodes beta hydroxybutyrate dehydrogenase, the interconversion step between beta-hydroxybutyrate and acetoacetate.  We found that this gene is downregulated in A/J muscles by 42% (</w:t>
-      </w:r>
-      <w:proofErr w:type="spellStart"/>
-      <w:r>
-        <w:t>p</w:t>
-      </w:r>
-      <w:r>
-        <w:rPr>
-          <w:vertAlign w:val="subscript"/>
-        </w:rPr>
-        <w:t>diet</w:t>
-      </w:r>
-      <w:proofErr w:type="spellEnd"/>
-      <w:r>
-        <w:t xml:space="preserve"> from a 2x2 ANOVA =0.009).  </w:t>
-      </w:r>
-      <w:r>
-        <w:rPr>
-          <w:i/>
-          <w:iCs/>
-        </w:rPr>
-        <w:t>Oxct1</w:t>
-      </w:r>
-      <w:r>
-        <w:t xml:space="preserve"> encodes succinyl-CoA:3-ketoacid CoA transferase (SCOT) and was down regulated in both male and female mice by 52% (</w:t>
-      </w:r>
-      <w:proofErr w:type="spellStart"/>
-      <w:r>
-        <w:t>p</w:t>
-      </w:r>
-      <w:r>
-        <w:rPr>
-          <w:vertAlign w:val="subscript"/>
-        </w:rPr>
-        <w:t>diet</w:t>
-      </w:r>
-      <w:proofErr w:type="spellEnd"/>
-      <w:r>
-        <w:t xml:space="preserve"> from a 2x2 ANOVA=8.4 x 10</w:t>
-      </w:r>
-      <w:r>
-        <w:rPr>
-          <w:vertAlign w:val="superscript"/>
-        </w:rPr>
-        <w:t>-9</w:t>
-      </w:r>
-      <w:r>
-        <w:t>).  While there was no significant sex x diet interaction in these analyses, male mice had 15-30% higher expression of each of these genes compared to female mouse muscle lysates (</w:t>
-      </w:r>
-      <w:proofErr w:type="spellStart"/>
-      <w:r>
-        <w:t>p</w:t>
-      </w:r>
-      <w:r>
-        <w:rPr>
-          <w:vertAlign w:val="subscript"/>
-        </w:rPr>
-        <w:t>sex</w:t>
-      </w:r>
-      <w:proofErr w:type="spellEnd"/>
-      <w:r>
-        <w:t xml:space="preserve"> from a 2x2 ANOVA=4.7 x 10</w:t>
-      </w:r>
-      <w:r>
-        <w:rPr>
-          <w:vertAlign w:val="superscript"/>
-        </w:rPr>
-        <w:t>-3</w:t>
-      </w:r>
-      <w:r>
-        <w:t xml:space="preserve"> for </w:t>
-      </w:r>
-      <w:r>
-        <w:rPr>
-          <w:i/>
-          <w:iCs/>
-        </w:rPr>
-        <w:t>Slc16a1</w:t>
-      </w:r>
-      <w:r>
-        <w:t>, 8.9 x 10</w:t>
-      </w:r>
-      <w:r>
-        <w:rPr>
-          <w:vertAlign w:val="superscript"/>
-        </w:rPr>
-        <w:t>-3</w:t>
-      </w:r>
-      <w:r>
-        <w:t xml:space="preserve"> for </w:t>
-      </w:r>
-      <w:r>
-        <w:rPr>
-          <w:i/>
-          <w:iCs/>
-        </w:rPr>
-        <w:t>Bdh1</w:t>
-      </w:r>
-      <w:r>
-        <w:t xml:space="preserve"> and 0.055 for </w:t>
-      </w:r>
-      <w:r>
-        <w:rPr>
-          <w:i/>
-          <w:iCs/>
-        </w:rPr>
-        <w:t>Oxct1</w:t>
-      </w:r>
-      <w:r>
-        <w:t>)</w:t>
-      </w:r>
-      <w:r>
-        <w:t>.</w:t>
-      </w:r>
-      <w:r>
-        <w:t xml:space="preserve"> </w:t>
-      </w:r>
-      <w:r>
-        <w:t xml:space="preserve">This may suggest enhanced ketone body catabolism in male versus female mice, but this was not explored further. </w:t>
-      </w:r>
-      <w:r>
-        <w:t>The</w:t>
-      </w:r>
-      <w:r>
-        <w:t xml:space="preserve"> key finding here is that the transcriptional downregulation of genes involved in ketone body disposal in muscle is consistent with reduced disposal of injected </w:t>
-      </w:r>
-      <w:r>
-        <w:t>β</w:t>
-      </w:r>
-      <w:r>
-        <w:t xml:space="preserve">HB.  This </w:t>
-      </w:r>
-      <w:r>
-        <w:t xml:space="preserve">begs the </w:t>
-      </w:r>
-      <w:r>
-        <w:t xml:space="preserve">question, if ketone bodies are at steady state in serum, but disposal is reduced, does that imply that production may also be reduced?  To test this, we looked at three ketogenic enzymes in the livers of these mice. We found downregulation of hepatic </w:t>
-      </w:r>
-      <w:proofErr w:type="spellStart"/>
-      <w:r>
-        <w:rPr>
-          <w:i/>
-          <w:iCs/>
-        </w:rPr>
-        <w:t>Hmgcl</w:t>
-      </w:r>
-      <w:proofErr w:type="spellEnd"/>
-      <w:r>
-        <w:rPr>
-          <w:i/>
-          <w:iCs/>
-        </w:rPr>
-        <w:t xml:space="preserve"> </w:t>
-      </w:r>
-      <w:r>
-        <w:t>and</w:t>
-      </w:r>
-      <w:r>
-        <w:rPr>
-          <w:i/>
-          <w:iCs/>
-        </w:rPr>
-        <w:t xml:space="preserve"> Hmgcs2</w:t>
-      </w:r>
-      <w:r>
-        <w:rPr>
-          <w:i/>
-          <w:iCs/>
-        </w:rPr>
-        <w:t xml:space="preserve"> </w:t>
-      </w:r>
-      <w:r>
-        <w:t xml:space="preserve">in the livers of male mice, </w:t>
-      </w:r>
-      <w:r>
-        <w:t>and</w:t>
-      </w:r>
-      <w:r>
-        <w:t xml:space="preserve"> </w:t>
-      </w:r>
-      <w:r>
-        <w:rPr>
-          <w:i/>
-          <w:iCs/>
-        </w:rPr>
-        <w:t>Bdh1</w:t>
-      </w:r>
-      <w:r>
-        <w:t xml:space="preserve"> was downregulated in</w:t>
-      </w:r>
-      <w:r>
-        <w:t xml:space="preserve"> both male and</w:t>
-      </w:r>
-      <w:r>
-        <w:t xml:space="preserve"> female mouse livers (Supplementary Figure 1, </w:t>
-      </w:r>
-      <w:proofErr w:type="spellStart"/>
-      <w:r>
-        <w:t>p</w:t>
-      </w:r>
-      <w:r>
-        <w:rPr>
-          <w:vertAlign w:val="subscript"/>
-        </w:rPr>
-        <w:t>sex</w:t>
-      </w:r>
-      <w:proofErr w:type="spellEnd"/>
-      <w:r>
-        <w:rPr>
-          <w:vertAlign w:val="subscript"/>
-        </w:rPr>
-        <w:t xml:space="preserve"> x diet</w:t>
-      </w:r>
-      <w:r>
-        <w:t xml:space="preserve"> &lt;0.01 for both </w:t>
-      </w:r>
-      <w:proofErr w:type="spellStart"/>
-      <w:r>
-        <w:rPr>
-          <w:i/>
-          <w:iCs/>
-        </w:rPr>
-        <w:t>Hmgcl</w:t>
-      </w:r>
-      <w:proofErr w:type="spellEnd"/>
-      <w:r>
-        <w:t xml:space="preserve"> and </w:t>
-      </w:r>
-      <w:r>
-        <w:rPr>
-          <w:i/>
-          <w:iCs/>
-        </w:rPr>
-        <w:t>Hmgcs1</w:t>
-      </w:r>
-      <w:r>
-        <w:t>).</w:t>
-      </w:r>
-    </w:p>
-    <w:p/>
-    <w:p>
-      <w:pPr>
-        <w:pStyle w:val="Heading2"/>
-      </w:pPr>
-      <w:r>
-        <w:t xml:space="preserve">Evaluation of Diversity Outbred Mice Demonstrates Substantial Variation in </w:t>
-      </w:r>
-      <w:r>
-        <w:t>β</w:t>
-      </w:r>
-      <w:r>
-        <w:t xml:space="preserve">HB Disposal </w:t>
-      </w:r>
-    </w:p>
-    <w:p>
-      <w:r>
-        <w:t xml:space="preserve">To evaluate if A/J mice were atypical in their lack of adaptation to improved ketolysis, we performed </w:t>
-      </w:r>
-      <w:r>
-        <w:t>β</w:t>
-      </w:r>
-      <w:r>
-        <w:t xml:space="preserve">HB tolerance tests on diversity outbred mice before or after four weeks of a ketogenic diet.  Diversity outbred (DO) mice are genetically unique, so they represent the integrated genetic variability of the intercrossed eight founder strains </w:t>
-      </w:r>
-      <w:r>
-        <w:fldChar w:fldCharType="begin"/>
-      </w:r>
-      <w:r>
-        <w:instrText xml:space="preserve"> ADDIN ZOTERO_ITEM CSL_CITATION {"citationID":"DtMZezGZ","properties":{"formattedCitation":"[26]","plainCitation":"[26]","noteIndex":0},"citationItems":[{"id":8432,"uris":["http://zotero.org/users/7317906/items/6RYMCB6K"],"itemData":{"id":8432,"type":"article-journal","abstract":"The Diversity Outbred (DO) population is a heterogeneous stock derived from the same eight founder strains as the Collaborative Cross (CC) inbred strains. Genetically heterogeneous DO mice display a broad range of phenotypes. Natural levels of heterozygosity provide genetic buffering and, as a result, DO mice are robust and breed well. Genetic mapping analysis in the DO presents new challenges and opportunities. Specialized algorithms are required to reconstruct haplotypes from high-density SNP array data. The eight founder haplotypes can be combined into 36 possible diplotypes, which must be accommodated in QTL mapping analysis. Population structure of the DO must be taken into account here. Estimated allele effects of eight founder haplotypes provide information that is not available in two-parent crosses and can dramatically reduce the number of candidate loci. Allele effects can also distinguish chance colocation of QTL from pleiotropy, which provides a basis for establishing causality in expression QTL studies. We recommended sample sizes of 200-800 mice for QTL mapping studies, larger than for traditional crosses. The CC inbred strains provide a resource for independent validation of DO mapping results. Genetic heterogeneity of the DO can provide a powerful advantage in our ability to generalize conclusions to other genetically diverse populations. Genetic diversity can also help to avoid the pitfall of identifying an idiosyncratic reaction that occurs only in a limited genetic context. Informatics tools and data resources associated with the CC, the DO, and their founder strains are developing rapidly. We anticipate a flood of new results to follow as our community begins to adopt and utilize these new genetic resource populations. © Springer Science+Business Media, LLC 2012.","container-title":"Mammalian Genome","DOI":"10.1007/s00335-012-9414-2","ISSN":"09388990","issue":"9-10","note":"Citation Key: Churchill2012\nISBN: 0033501294142","page":"713-718","title":"The Diversity Outbred mouse population","volume":"23","author":[{"family":"Churchill","given":"Gary A."},{"family":"Gatti","given":"Daniel M."},{"family":"Munger","given":"Steven C."},{"family":"Svenson","given":"Karen L."}],"issued":{"date-parts":[["2012"]]},"citation-key":"Churchill2012"}}],"schema":"https://github.com/citation-style-language/schema/raw/master/csl-citation.json"} </w:instrText>
-      </w:r>
-      <w:r>
-        <w:fldChar w:fldCharType="separate"/>
-      </w:r>
-      <w:r>
-        <w:rPr>
-          <w:noProof/>
-        </w:rPr>
-        <w:t>[26]</w:t>
-      </w:r>
-      <w:r>
-        <w:fldChar w:fldCharType="end"/>
-      </w:r>
-      <w:r>
-        <w:t xml:space="preserve">.  As hypothesized by this level of genetic variability, DO mice had variable responses to </w:t>
-      </w:r>
-      <w:r>
-        <w:t>β</w:t>
-      </w:r>
-      <w:r>
-        <w:t>HB Tolerance Tests at both baseline and after four weeks of ketogenic diet (Figure 3A).  In Figure 3B we describe the within-mouse effects of the diet, again showing substantial between-strain variability, likely due to genetic differences.  There was more variability in the area under the curve post-diet than pre-diet (</w:t>
-      </w:r>
-      <w:proofErr w:type="spellStart"/>
-      <w:r>
-        <w:t>SD</w:t>
-      </w:r>
-      <w:r>
-        <w:rPr>
-          <w:vertAlign w:val="subscript"/>
-        </w:rPr>
-        <w:t>follow</w:t>
-      </w:r>
-      <w:proofErr w:type="spellEnd"/>
-      <w:r>
-        <w:rPr>
-          <w:vertAlign w:val="subscript"/>
-        </w:rPr>
-        <w:t>-up</w:t>
-      </w:r>
-      <w:r>
-        <w:t>/</w:t>
-      </w:r>
-      <w:proofErr w:type="spellStart"/>
-      <w:r>
-        <w:t>SD</w:t>
-      </w:r>
-      <w:r>
-        <w:rPr>
-          <w:vertAlign w:val="subscript"/>
-        </w:rPr>
-        <w:t>baseline</w:t>
-      </w:r>
-      <w:proofErr w:type="spellEnd"/>
-      <w:r>
-        <w:t>= 1.93; p&lt;1 x 10</w:t>
-      </w:r>
-      <w:r>
-        <w:rPr>
-          <w:vertAlign w:val="superscript"/>
-        </w:rPr>
-        <w:t>-15</w:t>
-      </w:r>
-      <w:r>
-        <w:t xml:space="preserve"> via Levene’s test), suggesting diet-induced variability.  Consistent with our findings using inbred A/J mice, the majority of DO mice had worsened ketone disposal after diet (35 mice), with a smaller number of mice having improved ketone disposal by our assay (10 mice), more than would be expected by chance (p=1.9 x 10</w:t>
-      </w:r>
-      <w:r>
-        <w:rPr>
-          <w:vertAlign w:val="superscript"/>
-        </w:rPr>
-        <w:t>-4</w:t>
-      </w:r>
-      <w:r>
-        <w:t xml:space="preserve"> from a </w:t>
-      </w:r>
-      <w:r>
-        <w:rPr>
-          <w:rFonts w:ascii="Symbol" w:eastAsia="Symbol" w:hAnsi="Symbol" w:cs="Symbol"/>
-        </w:rPr>
-        <w:t>c</w:t>
-      </w:r>
-      <w:r>
-        <w:rPr>
-          <w:vertAlign w:val="superscript"/>
-        </w:rPr>
-        <w:t>2</w:t>
-      </w:r>
-      <w:r>
-        <w:t xml:space="preserve"> test). </w:t>
-      </w:r>
-      <w:r>
-        <w:t xml:space="preserve">Across this cohort </w:t>
-      </w:r>
-      <w:r>
-        <w:t>there was a significant decrease in ketone disposal (increase in baseline adjusted KTT) in these mice after four weeks of ketogenic diet (p=4.8 x 10</w:t>
-      </w:r>
-      <w:r>
-        <w:rPr>
-          <w:vertAlign w:val="superscript"/>
-        </w:rPr>
-        <w:t>-5</w:t>
-      </w:r>
-      <w:r>
-        <w:t xml:space="preserve"> from a paired Wilcoxon test).</w:t>
-      </w:r>
-    </w:p>
-    <w:p/>
-    <w:p>
-      <w:r>
-        <w:t>To better understand the physiological basis and repercussions of this variation, we performed an exploratory analysis to identify potential correlations between baseline and follow-up</w:t>
-      </w:r>
-      <w:r>
-        <w:t xml:space="preserve"> </w:t>
-      </w:r>
-      <w:r>
-        <w:t xml:space="preserve">changes in ketone disposal, and a variety of other outcomes (Figure 3C).  While none of these associations met our threshold for statistical significance, we saw three interesting potential relationships between </w:t>
-      </w:r>
-      <w:proofErr w:type="spellStart"/>
-      <w:r>
-        <w:t>i</w:t>
-      </w:r>
-      <w:proofErr w:type="spellEnd"/>
-      <w:r>
-        <w:t>) changes in cholesterol and ketone tolerance at baseline (r=-0.18, p=0.26), ii) weight gain on a ketogenic diet and ketone tolerance after the diet (r=0.25, p=0.114), and iii) weight gain and change in ketone tolerance (r=0.</w:t>
-      </w:r>
-      <w:r>
-        <w:t>23, p</w:t>
-      </w:r>
-      <w:r>
-        <w:t>=0.158).  While this study was underpowered to detect relationships of this size, the findings warrant further investigation into the relationships between ketone disposal and cholesterol and energy homeostasis.</w:t>
-      </w:r>
-    </w:p>
-    <w:p>
-      <w:pPr>
-        <w:pStyle w:val="Heading1"/>
-      </w:pPr>
-      <w:r>
-        <w:t>DISCUSSION</w:t>
-      </w:r>
-    </w:p>
-    <w:p/>
-    <w:p>
-      <w:r>
-        <w:t xml:space="preserve">Activation of mTORC1 in skeletal muscle appears to play a positive role in promoting the disposal of ketone bodies and regulating the expression of genes associated with ketolysis. It was tempting to speculate, based on prior reports of mTORC1 activation in muscles after a ketogenic diet, that this was a common adaptation to the low-carbohydrate high-fat (LCHF) state.  Surprisingly, our findings revealed that a 4-week feeding period of a ketogenic diet did not result in an enhancement of ketone body disposal in both inbred A/J mice and Diversity Outbred mice, but rather an impairment in disposal of a bolus of βHB.   Our results are somewhat at odds with those of </w:t>
-      </w:r>
-      <w:r>
-        <w:rPr>
-          <w:rFonts w:ascii="Calibri" w:cs="Calibri"/>
-        </w:rPr>
-        <w:t>Schnyder, et al</w:t>
-      </w:r>
-      <w:r>
-        <w:t xml:space="preserve"> </w:t>
-      </w:r>
-      <w:r>
-        <w:fldChar w:fldCharType="begin"/>
-      </w:r>
-      <w:r>
-        <w:instrText xml:space="preserve"> ADDIN ZOTERO_ITEM CSL_CITATION {"citationID":"LpbssgSc","properties":{"formattedCitation":"[16]","plainCitation":"[16]","noteIndex":0},"citationItems":[{"id":189,"uris":["http://zotero.org/users/7317906/items/THMX4FYC"],"itemData":{"id":189,"type":"article-journal","abstract":"© 2017 the American Physiological Society.Low-carbohydrate/high-fat (LCHF) diets are increasingly popular dietary interventions for body weight control and as treatment for different pathological conditions. However, the mechanisms of action are still poorly understood, in particular, in long-term administration. Besides liver, brain, and heart, skeletal muscle is one of the major organs involved in the regulation of physiological and pathophysiological ketosis. We assessed the role of the peroxisome proliferator-activated receptor γ coactivator 1α (PGC-1α) in skeletal muscle of male wild-type control and PGC-1α muscle-specific knockout mice upon 12 wk of LCHF diet feeding. Interestingly, LCHF diet administration increased oxygen consumption in a muscle PGC-1α-dependent manner, concomitant with a blunted transcriptional induction of genes involved in fatty acid oxidation and impairment in exercise performance. These data reveal a new role for muscle PGC-1α in regulating the physiological adaptation to long-term LCHF diet administration.","container-title":"American Journal of Physiology-Endocrinology and Metabolism","DOI":"10.1152/ajpendo.00361.2016","ISSN":"0193-1849","issue":"5","note":"Citation Key: Schnyder2017a","page":"E437-E446","title":"Muscle PGC-1α is required for long-term systemic and local adaptations to a ketogenic diet in mice","volume":"312","author":[{"family":"Schnyder","given":"Svenia"},{"family":"Svensson","given":"Kristoffer"},{"family":"Cardel","given":"Bettina"},{"family":"Handschin","given":"Christoph"}],"issued":{"date-parts":[["2017"]]},"citation-key":"Schnyder2017a"}}],"schema":"https://github.com/citation-style-language/schema/raw/master/csl-citation.json"} </w:instrText>
-      </w:r>
-      <w:r>
-        <w:fldChar w:fldCharType="separate"/>
-      </w:r>
-      <w:r>
-        <w:rPr>
-          <w:noProof/>
-        </w:rPr>
-        <w:t>[16]</w:t>
-      </w:r>
-      <w:r>
-        <w:fldChar w:fldCharType="end"/>
-      </w:r>
-      <w:r>
-        <w:t>, which showed upregulation of OXCT1 protein in LCHF fed C57BL/6J muscles (BDH1 and SLC16A1 were not tested).  In our case we demonstrated downregulation of mRNA, so this could implicate translational regulation</w:t>
-      </w:r>
-      <w:r>
-        <w:t>, diet,</w:t>
-      </w:r>
-      <w:r>
-        <w:t xml:space="preserve"> or strain differences with respect to</w:t>
-      </w:r>
-      <w:r>
-        <w:t xml:space="preserve"> effects on</w:t>
-      </w:r>
-      <w:r>
-        <w:t xml:space="preserve"> OXCT1, but would not explain our observation of reduced ketone disposal (this was not reported in </w:t>
-      </w:r>
-      <w:r>
-        <w:fldChar w:fldCharType="begin"/>
-      </w:r>
-      <w:r>
-        <w:instrText xml:space="preserve"> ADDIN ZOTERO_ITEM CSL_CITATION {"citationID":"hOe74ue7","properties":{"formattedCitation":"[16]","plainCitation":"[16]","noteIndex":0},"citationItems":[{"id":189,"uris":["http://zotero.org/users/7317906/items/THMX4FYC"],"itemData":{"id":189,"type":"article-journal","abstract":"© 2017 the American Physiological Society.Low-carbohydrate/high-fat (LCHF) diets are increasingly popular dietary interventions for body weight control and as treatment for different pathological conditions. However, the mechanisms of action are still poorly understood, in particular, in long-term administration. Besides liver, brain, and heart, skeletal muscle is one of the major organs involved in the regulation of physiological and pathophysiological ketosis. We assessed the role of the peroxisome proliferator-activated receptor γ coactivator 1α (PGC-1α) in skeletal muscle of male wild-type control and PGC-1α muscle-specific knockout mice upon 12 wk of LCHF diet feeding. Interestingly, LCHF diet administration increased oxygen consumption in a muscle PGC-1α-dependent manner, concomitant with a blunted transcriptional induction of genes involved in fatty acid oxidation and impairment in exercise performance. These data reveal a new role for muscle PGC-1α in regulating the physiological adaptation to long-term LCHF diet administration.","container-title":"American Journal of Physiology-Endocrinology and Metabolism","DOI":"10.1152/ajpendo.00361.2016","ISSN":"0193-1849","issue":"5","note":"Citation Key: Schnyder2017a","page":"E437-E446","title":"Muscle PGC-1α is required for long-term systemic and local adaptations to a ketogenic diet in mice","volume":"312","author":[{"family":"Schnyder","given":"Svenia"},{"family":"Svensson","given":"Kristoffer"},{"family":"Cardel","given":"Bettina"},{"family":"Handschin","given":"Christoph"}],"issued":{"date-parts":[["2017"]]},"citation-key":"Schnyder2017a"}}],"schema":"https://github.com/citation-style-language/schema/raw/master/csl-citation.json"} </w:instrText>
-      </w:r>
-      <w:r>
-        <w:fldChar w:fldCharType="separate"/>
-      </w:r>
-      <w:r>
-        <w:rPr>
-          <w:noProof/>
-        </w:rPr>
-        <w:t>[16]</w:t>
-      </w:r>
-      <w:r>
-        <w:fldChar w:fldCharType="end"/>
-      </w:r>
-      <w:r>
-        <w:t xml:space="preserve">).  In terms of strain differences, we </w:t>
-      </w:r>
-      <w:r>
-        <w:lastRenderedPageBreak/>
-        <w:t xml:space="preserve">observed that the majority of DO mice experienced a decline in βHB disposal following the dietary intervention (n=35), but there was a subset of mice that exhibited an improvement in βHB disposal as assessed by KTT (n=10). </w:t>
-      </w:r>
-    </w:p>
-    <w:p/>
-    <w:p>
-      <w:r>
-        <w:t xml:space="preserve">Given the biochemical relationship between ketone body production, hepatic fatty acid oxidation, and cholesterol biogenesis, it was not surprising to find a potential relationship between these adaptations and cholesterol levels in these mice.  The reduction of ketone body disposal may be due to saturation kinetics in skeletal muscle. Prior research has demonstrated that the KB concentration-oxidation relationship may reach a saturating point between 1 and 2 mmol, as evidenced by studies involving fasting of various durations </w:t>
-      </w:r>
-      <w:r>
-        <w:fldChar w:fldCharType="begin"/>
-      </w:r>
-      <w:r>
-        <w:instrText xml:space="preserve"> ADDIN ZOTERO_ITEM CSL_CITATION {"citationID":"fNYo8xBO","properties":{"formattedCitation":"[6]","plainCitation":"[6]","noteIndex":0},"citationItems":[{"id":11458,"uris":["http://zotero.org/users/7317906/items/4L4ZNI6K"],"itemData":{"id":11458,"type":"article-journal","abstract":"Turnover studies performed during progressive fasting in normal subjects indicate that the production rate and the concentration of KB rise markedly during the early phase of fasting and start reaching a plateau after about 5 days. In addition to increased production, a reduction in the metabolic clearance rate of KB contributes to the hyperketonemia. This reduced metabolic clearance rate reflects essentially the progressive saturation of muscular ketone uptake that occurs with increasing ketonemia. The hormonal and metabolic environment of fasting plays only a minor role in this process, since a fall in KB metabolic clearance similar to that observed during fasting is observed if hyperketonemia is artificially induced in the postabsorptive state by the infusion of exogenous ketones. As extraction of KB by muscle becomes limited during ongoing fasting, KB are preferentially taken up by the brain to serve as a substrate replacing glucose. The remarkable stability of ketonemia during prolonged fasting is maintained through the operation of a negative feedback mechanism whereby KB tend to restrain their own production rate. The antilipolytic and insulinotropic effects of KB are instrumental in this process. This homeostatic mechanism maintains ketogenesis only slightly above the maximal metabolic disposal rate, the difference corresponding to urinary excretion, which is always below 10% of total turnover under physiologic conditions. When type I insulin-deprived diabetic patients are compared at the same KB concentration with control subjects with fasting ketosis, the characteristics of KB kinetics are comparable in the two groups. The maximal KB removal capacity is identical in the two situations, and it is not possible to identify a ketone removal defect specific to diabetes. Thus, these data favor the concept that excessive production of KB represent the main factor leading to uncontrolled hyperketonemia. It should be realized that a production exceeding only slightly that prevailing during prolonged fasting is sufficient to cause a progressive build-up in concentration, leading to uncontrolled diabetic ketosis. In the overnight-fasted state, a prolonged exercise (2 h) performed at moderate intensity (50% VO2 max) stimulates the capacity of muscle to extract ketones from blood as evidenced by a stimulation of the metabolic clearance rate.(ABSTRACT TRUNCATED AT 400 WORDS)","container-title":"Diabetes/Metabolism Reviews","DOI":"10.1002/dmr.5610050304","ISSN":"0742-4221","issue":"3","journalAbbreviation":"Diabetes Metab Rev","language":"eng","note":"PMID: 2656155","page":"247-270","source":"PubMed","title":"Ketone body production and disposal: effects of fasting, diabetes, and exercise","title-short":"Ketone body production and disposal","volume":"5","author":[{"family":"Balasse","given":"E. O."},{"family":"Féry","given":"F."}],"issued":{"date-parts":[["1989",5]]},"citation-key":"balasseKetoneBodyProduction1989"}}],"schema":"https://github.com/citation-style-language/schema/raw/master/csl-citation.json"} </w:instrText>
-      </w:r>
-      <w:r>
-        <w:fldChar w:fldCharType="separate"/>
-      </w:r>
-      <w:r>
-        <w:rPr>
-          <w:noProof/>
-        </w:rPr>
-        <w:t>[6]</w:t>
-      </w:r>
-      <w:r>
-        <w:fldChar w:fldCharType="end"/>
-      </w:r>
-      <w:r>
-        <w:t xml:space="preserve"> or step-wise βHB infusion </w:t>
-      </w:r>
-      <w:r>
-        <w:fldChar w:fldCharType="begin"/>
-      </w:r>
-      <w:r>
-        <w:instrText xml:space="preserve"> ADDIN ZOTERO_ITEM CSL_CITATION {"citationID":"9An3jUqU","properties":{"formattedCitation":"[14]","plainCitation":"[14]","noteIndex":0},"citationItems":[{"id":1376,"uris":["http://zotero.org/users/7317906/items/93QAPJUH"],"itemData":{"id":1376,"type":"article-journal","container-title":"The Journal of Clinical Endocrinology &amp; Metabolism","DOI":"10.1210/jc.2014-2608","ISSN":"0021-972X","issue":"2","page":"636-643","title":"Systemic, Cerebral and Skeletal Muscle Ketone Body and Energy Metabolism During Acute Hyper-D-β-Hydroxybutyratemia in Post-Absorptive Healthy Males","volume":"100","author":[{"family":"Mikkelsen","given":"Kristian H."},{"family":"Seifert","given":"Thomas"},{"family":"Secher","given":"Niels H."},{"family":"Grøndal","given":"Thomas"},{"family":"Hall","given":"Gerrit","non-dropping-particle":"van"}],"issued":{"date-parts":[["2015",2]]},"citation-key":"mikkelsenSystemicCerebralSkeletal2015"}}],"schema":"https://github.com/citation-style-language/schema/raw/master/csl-citation.json"} </w:instrText>
-      </w:r>
-      <w:r>
-        <w:fldChar w:fldCharType="separate"/>
-      </w:r>
-      <w:r>
-        <w:rPr>
-          <w:noProof/>
-        </w:rPr>
-        <w:t>[14]</w:t>
-      </w:r>
-      <w:r>
-        <w:fldChar w:fldCharType="end"/>
-      </w:r>
-      <w:r>
-        <w:t>.</w:t>
-      </w:r>
-    </w:p>
-    <w:p/>
-    <w:p>
-      <w:r>
-        <w:t xml:space="preserve">Prior research has shown that </w:t>
-      </w:r>
-      <w:r>
-        <w:t>knockout</w:t>
-      </w:r>
-      <w:r>
-        <w:t xml:space="preserve"> of </w:t>
-      </w:r>
-      <w:r>
-        <w:rPr>
-          <w:i/>
-          <w:iCs/>
-        </w:rPr>
-        <w:t>Ppargc1a</w:t>
-      </w:r>
-      <w:r>
-        <w:t xml:space="preserve"> results in modestly lowered expression of BDH1, OXCT1 and ACAT1 in skeletal muscle, brain</w:t>
-      </w:r>
-      <w:r>
-        <w:t>,</w:t>
-      </w:r>
-      <w:r>
-        <w:t xml:space="preserve"> and kidneys</w:t>
-      </w:r>
-      <w:r>
-        <w:t>, along with decreased expression of MCT1 SLC16A1</w:t>
-      </w:r>
-      <w:r>
-        <w:t xml:space="preserve"> </w:t>
-      </w:r>
-      <w:r>
-        <w:fldChar w:fldCharType="begin"/>
-      </w:r>
-      <w:r>
-        <w:instrText xml:space="preserve"> ADDIN ZOTERO_ITEM CSL_CITATION {"citationID":"3fvXl43m","properties":{"formattedCitation":"[12]","plainCitation":"[12]","noteIndex":0},"citationItems":[{"id":1369,"uris":["http://zotero.org/users/7317906/items/WP3436XD"],"itemData":{"id":1369,"type":"article-journal","abstract":"Ketone bodies (KBs) are crucial energy substrates during states of low carbohydrate availability. However, an aberrant regulation of KB homeostasis can lead to complications such as diabetic ketoacidosis. Exercise and diabetes affect systemic KB homeostasis, but the regulation of KB metabolism is still enigmatic. In our study in mice with either knockout or overexpression of the peroxisome proliferator-activated receptor-γ coactivator (PGC)-1α in skeletal muscle, PGC-1α regulated ketolytic gene transcription in muscle. Furthermore, KB homeostasis of these mice was investigated during withholding of food, exercise, and ketogenic diet feeding, and after streptozotocin injection. In response to these ketogenic stimuli, modulation of PGC-1α levels in muscle affected systemic KB homeostasis. Moreover, the data demonstrate that skeletal muscle PGC-1α is necessary for the enhanced ketolytic capacity in response to exercise training and overexpression of PGC-1α in muscle enhances systemic ketolytic capacity and is sufficient to ameliorate diabetic hyperketonemia in mice. In cultured myotubes, the transcription factor estrogen-related receptor-α was a partner of PGC-1α in the regulation of ketolytic gene transcription. These results demonstrate a central role of skeletal muscle PGC-1α in the transcriptional regulation of systemic ketolytic capacity.-Svensson, K., Albert, V., Cardel, B., Salatino, S., Handschin, C. Skeletal muscle PGC-1α modulates systemic ketone body homeostasis and ameliorates diabetic hyperketonemia in mice.","container-title":"FASEB Journal","DOI":"10.1096/fj.201500128","ISSN":"15306860","issue":"5","note":"PMID: 26849960\nCitation Key: Svensson2016","page":"1976-1986","title":"Skeletal muscle PGC-1a modulates systemic ketone body homeostasis and ameliorates diabetic hyperketonemia in mice","volume":"30","author":[{"family":"Svensson","given":"Kristoffer"},{"family":"Albert","given":"Verena"},{"family":"Cardel","given":"Bettina"},{"family":"Salatino","given":"Silvia"},{"family":"Handschin","given":"Christoph"}],"issued":{"date-parts":[["2016"]]},"citation-key":"Svensson2016"}}],"schema":"https://github.com/citation-style-language/schema/raw/master/csl-citation.json"} </w:instrText>
-      </w:r>
-      <w:r>
-        <w:fldChar w:fldCharType="separate"/>
-      </w:r>
-      <w:r>
-        <w:rPr>
-          <w:noProof/>
-        </w:rPr>
-        <w:t>[12]</w:t>
-      </w:r>
-      <w:r>
-        <w:fldChar w:fldCharType="end"/>
-      </w:r>
-      <w:r>
-        <w:t xml:space="preserve">.  This was concordant with impaired ketone body disposal by a similar assay </w:t>
-      </w:r>
-      <w:r>
-        <w:fldChar w:fldCharType="begin"/>
-      </w:r>
-      <w:r>
-        <w:instrText xml:space="preserve"> ADDIN ZOTERO_ITEM CSL_CITATION {"citationID":"3fvXl43m","properties":{"formattedCitation":"[12]","plainCitation":"[12]","noteIndex":0},"citationItems":[{"id":1369,"uris":["http://zotero.org/users/7317906/items/WP3436XD"],"itemData":{"id":1369,"type":"article-journal","abstract":"Ketone bodies (KBs) are crucial energy substrates during states of low carbohydrate availability. However, an aberrant regulation of KB homeostasis can lead to complications such as diabetic ketoacidosis. Exercise and diabetes affect systemic KB homeostasis, but the regulation of KB metabolism is still enigmatic. In our study in mice with either knockout or overexpression of the peroxisome proliferator-activated receptor-γ coactivator (PGC)-1α in skeletal muscle, PGC-1α regulated ketolytic gene transcription in muscle. Furthermore, KB homeostasis of these mice was investigated during withholding of food, exercise, and ketogenic diet feeding, and after streptozotocin injection. In response to these ketogenic stimuli, modulation of PGC-1α levels in muscle affected systemic KB homeostasis. Moreover, the data demonstrate that skeletal muscle PGC-1α is necessary for the enhanced ketolytic capacity in response to exercise training and overexpression of PGC-1α in muscle enhances systemic ketolytic capacity and is sufficient to ameliorate diabetic hyperketonemia in mice. In cultured myotubes, the transcription factor estrogen-related receptor-α was a partner of PGC-1α in the regulation of ketolytic gene transcription. These results demonstrate a central role of skeletal muscle PGC-1α in the transcriptional regulation of systemic ketolytic capacity.-Svensson, K., Albert, V., Cardel, B., Salatino, S., Handschin, C. Skeletal muscle PGC-1α modulates systemic ketone body homeostasis and ameliorates diabetic hyperketonemia in mice.","container-title":"FASEB Journal","DOI":"10.1096/fj.201500128","ISSN":"15306860","issue":"5","note":"PMID: 26849960\nCitation Key: Svensson2016","page":"1976-1986","title":"Skeletal muscle PGC-1a modulates systemic ketone body homeostasis and ameliorates diabetic hyperketonemia in mice","volume":"30","author":[{"family":"Svensson","given":"Kristoffer"},{"family":"Albert","given":"Verena"},{"family":"Cardel","given":"Bettina"},{"family":"Salatino","given":"Silvia"},{"family":"Handschin","given":"Christoph"}],"issued":{"date-parts":[["2016"]]},"citation-key":"Svensson2016"}}],"schema":"https://github.com/citation-style-language/schema/raw/master/csl-citation.json"} </w:instrText>
-      </w:r>
-      <w:r>
-        <w:fldChar w:fldCharType="separate"/>
-      </w:r>
-      <w:r>
-        <w:rPr>
-          <w:noProof/>
-        </w:rPr>
-        <w:t>[12]</w:t>
-      </w:r>
-      <w:r>
-        <w:fldChar w:fldCharType="end"/>
-      </w:r>
-      <w:r>
-        <w:t xml:space="preserve">.  The converse was also true with muscle transgenic overexpression of PGC1A resulting in </w:t>
-      </w:r>
-      <w:r>
-        <w:t>induction</w:t>
-      </w:r>
-      <w:r>
-        <w:t xml:space="preserve"> of Bdh1, Oxct1, Slc16a1</w:t>
-      </w:r>
-      <w:r>
-        <w:t>,</w:t>
-      </w:r>
-      <w:r>
-        <w:t xml:space="preserve"> and Acat1 and improved ketone body disposal </w:t>
-      </w:r>
-      <w:r>
-        <w:fldChar w:fldCharType="begin"/>
-      </w:r>
-      <w:r>
-        <w:instrText xml:space="preserve"> ADDIN ZOTERO_ITEM CSL_CITATION {"citationID":"hHk7XMf0","properties":{"formattedCitation":"[12]","plainCitation":"[12]","noteIndex":0},"citationItems":[{"id":1369,"uris":["http://zotero.org/users/7317906/items/WP3436XD"],"itemData":{"id":1369,"type":"article-journal","abstract":"Ketone bodies (KBs) are crucial energy substrates during states of low carbohydrate availability. However, an aberrant regulation of KB homeostasis can lead to complications such as diabetic ketoacidosis. Exercise and diabetes affect systemic KB homeostasis, but the regulation of KB metabolism is still enigmatic. In our study in mice with either knockout or overexpression of the peroxisome proliferator-activated receptor-γ coactivator (PGC)-1α in skeletal muscle, PGC-1α regulated ketolytic gene transcription in muscle. Furthermore, KB homeostasis of these mice was investigated during withholding of food, exercise, and ketogenic diet feeding, and after streptozotocin injection. In response to these ketogenic stimuli, modulation of PGC-1α levels in muscle affected systemic KB homeostasis. Moreover, the data demonstrate that skeletal muscle PGC-1α is necessary for the enhanced ketolytic capacity in response to exercise training and overexpression of PGC-1α in muscle enhances systemic ketolytic capacity and is sufficient to ameliorate diabetic hyperketonemia in mice. In cultured myotubes, the transcription factor estrogen-related receptor-α was a partner of PGC-1α in the regulation of ketolytic gene transcription. These results demonstrate a central role of skeletal muscle PGC-1α in the transcriptional regulation of systemic ketolytic capacity.-Svensson, K., Albert, V., Cardel, B., Salatino, S., Handschin, C. Skeletal muscle PGC-1α modulates systemic ketone body homeostasis and ameliorates diabetic hyperketonemia in mice.","container-title":"FASEB Journal","DOI":"10.1096/fj.201500128","ISSN":"15306860","issue":"5","note":"PMID: 26849960\nCitation Key: Svensson2016","page":"1976-1986","title":"Skeletal muscle PGC-1a modulates systemic ketone body homeostasis and ameliorates diabetic hyperketonemia in mice","volume":"30","author":[{"family":"Svensson","given":"Kristoffer"},{"family":"Albert","given":"Verena"},{"family":"Cardel","given":"Bettina"},{"family":"Salatino","given":"Silvia"},{"family":"Handschin","given":"Christoph"}],"issued":{"date-parts":[["2016"]]},"citation-key":"Svensson2016"}}],"schema":"https://github.com/citation-style-language/schema/raw/master/csl-citation.json"} </w:instrText>
-      </w:r>
-      <w:r>
-        <w:fldChar w:fldCharType="separate"/>
-      </w:r>
-      <w:r>
-        <w:rPr>
-          <w:noProof/>
-        </w:rPr>
-        <w:t>[12]</w:t>
-      </w:r>
-      <w:r>
-        <w:fldChar w:fldCharType="end"/>
-      </w:r>
-      <w:r>
-        <w:t>. It is possible that PGC1</w:t>
-      </w:r>
-      <w:r>
-        <w:rPr>
-          <w:rFonts w:ascii="Symbol" w:hAnsi="Symbol"/>
-        </w:rPr>
-        <w:t xml:space="preserve">a/b </w:t>
-      </w:r>
-      <w:r>
-        <w:t xml:space="preserve">is downstream of mTORC1 in muscle.  In the muscle </w:t>
-      </w:r>
-      <w:r>
-        <w:rPr>
-          <w:i/>
-          <w:iCs/>
-        </w:rPr>
-        <w:t>Tsc1</w:t>
-      </w:r>
-      <w:r>
-        <w:t xml:space="preserve"> </w:t>
-      </w:r>
-      <w:r>
-        <w:t>KO</w:t>
-      </w:r>
-      <w:r>
-        <w:t xml:space="preserve"> data we describe a 34% reduction in </w:t>
-      </w:r>
-      <w:r>
-        <w:rPr>
-          <w:i/>
-          <w:iCs/>
-        </w:rPr>
-        <w:t>Ppargc1a</w:t>
-      </w:r>
-      <w:r>
-        <w:t xml:space="preserve"> mRNA, but a 1.5x increase in </w:t>
-      </w:r>
-      <w:r>
-        <w:rPr>
-          <w:i/>
-          <w:iCs/>
-        </w:rPr>
-        <w:t>Ppargc1b</w:t>
-      </w:r>
-      <w:r>
-        <w:t xml:space="preserve"> mRNA.</w:t>
-      </w:r>
-      <w:r>
-        <w:t xml:space="preserve">  </w:t>
-      </w:r>
-      <w:r>
-        <w:t>Because</w:t>
-      </w:r>
-      <w:r>
-        <w:t xml:space="preserve"> the downstream PGC1a targets are more relevant, we used </w:t>
-      </w:r>
-      <w:proofErr w:type="spellStart"/>
-      <w:r>
-        <w:t>Harmonizome</w:t>
-      </w:r>
-      <w:proofErr w:type="spellEnd"/>
-      <w:r>
-        <w:t xml:space="preserve"> to identify canonical Ppargc1a targets from </w:t>
-      </w:r>
-      <w:r>
-        <w:t xml:space="preserve">ENCODE </w:t>
-      </w:r>
-      <w:proofErr w:type="spellStart"/>
-      <w:r>
-        <w:t>ChIPseq</w:t>
-      </w:r>
-      <w:proofErr w:type="spellEnd"/>
-      <w:r>
-        <w:t xml:space="preserve"> datasets and contrasted those with differentially expressed genes from muscle </w:t>
-      </w:r>
-      <w:r>
-        <w:rPr>
-          <w:i/>
-          <w:iCs/>
-        </w:rPr>
-        <w:t>Tsc1</w:t>
-      </w:r>
-      <w:r>
-        <w:t xml:space="preserve"> </w:t>
-      </w:r>
-      <w:r>
-        <w:t>KO</w:t>
-      </w:r>
-      <w:r>
-        <w:t xml:space="preserve"> mice.  Only 4</w:t>
-      </w:r>
-      <w:r>
-        <w:t xml:space="preserve"> of</w:t>
-      </w:r>
-      <w:r>
-        <w:t>28 of these genes were differentially expressed in muscles, lower than what would be predicted by chance.</w:t>
-      </w:r>
-    </w:p>
-    <w:p/>
-    <w:p>
-      <w:r>
-        <w:t xml:space="preserve">As it relates to other aspects of physiology in the carbohydrate reduced state, this was to our knowledge the first report of diversity outbred mice and ketone disposal analysis, and we evaluated if this was associated with other relevant traits.  Our results of lowered ketone body disposal suggested a reduction in ketogenesis over this </w:t>
-      </w:r>
-      <w:proofErr w:type="gramStart"/>
-      <w:r>
-        <w:t>period, and</w:t>
-      </w:r>
-      <w:proofErr w:type="gramEnd"/>
-      <w:r>
-        <w:t xml:space="preserve"> given the biochemical overlap between cholesterol synthesis and ketone body synthesis pathways it is not surprising that impaired ketone disposal might be associated with elevated cholesterol, but more data is needed to be confident of this hypothesis. </w:t>
-      </w:r>
-    </w:p>
-    <w:p/>
-    <w:p>
-      <w:r>
-        <w:t xml:space="preserve">There are several limitations to the present study.  While this study was done in a diverse set of mice, it is plausible that ketone disposal may differ in humans, as may their relationships with cholesterol and energy metabolism.  Our approach was to investigate the short-term disposal of a supraphysiological bolus of </w:t>
-      </w:r>
-      <w:r>
-        <w:t>β</w:t>
-      </w:r>
-      <w:r>
-        <w:t xml:space="preserve">HB which again may have different kinetics than elevated steady state levels of ketone bodies.  Based on our pilot study of 43 mice we estimate this study is only powered to be able to detect correlations of r&gt;0.55 between two correlated but independent variables.  Finally, we do not yet know the mechanism by which skeletal muscle </w:t>
-      </w:r>
-      <w:r>
-        <w:rPr>
-          <w:i/>
-          <w:iCs/>
-        </w:rPr>
-        <w:t>Tsc1</w:t>
-      </w:r>
-      <w:r>
-        <w:t xml:space="preserve"> ablation or mTORC1 activation causes transcriptional changes in ketone body disposal.  In our case our assay measured total body ketone disposal, so we do not know that ketone disposal is primarily or exclusively modified in skeletal muscle or also in other tissues.</w:t>
-      </w:r>
-    </w:p>
-    <w:p/>
-    <w:p>
-      <w:pPr>
-        <w:spacing w:line="259" w:lineRule="auto"/>
-      </w:pPr>
-      <w:r>
-        <w:lastRenderedPageBreak/>
-        <w:t xml:space="preserve">These findings underscore the necessity for continued in-depth and comprehensive exploration into the factors influencing KB catabolism, including its potential associations with elevated cholesterol.  Ketolysis may be influenced by a range of variables, including genetic predispositions, metabolic states, and environmental factors.  Based on this research, further investigations are warranted to dissect the molecular pathways, signaling cascades, and genetic factors that contribute to the observed variations in ketone disposal, with the </w:t>
-      </w:r>
-      <w:proofErr w:type="gramStart"/>
-      <w:r>
-        <w:t>ultimate goal</w:t>
-      </w:r>
-      <w:proofErr w:type="gramEnd"/>
-      <w:r>
-        <w:t xml:space="preserve"> of refining our understanding of the interplay between mTORC1 activation and ketogenic dietary interventions. Such insights may pave the way for personalized therapeutic strategies that consider individual differences in responding to interventions aimed at modulating ketone metabolism.</w:t>
-      </w:r>
-    </w:p>
-    <w:p>
-      <w:pPr>
-        <w:pStyle w:val="Heading1"/>
-      </w:pPr>
-      <w:r>
-        <w:t>ACKNOWLEGEMENTS</w:t>
-      </w:r>
-    </w:p>
-    <w:p>
-      <w:r>
-        <w:t>This work was funded by R01 DK107535 from the NIH (DB), and Pilot and Feasibility Grants from The Jackson Laboratories and the Michigan Diabetes Research Center (</w:t>
-      </w:r>
-      <w:r>
-        <w:t>RRID:SCR_015112</w:t>
-      </w:r>
-      <w:r>
-        <w:t xml:space="preserve">, supported by </w:t>
-      </w:r>
-      <w:r>
-        <w:t>P30</w:t>
-      </w:r>
-      <w:r>
-        <w:t xml:space="preserve"> </w:t>
-      </w:r>
-      <w:r>
-        <w:t>DK020572</w:t>
-      </w:r>
-      <w:r>
-        <w:t>, awarded</w:t>
-      </w:r>
-      <w:r>
-        <w:t xml:space="preserve"> to DB)</w:t>
-      </w:r>
-      <w:r>
-        <w:t xml:space="preserve"> and core services provided by the Michigan Nutrition and Obesity Research Center (</w:t>
-      </w:r>
-      <w:r>
-        <w:t>RRID:SCR_015457</w:t>
-      </w:r>
-      <w:r>
-        <w:t>, supported by P30</w:t>
-      </w:r>
-      <w:r>
-        <w:t xml:space="preserve"> </w:t>
-      </w:r>
-      <w:r>
-        <w:t>DK89503)</w:t>
-      </w:r>
-      <w:r>
-        <w:t xml:space="preserve"> and Mouse Metabolic Phenotyping Center in Live Animals (supported by </w:t>
-      </w:r>
-      <w:r>
-        <w:t>U2C</w:t>
-      </w:r>
-      <w:r>
-        <w:t xml:space="preserve"> </w:t>
-      </w:r>
-      <w:r>
-        <w:t>DK135066</w:t>
-      </w:r>
-      <w:r>
-        <w:t>)</w:t>
-      </w:r>
-      <w:r>
-        <w:t xml:space="preserve">. TC was supported by the University of Michigan Undergraduate Research Program (UROP). </w:t>
-      </w:r>
-      <w:r>
-        <w:t xml:space="preserve">  We would also like to thank Dr. Charles </w:t>
-      </w:r>
-      <w:proofErr w:type="spellStart"/>
-      <w:r>
-        <w:t>Burant</w:t>
-      </w:r>
-      <w:proofErr w:type="spellEnd"/>
-      <w:r>
-        <w:t xml:space="preserve"> and members of the Bridges Laboratory for helpful discussions over the course of this project.</w:t>
-      </w:r>
-    </w:p>
-    <w:p/>
-    <w:p>
-      <w:pPr>
-        <w:pStyle w:val="Heading1"/>
-      </w:pPr>
-      <w:r>
-        <w:t>COMPETING INTERESTS</w:t>
-      </w:r>
-    </w:p>
-    <w:p>
-      <w:r>
-        <w:t xml:space="preserve">The authors have no conflicts of interest to </w:t>
-      </w:r>
-      <w:proofErr w:type="spellStart"/>
-      <w:r>
-        <w:t>decclare</w:t>
-      </w:r>
-      <w:proofErr w:type="spellEnd"/>
-    </w:p>
-    <w:p>
       <w:r>
         <w:br w:type="page"/>
       </w:r>
@@ -5125,6 +5374,7 @@
     <w:sectPr>
       <w:pgSz w:w="12240" w:h="15840"/>
       <w:pgMar w:top="1440" w:right="1440" w:bottom="1440" w:left="1440" w:header="720" w:footer="720" w:gutter="0"/>
+      <w:lnNumType w:countBy="1" w:restart="continuous"/>
       <w:cols w:space="720"/>
       <w:docGrid w:linePitch="360"/>
     </w:sectPr>
@@ -6189,6 +6439,14 @@
       <w:contextualSpacing/>
     </w:pPr>
   </w:style>
+  <w:style w:type="character" w:styleId="LineNumber">
+    <w:name w:val="line number"/>
+    <w:basedOn w:val="DefaultParagraphFont"/>
+    <w:uiPriority w:val="99"/>
+    <w:semiHidden/>
+    <w:unhideWhenUsed/>
+    <w:rsid w:val="008B7E62"/>
+  </w:style>
 </w:styles>
 </file>
 

</xml_diff>